<commit_message>
Kapitel 5 är färdigt
</commit_message>
<xml_diff>
--- a/Varlden-på-andra-sidan/Världen på andra sidan.docx
+++ b/Varlden-på-andra-sidan/Världen på andra sidan.docx
@@ -11904,7 +11904,16 @@
           <w:szCs w:val="36"/>
         </w:rPr>
         <w:lastRenderedPageBreak/>
-        <w:t>Kapitel 5 – En oväntad rumskamrat och läran om magi</w:t>
+        <w:t xml:space="preserve">Kapitel 5 – </w:t>
+      </w:r>
+      <w:r>
+        <w:rPr>
+          <w:b/>
+          <w:bCs/>
+          <w:sz w:val="36"/>
+          <w:szCs w:val="36"/>
+        </w:rPr>
+        <w:t xml:space="preserve">Den första långa färden. </w:t>
       </w:r>
     </w:p>
     <w:p>
@@ -15923,6 +15932,346 @@
     <w:p>
       <w:r>
         <w:t>Myr tittade ner på dem igen. På avstånd var det svårt att förstå att de hade något med de väldiga varelserna ovanför dem att göra.</w:t>
+      </w:r>
+    </w:p>
+    <w:p>
+      <w:r>
+        <w:t xml:space="preserve">”Min vän </w:t>
+      </w:r>
+      <w:proofErr w:type="spellStart"/>
+      <w:r>
+        <w:t>Maerwen</w:t>
+      </w:r>
+      <w:proofErr w:type="spellEnd"/>
+      <w:r>
+        <w:t xml:space="preserve"> bor där borta!” sade Lyra och pekade mot en av de större </w:t>
+      </w:r>
+      <w:proofErr w:type="spellStart"/>
+      <w:r>
+        <w:t>Mansorerna</w:t>
+      </w:r>
+      <w:proofErr w:type="spellEnd"/>
+      <w:r>
+        <w:t xml:space="preserve"> längre bort.</w:t>
+      </w:r>
+    </w:p>
+    <w:p>
+      <w:r>
+        <w:t xml:space="preserve">Myr såg efter </w:t>
+      </w:r>
+      <w:proofErr w:type="spellStart"/>
+      <w:r>
+        <w:t>Mansoren</w:t>
+      </w:r>
+      <w:proofErr w:type="spellEnd"/>
+      <w:r>
+        <w:t xml:space="preserve"> som Lyra hade pekat ut tills den försvann bakom dem. Han hade fortfarande svårt att förstå att de väldiga, husliknande varelserna var levande. Ännu märkligare var tanken att någon kunde bo inuti en av dem, som om det vore det mest naturliga i världen.</w:t>
+      </w:r>
+    </w:p>
+    <w:p>
+      <w:r>
+        <w:t>Han vände blicken framåt igen.</w:t>
+      </w:r>
+    </w:p>
+    <w:p>
+      <w:r>
+        <w:t>Floden löpte genom landskapet under dem, bred och slingrande, och de följde den medan den skar genom öppna marker. Det var länge sedan de hade flugit över någon större skog. Här bredde gräsbevuxna slätter ut sig mellan låga höjder, avbrutna av steniga partier och enstaka grupper av träd. På sina ställen delade floden upp sig i mindre armar som slingrade sig runt låga öar innan de åter förenades längre fram.</w:t>
+      </w:r>
+    </w:p>
+    <w:p>
+      <w:r>
+        <w:lastRenderedPageBreak/>
+        <w:t>Ju längre de flög, desto mer började Myr lägga märke till rörelserna där nere. Varelser fanns överallt i landskapet, även om de flesta var så långt bort att han bara kunde urskilja deras former. Några rörde sig i små grupper över de öppna markerna. Andra höll sig nära floden eller försvann mellan kullarna.</w:t>
+      </w:r>
+    </w:p>
+    <w:p>
+      <w:r>
+        <w:t xml:space="preserve">En del påminde om </w:t>
+      </w:r>
+      <w:proofErr w:type="spellStart"/>
+      <w:r>
+        <w:t>leprechaunerna</w:t>
+      </w:r>
+      <w:proofErr w:type="spellEnd"/>
+      <w:r>
+        <w:t xml:space="preserve"> han redan hade träffat, med små kroppar och rörelser som gick att följa även på avstånd. Andra var svårare att jämföra med någonting han kände till. Några hade långa kroppar som nästan tycktes släpa efter dem när de rörde sig, medan andra var så smala att han först trodde att de bara var skuggor mot marken. På ett ställe fick han syn på flera varelser som gick upprätt på två ben. De rörde sig på ett sätt som fick honom att tänka på människor, men avståndet var för stort för att han skulle kunna se några detaljer.</w:t>
+      </w:r>
+    </w:p>
+    <w:p>
+      <w:r>
+        <w:t>Han försökte följa dem med blicken så länge det gick, men kvasten förde honom vidare och snart var de bara små rörelser bakom dem.</w:t>
+      </w:r>
+    </w:p>
+    <w:p>
+      <w:r>
+        <w:t>Det var märkligt hur snabbt han hade vant sig vid att se sådant som borde ha varit omöjligt. För bara några dagar sedan hade han aldrig trott att en plats som den här kunde finnas. Nu flög han över ett främmande landskap, tillsammans med människor som kunde använda magi, ovanför en flod som bestod av levande varelser och förbi hus som egentligen var levande organismer.</w:t>
+      </w:r>
+    </w:p>
+    <w:p>
+      <w:r>
+        <w:t>Ändå kändes det som om han bara hade sett en bråkdel av allt som fanns här.</w:t>
+      </w:r>
+    </w:p>
+    <w:p>
+      <w:r>
+        <w:t>Han försökte minnas riktningen de hade följt och hur landskapet hade förändrats sedan de lämnade sjön, men tankarna började glida undan från varandra. Det var som om han inte längre kunde hålla ordning på allt han hade fått veta. Varje gång han försökte begripa en sak dök något annat upp som gjorde den första ännu märkligare.</w:t>
+      </w:r>
+    </w:p>
+    <w:p>
+      <w:r>
+        <w:t>Sedan kom värken.</w:t>
+      </w:r>
+    </w:p>
+    <w:p>
+      <w:r>
+        <w:t>Den började som ett svagt tryck bakom ena ögat, knappt märkbart till en början. Myr blinkade några gånger och försökte ignorera det, men efter hand spred sig smärtan över ena sidan av huvudet. Han kände igen den obehagliga känslan. Det var samma sorts migrän som han hade haft tidigare, även om den ännu inte var lika kraftig.</w:t>
+      </w:r>
+    </w:p>
+    <w:p>
+      <w:r>
+        <w:t>Han slöt ögonen en kort stund och försökte slappna av. Det hjälpte inte särskilt mycket.</w:t>
+      </w:r>
+    </w:p>
+    <w:p>
+      <w:r>
+        <w:t>Kanske var det allt han hade varit med om. Alla nya intryck, alla varelser och alla förklaringar som inte riktigt gick att förena med det han tidigare hade trott om världen. Han hade knappt hunnit förstå en sak innan nästa hade dykt upp.</w:t>
+      </w:r>
+    </w:p>
+    <w:p>
+      <w:r>
+        <w:t>Myr öppnade ögonen igen. Landskapet fortsatte breda ut sig framför dem, och floden slingrade sig vidare mot horisonten.</w:t>
+      </w:r>
+    </w:p>
+    <w:p>
+      <w:r>
+        <w:t>Han undrade hur mycket mer det fanns att upptäcka.</w:t>
+      </w:r>
+    </w:p>
+    <w:p>
+      <w:r>
+        <w:lastRenderedPageBreak/>
+        <w:t>Just då önskade han mest att huvudet skulle sluta värka.</w:t>
+      </w:r>
+    </w:p>
+    <w:p>
+      <w:r>
+        <w:t>Myr försökte rikta uppmärksamheten mot landskapet igen, men värken bakom ögat ville inte släppa. Han kisade mot horisonten och försökte avgöra hur långt de hade kvar av dagen. Solen hade sjunkit betydligt lägre än han trott, och skuggorna från kullarna sträckte sig nu långt över marken. Floden fortsatte slingra sig fram genom det öppna landskapet, men längre bort började terrängen bli mer kuperad. Här och där reste sig ensamma träd ur gräset, och mellan kullarna kunde han se mörka partier där marken verkade vara täckt av sten.</w:t>
+      </w:r>
+    </w:p>
+    <w:p>
+      <w:r>
+        <w:t>Han undrade hur långt de egentligen hade färdats sedan morgonen. Det var svårt att avgöra när allt där nere förändrades så långsamt medan de flög. Han försökte minnas några särskilda landmärken, men huvudet värkte för mycket för att tankarna skulle vilja stanna kvar vid något längre än några sekunder.</w:t>
+      </w:r>
+    </w:p>
+    <w:p>
+      <w:r>
+        <w:t>Efter en stund pekade Sonya mot en plats mellan några låga kullar, en bit från floden.</w:t>
+      </w:r>
+    </w:p>
+    <w:p>
+      <w:r>
+        <w:t>”Vi landar där i natt.”</w:t>
+      </w:r>
+    </w:p>
+    <w:p>
+      <w:r>
+        <w:t>Myr nickade tacksamt. Han ville inte erkänna hur mycket han längtade efter att få vila huvudet.</w:t>
+      </w:r>
+    </w:p>
+    <w:p>
+      <w:r>
+        <w:t>De sjönk långsamt mot marken och landade på en jämn yta mellan några stora stenar. När Myr klev av kvasten kände han hur benen protesterade efter ännu en lång dag i luften. Han sträckte på sig och rullade försiktigt axlarna innan han följde de andra bort från landningsplatsen.</w:t>
+      </w:r>
+    </w:p>
+    <w:p>
+      <w:proofErr w:type="spellStart"/>
+      <w:r>
+        <w:t>Elarion</w:t>
+      </w:r>
+      <w:proofErr w:type="spellEnd"/>
+      <w:r>
+        <w:t xml:space="preserve"> undersökte marken medan Lyra och Sonya började samla ihop det de behövde för kvällen. Platsen låg tillräckligt skyddad mellan kullarna för att vinden inte skulle nå dem lika obehindrat som ute på den öppna slätten. Inte långt därifrån hördes floden, ett jämnt brus som blandades med ljuden från det främmande landskapet.</w:t>
+      </w:r>
+    </w:p>
+    <w:p>
+      <w:r>
+        <w:t>Myr hjälpte till så gott han kunde, även om han märkte att han hade svårt att koncentrera sig. Han fick leta efter samma sak två gånger och tappade bort vad han tänkte säga när Sonya frågade om han kunde hämta några fler grenar. Till slut satte han sig på en sten medan de andra gjorde i ordning maten.</w:t>
+      </w:r>
+    </w:p>
+    <w:p>
+      <w:r>
+        <w:t>”Du ser trött ut”, sade Lyra när hon passerade honom.</w:t>
+      </w:r>
+    </w:p>
+    <w:p>
+      <w:r>
+        <w:t>”Jag har ont i huvudet.”</w:t>
+      </w:r>
+    </w:p>
+    <w:p>
+      <w:r>
+        <w:t>Hon stannade till och betraktade honom en stund.</w:t>
+      </w:r>
+    </w:p>
+    <w:p>
+      <w:r>
+        <w:t>”Sedan när?”</w:t>
+      </w:r>
+    </w:p>
+    <w:p>
+      <w:r>
+        <w:t>”En stund. Det har blivit värre under dagen.”</w:t>
+      </w:r>
+    </w:p>
+    <w:p>
+      <w:r>
+        <w:lastRenderedPageBreak/>
+        <w:t xml:space="preserve">Lyra såg på </w:t>
+      </w:r>
+      <w:proofErr w:type="spellStart"/>
+      <w:r>
+        <w:t>Elarion</w:t>
+      </w:r>
+      <w:proofErr w:type="spellEnd"/>
+      <w:r>
+        <w:t>, som just hade kommit tillbaka från sin undersökning av omgivningen.</w:t>
+      </w:r>
+    </w:p>
+    <w:p>
+      <w:r>
+        <w:t xml:space="preserve">”Har du haft migrän förut?” frågade </w:t>
+      </w:r>
+      <w:proofErr w:type="spellStart"/>
+      <w:r>
+        <w:t>Elarion</w:t>
+      </w:r>
+      <w:proofErr w:type="spellEnd"/>
+      <w:r>
+        <w:t>.</w:t>
+      </w:r>
+    </w:p>
+    <w:p>
+      <w:r>
+        <w:t>”Ja.”</w:t>
+      </w:r>
+    </w:p>
+    <w:p>
+      <w:r>
+        <w:t>”Då kan det vara det.” Han satte sig på huk framför Myr och studerade honom. ”Du har tagit in mycket på kort tid. Men jag vet inte om det är därför du har ont.”</w:t>
+      </w:r>
+    </w:p>
+    <w:p>
+      <w:r>
+        <w:t xml:space="preserve">Myr uppskattade att han åtminstone inte låtsades veta säkert. Han blundade medan </w:t>
+      </w:r>
+      <w:proofErr w:type="spellStart"/>
+      <w:r>
+        <w:t>Elarion</w:t>
+      </w:r>
+      <w:proofErr w:type="spellEnd"/>
+      <w:r>
+        <w:t xml:space="preserve"> lade en hand mot hans panna. En svag värme spred sig över huden och försvann sedan igen.</w:t>
+      </w:r>
+    </w:p>
+    <w:p>
+      <w:r>
+        <w:t xml:space="preserve">”Jag kan inte ta bort det åt dig”, sade </w:t>
+      </w:r>
+      <w:proofErr w:type="spellStart"/>
+      <w:r>
+        <w:t>Elarion</w:t>
+      </w:r>
+      <w:proofErr w:type="spellEnd"/>
+      <w:r>
+        <w:t>. ”Men försök att vila en stund innan du äter.”</w:t>
+      </w:r>
+    </w:p>
+    <w:p>
+      <w:r>
+        <w:t>Myr lutade sig tillbaka mot stenen. Han hörde de andra fortsätta arbeta, ljudet av något som lades på elden och Sonya som frågade Lyra var hon hade lagt kärlet med drycken. Det var märkligt hur vardagligt allt lät, trots att de befann sig på en plats som han för bara några dagar sedan inte ens hade kunnat föreställa sig.</w:t>
+      </w:r>
+    </w:p>
+    <w:p>
+      <w:r>
+        <w:t>När maten var färdig åt han långsamt. Den var varm och hade en smak han ännu inte kunde sätta ord på, men den hjälpte honom att känna sig lite mer närvarande. Samtalet kring elden gled mellan sådant Myr inte riktigt förstod och små kommentarer om dagens färd. Han lyssnade utan att försöka följa varje ord.</w:t>
+      </w:r>
+    </w:p>
+    <w:p>
+      <w:r>
+        <w:t>Efter maten gjorde de i ordning sovplatserna på marken, där kullarna gav lä och stenarna bröt av vinden. Myr lade sig ner med rocken över sig och drog den tätare omkring kroppen. Värken fanns fortfarande kvar, men den hade åtminstone slutat tillta.</w:t>
+      </w:r>
+    </w:p>
+    <w:p>
+      <w:r>
+        <w:t xml:space="preserve">Han tänkte på alla varelser han hade sett under dagen, på </w:t>
+      </w:r>
+      <w:proofErr w:type="spellStart"/>
+      <w:r>
+        <w:t>Mansorerna</w:t>
+      </w:r>
+      <w:proofErr w:type="spellEnd"/>
+      <w:r>
+        <w:t xml:space="preserve"> och på hur floden tycktes fortsätta i båda riktningarna. Det fanns så mycket han ville fråga om, men för första gången sedan han kommit till den här världen kände han att han inte orkade få fler svar just nu.</w:t>
+      </w:r>
+    </w:p>
+    <w:p>
+      <w:r>
+        <w:t>Han slöt ögonen och lyssnade till floden i mörkret. Snart blev rösterna kring elden tystare, och tröttheten tog över.</w:t>
+      </w:r>
+    </w:p>
+    <w:p/>
+    <w:p/>
+    <w:p/>
+    <w:p/>
+    <w:p/>
+    <w:p>
+      <w:pPr>
+        <w:rPr>
+          <w:b/>
+          <w:bCs/>
+          <w:sz w:val="36"/>
+          <w:szCs w:val="36"/>
+        </w:rPr>
+      </w:pPr>
+      <w:r>
+        <w:rPr>
+          <w:b/>
+          <w:bCs/>
+          <w:sz w:val="36"/>
+          <w:szCs w:val="36"/>
+        </w:rPr>
+        <w:lastRenderedPageBreak/>
+        <w:t>Kapitel 6 – En oväntad rumskamrat och läran om magi</w:t>
+      </w:r>
+    </w:p>
+    <w:p>
+      <w:r>
+        <w:t>När Myr vaknade hade huvudvärken släppt. Han låg kvar en stund och väntade på att den skulle komma tillbaka, men den gjorde det inte. I stället fanns en tung trötthet kvar, inte i kroppen utan någonstans bakom tankarna. Det var svårt att fästa uppmärksamheten vid en enda sak. Han kunde se stenarna omkring lägerplatsen, höra floden och uppfatta rösterna från de andra, men allt kändes som om det nådde honom genom ett tjockt lager av något.</w:t>
+      </w:r>
+    </w:p>
+    <w:p>
+      <w:r>
+        <w:t>Han satte sig upp och drog handen genom håret. Han mindes gårdagen, åtminstone de stora dragen, men när han försökte tänka på allt han hade sett blev det rörigt. De levande vattnen. Varelserna som växte till hus och slott. Landskapen som hade sträckt sig bortom vad han kunde överblicka. Han visste att han ville förstå alltihop, men just nu orkade han knappt välja vilken fråga han skulle börja med.</w:t>
+      </w:r>
+    </w:p>
+    <w:p>
+      <w:r>
+        <w:t>Frukosten blev inte särskilt lång. Myr åt medan de andra pratade, och även om han hörde vad de sade hade han svårt att följa samtalet hela vägen. Ingen verkade kräva att han skulle bidra. Det var han tacksam för.</w:t>
+      </w:r>
+    </w:p>
+    <w:p>
+      <w:r>
+        <w:t>När de gjort sig redo att fortsätta resan tog Myr plats bakom Sonya på kvasten igen. Han höll sig fast när de lyfte, men den här gången kom höjningen inte lika plötsligt. Marken sjönk undan under dem, floden blev smalare och lägerplatsen försvann bland stenarna.</w:t>
+      </w:r>
+    </w:p>
+    <w:p>
+      <w:r>
+        <w:t>Efter en stund märkte han att tankarna började klarna. Det var ingen plötslig förändring, snarare som om det blev lättare att hålla kvar en tanke innan nästa trängde sig på. Han kunde följa floden med blicken utan att samtidigt försöka minnas alla andra saker han sett. Vinden svalkade ansiktet, och med avståndet till marken tycktes också något av gårdagens tyngd lätta.</w:t>
+      </w:r>
+    </w:p>
+    <w:p>
+      <w:r>
+        <w:t>Han visste fortfarande inte vart de var på väg eller hur länge de skulle fortsätta flyga. Men för första gången sedan han kommit till den här världen kände han inte att han måste förstå allt på en gång.</w:t>
       </w:r>
     </w:p>
     <w:p/>

</xml_diff>

<commit_message>
kapitel 6 är klart.
</commit_message>
<xml_diff>
--- a/Varlden-på-andra-sidan/Världen på andra sidan.docx
+++ b/Varlden-på-andra-sidan/Världen på andra sidan.docx
@@ -453,12 +453,15 @@
         <w:t xml:space="preserve"> – </w:t>
       </w:r>
       <w:r>
-        <w:t>En avslöjad hemlighet</w:t>
-      </w:r>
-    </w:p>
-    <w:p>
-      <w:r>
-        <w:t>--Han berättar för Anna om världens existens.</w:t>
+        <w:t>Nygamla varelser</w:t>
+      </w:r>
+    </w:p>
+    <w:p>
+      <w:r>
+        <w:t xml:space="preserve">--Upptäckten </w:t>
+      </w:r>
+      <w:r>
+        <w:t>utav att ägg fortfarande kan kläckas görs (som har varit i de gråa döda zonerna)</w:t>
       </w:r>
     </w:p>
     <w:p>
@@ -487,20 +490,12 @@
         <w:t xml:space="preserve"> – </w:t>
       </w:r>
       <w:r>
-        <w:t>En oväntad krasch</w:t>
-      </w:r>
-    </w:p>
-    <w:p>
-      <w:r>
-        <w:t xml:space="preserve">--Han är för första gången med om när en </w:t>
-      </w:r>
-      <w:proofErr w:type="spellStart"/>
-      <w:r>
-        <w:t>Mansor</w:t>
-      </w:r>
-      <w:proofErr w:type="spellEnd"/>
-      <w:r>
-        <w:t xml:space="preserve"> kraschar</w:t>
+        <w:t>En avslöjad hemlighet</w:t>
+      </w:r>
+    </w:p>
+    <w:p>
+      <w:r>
+        <w:t>--Han berättar för Anna om världens existens.</w:t>
       </w:r>
     </w:p>
     <w:p>
@@ -529,29 +524,21 @@
         <w:t xml:space="preserve"> – </w:t>
       </w:r>
       <w:r>
-        <w:t>Misslyckade försök</w:t>
-      </w:r>
-    </w:p>
-    <w:p>
-      <w:r>
-        <w:t>--</w:t>
-      </w:r>
-      <w:r>
-        <w:t xml:space="preserve">De försöker förklara för </w:t>
-      </w:r>
-      <w:proofErr w:type="spellStart"/>
-      <w:r>
-        <w:t>anna</w:t>
-      </w:r>
-      <w:proofErr w:type="spellEnd"/>
-      <w:r>
-        <w:t xml:space="preserve"> hur hon ska komma över till den andra världen och </w:t>
-      </w:r>
-      <w:proofErr w:type="spellStart"/>
-      <w:r>
-        <w:t>misslickas</w:t>
-      </w:r>
-      <w:proofErr w:type="spellEnd"/>
+        <w:t>En oväntad krasch</w:t>
+      </w:r>
+    </w:p>
+    <w:p>
+      <w:r>
+        <w:t xml:space="preserve">--Han är för första gången med om när en </w:t>
+      </w:r>
+      <w:proofErr w:type="spellStart"/>
+      <w:r>
+        <w:t>Mansor</w:t>
+      </w:r>
+      <w:proofErr w:type="spellEnd"/>
+      <w:r>
+        <w:t xml:space="preserve"> kraschar</w:t>
+      </w:r>
     </w:p>
     <w:p>
       <w:r>
@@ -579,28 +566,24 @@
         <w:t xml:space="preserve"> – </w:t>
       </w:r>
       <w:r>
-        <w:t>En förändrande skola</w:t>
-      </w:r>
-    </w:p>
-    <w:p>
-      <w:r>
-        <w:t xml:space="preserve">Han får lära sig om klossarna och </w:t>
-      </w:r>
-      <w:proofErr w:type="spellStart"/>
-      <w:r>
-        <w:t>sympiosen</w:t>
-      </w:r>
-      <w:proofErr w:type="spellEnd"/>
-      <w:r>
-        <w:t xml:space="preserve"> och hur en mental bild </w:t>
-      </w:r>
-      <w:proofErr w:type="spellStart"/>
-      <w:r>
-        <w:t>koan</w:t>
-      </w:r>
-      <w:proofErr w:type="spellEnd"/>
-      <w:r>
-        <w:t xml:space="preserve"> forma olika delar på skolan</w:t>
+        <w:t>Misslyckade försök</w:t>
+      </w:r>
+    </w:p>
+    <w:p>
+      <w:r>
+        <w:t>--</w:t>
+      </w:r>
+      <w:r>
+        <w:t xml:space="preserve">De försöker förklara för </w:t>
+      </w:r>
+      <w:r>
+        <w:t>Anna</w:t>
+      </w:r>
+      <w:r>
+        <w:t xml:space="preserve"> hur hon ska komma över till den andra världen och </w:t>
+      </w:r>
+      <w:r>
+        <w:t>misslyckas</w:t>
       </w:r>
     </w:p>
     <w:p>
@@ -629,12 +612,18 @@
         <w:t xml:space="preserve"> – </w:t>
       </w:r>
       <w:r>
-        <w:t>självplågerier och nya upptäckter</w:t>
-      </w:r>
-    </w:p>
-    <w:p>
-      <w:r>
-        <w:t>Han upptäcker hur Anna har utsatt sig för liknande misär som han själv gått igenom då hon tror att detta är triggern. Men i slutet så domnar hennes arm bort när de försonas och hon känner igen en känsla han har beskrivit.</w:t>
+        <w:t>En förändrande skola</w:t>
+      </w:r>
+    </w:p>
+    <w:p>
+      <w:r>
+        <w:t xml:space="preserve">Han får lära sig om klossarna och </w:t>
+      </w:r>
+      <w:r>
+        <w:t>symbiosen</w:t>
+      </w:r>
+      <w:r>
+        <w:t xml:space="preserve"> och hur en mental bild kan forma olika delar på skolan</w:t>
       </w:r>
     </w:p>
     <w:p>
@@ -656,6 +645,40 @@
         <w:t xml:space="preserve"> – </w:t>
       </w:r>
       <w:r>
+        <w:t>självplågerier och nya upptäckter</w:t>
+      </w:r>
+    </w:p>
+    <w:p>
+      <w:r>
+        <w:t>Han upptäcker hur Anna har utsatt sig för liknande misär som han själv gått igenom då hon tror att detta är triggern. Men i slutet så domnar hennes arm bort när de försonas och hon känner igen en känsla han har beskrivit.</w:t>
+      </w:r>
+    </w:p>
+    <w:p>
+      <w:r>
+        <w:rPr>
+          <w:b/>
+          <w:bCs/>
+        </w:rPr>
+        <w:t xml:space="preserve">Kapitel </w:t>
+      </w:r>
+      <w:r>
+        <w:rPr>
+          <w:b/>
+          <w:bCs/>
+        </w:rPr>
+        <w:t>2</w:t>
+      </w:r>
+      <w:r>
+        <w:rPr>
+          <w:b/>
+          <w:bCs/>
+        </w:rPr>
+        <w:t>1</w:t>
+      </w:r>
+      <w:r>
+        <w:t xml:space="preserve"> – </w:t>
+      </w:r>
+      <w:r>
         <w:t>Att dela en ny värld</w:t>
       </w:r>
     </w:p>
@@ -664,10 +687,6 @@
         <w:t>De får uppleva världen tillsammans</w:t>
       </w:r>
     </w:p>
-    <w:p/>
-    <w:p/>
-    <w:p/>
-    <w:p/>
     <w:p/>
     <w:p/>
     <w:p/>
@@ -691,6 +710,7 @@
           <w:sz w:val="36"/>
           <w:szCs w:val="36"/>
         </w:rPr>
+        <w:lastRenderedPageBreak/>
         <w:t>Prolog</w:t>
       </w:r>
     </w:p>
@@ -814,17 +834,17 @@
     </w:p>
     <w:p>
       <w:r>
+        <w:t>Små ljuspunkter flöt mellan buskarna.</w:t>
+      </w:r>
+    </w:p>
+    <w:p>
+      <w:r>
+        <w:t>En del var insekter.</w:t>
+      </w:r>
+    </w:p>
+    <w:p>
+      <w:r>
         <w:lastRenderedPageBreak/>
-        <w:t>Små ljuspunkter flöt mellan buskarna.</w:t>
-      </w:r>
-    </w:p>
-    <w:p>
-      <w:r>
-        <w:t>En del var insekter.</w:t>
-      </w:r>
-    </w:p>
-    <w:p>
-      <w:r>
         <w:t>Andra var inte.</w:t>
       </w:r>
     </w:p>
@@ -977,29 +997,29 @@
     <w:p>
       <w:proofErr w:type="spellStart"/>
       <w:r>
+        <w:t>Elarion</w:t>
+      </w:r>
+      <w:proofErr w:type="spellEnd"/>
+      <w:r>
+        <w:t xml:space="preserve"> tog ett steg framåt.</w:t>
+      </w:r>
+    </w:p>
+    <w:p>
+      <w:r>
+        <w:t xml:space="preserve">"Mitt namn är </w:t>
+      </w:r>
+      <w:proofErr w:type="spellStart"/>
+      <w:r>
+        <w:t>Elarion</w:t>
+      </w:r>
+      <w:proofErr w:type="spellEnd"/>
+      <w:r>
+        <w:t>", började han. "Jag är glad att—"</w:t>
+      </w:r>
+    </w:p>
+    <w:p>
+      <w:r>
         <w:lastRenderedPageBreak/>
-        <w:t>Elarion</w:t>
-      </w:r>
-      <w:proofErr w:type="spellEnd"/>
-      <w:r>
-        <w:t xml:space="preserve"> tog ett steg framåt.</w:t>
-      </w:r>
-    </w:p>
-    <w:p>
-      <w:r>
-        <w:t xml:space="preserve">"Mitt namn är </w:t>
-      </w:r>
-      <w:proofErr w:type="spellStart"/>
-      <w:r>
-        <w:t>Elarion</w:t>
-      </w:r>
-      <w:proofErr w:type="spellEnd"/>
-      <w:r>
-        <w:t>", började han. "Jag är glad att—"</w:t>
-      </w:r>
-    </w:p>
-    <w:p>
-      <w:r>
         <w:t>Mannen öppnade ögonen.</w:t>
       </w:r>
     </w:p>
@@ -1148,41 +1168,41 @@
     </w:p>
     <w:p>
       <w:r>
+        <w:t xml:space="preserve">Nästan genast började hans gestalt bli </w:t>
+      </w:r>
+      <w:proofErr w:type="gramStart"/>
+      <w:r>
+        <w:t>allt mer</w:t>
+      </w:r>
+      <w:proofErr w:type="gramEnd"/>
+      <w:r>
+        <w:t xml:space="preserve"> oklar. </w:t>
+      </w:r>
+      <w:proofErr w:type="spellStart"/>
+      <w:r>
+        <w:t>Elarion</w:t>
+      </w:r>
+      <w:proofErr w:type="spellEnd"/>
+      <w:r>
+        <w:t xml:space="preserve"> höjde handen och pekade först på sina egna ögon och sedan på sina öron. Kanske hörde mannen honom inte. Kanske kunde han bara se honom när något annat hos honom var vaket.</w:t>
+      </w:r>
+    </w:p>
+    <w:p>
+      <w:r>
+        <w:t xml:space="preserve">Men innan </w:t>
+      </w:r>
+      <w:proofErr w:type="spellStart"/>
+      <w:r>
+        <w:t>Elarion</w:t>
+      </w:r>
+      <w:proofErr w:type="spellEnd"/>
+      <w:r>
+        <w:t xml:space="preserve"> hann göra mer hade gestalten tonat bort.</w:t>
+      </w:r>
+    </w:p>
+    <w:p>
+      <w:r>
         <w:lastRenderedPageBreak/>
-        <w:t xml:space="preserve">Nästan genast började hans gestalt bli </w:t>
-      </w:r>
-      <w:proofErr w:type="gramStart"/>
-      <w:r>
-        <w:t>allt mer</w:t>
-      </w:r>
-      <w:proofErr w:type="gramEnd"/>
-      <w:r>
-        <w:t xml:space="preserve"> oklar. </w:t>
-      </w:r>
-      <w:proofErr w:type="spellStart"/>
-      <w:r>
-        <w:t>Elarion</w:t>
-      </w:r>
-      <w:proofErr w:type="spellEnd"/>
-      <w:r>
-        <w:t xml:space="preserve"> höjde handen och pekade först på sina egna ögon och sedan på sina öron. Kanske hörde mannen honom inte. Kanske kunde han bara se honom när något annat hos honom var vaket.</w:t>
-      </w:r>
-    </w:p>
-    <w:p>
-      <w:r>
-        <w:t xml:space="preserve">Men innan </w:t>
-      </w:r>
-      <w:proofErr w:type="spellStart"/>
-      <w:r>
-        <w:t>Elarion</w:t>
-      </w:r>
-      <w:proofErr w:type="spellEnd"/>
-      <w:r>
-        <w:t xml:space="preserve"> hann göra mer hade gestalten tonat bort.</w:t>
-      </w:r>
-    </w:p>
-    <w:p>
-      <w:r>
         <w:t>Han stod kvar och såg på den tomma platsen.</w:t>
       </w:r>
     </w:p>
@@ -1314,6 +1334,7 @@
           <w:sz w:val="36"/>
           <w:szCs w:val="36"/>
         </w:rPr>
+        <w:lastRenderedPageBreak/>
         <w:t>Kapitel 1</w:t>
       </w:r>
       <w:r>
@@ -1541,7 +1562,6 @@
     </w:p>
     <w:p>
       <w:r>
-        <w:lastRenderedPageBreak/>
         <w:t>Ändå var det dit blicken sökte sig varje gång han vaknade på</w:t>
       </w:r>
       <w:r>
@@ -1564,6 +1584,7 @@
     </w:p>
     <w:p>
       <w:r>
+        <w:lastRenderedPageBreak/>
         <w:t>Men tanken på att någon där nere redan kunde vara vaken fick</w:t>
       </w:r>
       <w:r>
@@ -1733,22 +1754,22 @@
     </w:p>
     <w:p>
       <w:r>
+        <w:t>Tunga eller lätta.</w:t>
+      </w:r>
+    </w:p>
+    <w:p>
+      <w:r>
+        <w:t>Om de stannade.</w:t>
+      </w:r>
+    </w:p>
+    <w:p>
+      <w:r>
+        <w:t>Om de fortsatte.</w:t>
+      </w:r>
+    </w:p>
+    <w:p>
+      <w:r>
         <w:lastRenderedPageBreak/>
-        <w:t>Tunga eller lätta.</w:t>
-      </w:r>
-    </w:p>
-    <w:p>
-      <w:r>
-        <w:t>Om de stannade.</w:t>
-      </w:r>
-    </w:p>
-    <w:p>
-      <w:r>
-        <w:t>Om de fortsatte.</w:t>
-      </w:r>
-    </w:p>
-    <w:p>
-      <w:r>
         <w:t>Han kunde inte längre höra en människa gå genom huset utan</w:t>
       </w:r>
       <w:r>
@@ -1833,6 +1854,7 @@
     <w:p/>
     <w:p>
       <w:r>
+        <w:lastRenderedPageBreak/>
         <w:t>Karin pratade lågt. Hennes röst var svår att uppfatta genom</w:t>
       </w:r>
       <w:r>
@@ -2015,15 +2037,12 @@
     </w:p>
     <w:p>
       <w:r>
-        <w:t xml:space="preserve">Viktor satt på andra sidan bordet och åt. Han var ett par år äldre, men Myr hade redan börjat växa om honom. Det syntes mest när de stod bredvid varandra, men även nu kändes Viktor större. Hans axlar var bredare och händerna grövre. Det långa bruna håret hade han valt att sätta upp i en tofs den här morgonen. Han hade ett kraftigt ansikte med </w:t>
-      </w:r>
+        <w:t>Viktor satt på andra sidan bordet och åt. Han var ett par år äldre, men Myr hade redan börjat växa om honom. Det syntes mest när de stod bredvid varandra, men även nu kändes Viktor större. Hans axlar var bredare och händerna grövre. Det långa bruna håret hade han valt att sätta upp i en tofs den här morgonen. Han hade ett kraftigt ansikte med breda käkar, en bred näsa och mörka ögon som låg under tjocka ögonbryn. När han satt där vid bordet kunde Myr ibland få känslan av att se Edvard i en yngre version.</w:t>
+      </w:r>
+    </w:p>
+    <w:p>
       <w:r>
         <w:lastRenderedPageBreak/>
-        <w:t>breda käkar, en bred näsa och mörka ögon som låg under tjocka ögonbryn. När han satt där vid bordet kunde Myr ibland få känslan av att se Edvard i en yngre version.</w:t>
-      </w:r>
-    </w:p>
-    <w:p>
-      <w:r>
         <w:t>Om man inte visste att de var bröder hade det varit svårt att tro det. Myr verkade ha fått de flesta av sina drag från Karin, medan Viktor såg ut som om han hade fått dem från Edvard.</w:t>
       </w:r>
       <w:r>
@@ -2189,15 +2208,12 @@
     </w:p>
     <w:p>
       <w:r>
-        <w:t xml:space="preserve">Albin hade lockigt, mörkblont hår och var lite kortare än Myr, men med en mycket bastantare kropp. Det var framför allt hans leende Myr lade märke till. Albin log på ett alldeles eget sätt, med ena mungipan lite högre än den andra och en blick som gjorde </w:t>
-      </w:r>
+        <w:t>Albin hade lockigt, mörkblont hår och var lite kortare än Myr, men med en mycket bastantare kropp. Det var framför allt hans leende Myr lade märke till. Albin log på ett alldeles eget sätt, med ena mungipan lite högre än den andra och en blick som gjorde att leendet aldrig riktigt såg vänligt ut. Myr hade sett det så många gånger att han visste precis vad det betydde.</w:t>
+      </w:r>
+    </w:p>
+    <w:p>
       <w:r>
         <w:lastRenderedPageBreak/>
-        <w:t>att leendet aldrig riktigt såg vänligt ut. Myr hade sett det så många gånger att han visste precis vad det betydde.</w:t>
-      </w:r>
-    </w:p>
-    <w:p>
-      <w:r>
         <w:t>Myr saktade in, men det var redan för sent. När han vände sig om kom knuffen från Albin och Myr tappade nästan balansen. De andra tre stod bakom honom. Han hann tänka att han borde ha förstått det innan slagen började. Det gjorde ont, men det var över ganska snabbt. De skrattade åt honom medan de slog och när de var färdiga stod Myr kvar och försökte få tillbaka andningen.</w:t>
       </w:r>
     </w:p>
@@ -2254,11 +2270,14 @@
     </w:p>
     <w:p>
       <w:r>
+        <w:t>När Myr kom fram till klassrummet stod läraren redan vid dörren och väntade på honom.</w:t>
+      </w:r>
+      <w:r>
+        <w:t xml:space="preserve"> Han var medellång man med ett nyrakat ansikte som såg ut att det var mejslat ur sten. </w:t>
+      </w:r>
+      <w:r>
         <w:lastRenderedPageBreak/>
-        <w:t>När Myr kom fram till klassrummet stod läraren redan vid dörren och väntade på honom.</w:t>
-      </w:r>
-      <w:r>
-        <w:t xml:space="preserve"> Han var medellång man med ett nyrakat ansikte som såg ut att det var mejslat ur sten. Han hade ett utseende som gjorde det svårt att gissa hur gammal han var, Men Myr bedömer att han är mellan 50 och 60 år gammal, noggrannare än så vågar han inte säga.</w:t>
+        <w:t>Han hade ett utseende som gjorde det svårt att gissa hur gammal han var, Men Myr bedömer att han är mellan 50 och 60 år gammal, noggrannare än så vågar han inte säga.</w:t>
       </w:r>
     </w:p>
     <w:p>
@@ -2325,11 +2344,11 @@
         <w:t xml:space="preserve">Myr var allra först att komma ut ur klassrummet trots att han hade en utav platserna längst ifrån dörren, han tänkte om Albin inte han träffa de tre kompisarna ifrån den andra klassen innan han hade hunnit en bit så hade de ingen möjlighet att blockera hans väg hem för att tortera honom igen. Precis när han i hög fart nästan halvspringer ut genom dörren </w:t>
       </w:r>
       <w:r>
-        <w:t xml:space="preserve">går Anna förbi i korridoren utanför klassrummet, hon är en ny tjej som började i klassen bredvid för mindre än tre veckor sedan. Hon varen ganska liten och blyg tjej som mest hade varit osynlig sedan hon hade börjat på skolan men just i det ögonblicket lade </w:t>
+        <w:t xml:space="preserve">går Anna förbi i korridoren utanför klassrummet, hon är en ny tjej som började i klassen bredvid för mindre än tre veckor sedan. Hon varen ganska liten och blyg tjej som mest hade varit osynlig sedan hon hade börjat på skolan men just i det ögonblicket lade Myr för första gånger märke till hur vacker hon var hon hade ett långt rödbrunt hår slom låg slätt intill kroppen och stora runda ögon som hade en Hazel nöts brun färg. Det fanns </w:t>
       </w:r>
       <w:r>
         <w:lastRenderedPageBreak/>
-        <w:t>Myr för första gånger märke till hur vacker hon var hon hade ett långt rödbrunt hår slom låg slätt intill kroppen och stora runda ögon som hade en Hazel nöts brun färg. Det fanns vissa drag som normalt inte hade ansetts så vackra men de var som gjorde för henne. En glugg mellan framtänderna och öron som såg ut att sträcka ut sig för att höra en viskning ifrån andra sidan av rummet.</w:t>
+        <w:t>vissa drag som normalt inte hade ansetts så vackra men de var som gjorde för henne. En glugg mellan framtänderna och öron som såg ut att sträcka ut sig för att höra en viskning ifrån andra sidan av rummet.</w:t>
       </w:r>
       <w:r>
         <w:t xml:space="preserve"> </w:t>
@@ -2422,116 +2441,116 @@
     </w:p>
     <w:p>
       <w:r>
+        <w:t>”Ja.”</w:t>
+      </w:r>
+    </w:p>
+    <w:p>
+      <w:r>
         <w:lastRenderedPageBreak/>
+        <w:t>Svaret kom av ren reflex.</w:t>
+      </w:r>
+    </w:p>
+    <w:p>
+      <w:r>
+        <w:t xml:space="preserve">Egentligen hade han tänkt skynda före. Om han hann en bit innan Albin och de andra kom ut skulle de kanske inte hinna </w:t>
+      </w:r>
+      <w:proofErr w:type="gramStart"/>
+      <w:r>
+        <w:t>ikapp</w:t>
+      </w:r>
+      <w:proofErr w:type="gramEnd"/>
+      <w:r>
+        <w:t xml:space="preserve"> honom. Men nu var det kanske redan för sent.</w:t>
+      </w:r>
+    </w:p>
+    <w:p>
+      <w:r>
+        <w:t>”Då kan vi väl följas åt en bit?” sade Anna.</w:t>
+      </w:r>
+    </w:p>
+    <w:p>
+      <w:r>
+        <w:t>”Ja”, svarade Myr igen.</w:t>
+      </w:r>
+    </w:p>
+    <w:p>
+      <w:r>
+        <w:t>De började gå.</w:t>
+      </w:r>
+    </w:p>
+    <w:p>
+      <w:r>
+        <w:t>Myr sade inte mycket. Han visste inte riktigt vad han skulle säga. Han gick bredvid henne och försökte komma på om detta faktiskt var den första riktiga konversation han haft under hela dagen. Han var inte ens säker på om han hade yttrat ett enda ord innan han mötte henne.</w:t>
+      </w:r>
+    </w:p>
+    <w:p>
+      <w:r>
+        <w:t>De hann knappt hundra meter från skolan innan Myr såg dem.</w:t>
+      </w:r>
+    </w:p>
+    <w:p>
+      <w:r>
+        <w:t xml:space="preserve">Albin stod längre fram på gatan tillsammans med Gustav, Henrik och </w:t>
+      </w:r>
+      <w:r>
+        <w:t>Oskar</w:t>
+      </w:r>
+      <w:r>
+        <w:t>. De stod lutade mot husväggen som om de hade väntat där en längre stund.</w:t>
+      </w:r>
+    </w:p>
+    <w:p>
+      <w:r>
+        <w:t>Myr stannade nästan.</w:t>
+      </w:r>
+    </w:p>
+    <w:p>
+      <w:r>
+        <w:t>Albin fick syn på honom och log.</w:t>
+      </w:r>
+    </w:p>
+    <w:p>
+      <w:r>
+        <w:t>”Där är du ju.”</w:t>
+      </w:r>
+    </w:p>
+    <w:p>
+      <w:r>
+        <w:t>Myr hann inte svara innan Gustav knuffade till honom. Henrik gjorde detsamma från andra sidan. Myr tog ett steg bakåt men sade ingenting.</w:t>
+      </w:r>
+    </w:p>
+    <w:p>
+      <w:r>
+        <w:t>Albin såg på Anna.</w:t>
+      </w:r>
+    </w:p>
+    <w:p>
+      <w:r>
+        <w:t>”Vad gör du med honom?”</w:t>
+      </w:r>
+    </w:p>
+    <w:p>
+      <w:r>
+        <w:t>Anna höjde hakan.</w:t>
+      </w:r>
+    </w:p>
+    <w:p>
+      <w:r>
+        <w:t>”Vi går hem.”</w:t>
+      </w:r>
+    </w:p>
+    <w:p>
+      <w:r>
+        <w:t>”Med honom?”</w:t>
+      </w:r>
+    </w:p>
+    <w:p>
+      <w:r>
         <w:t>”Ja.”</w:t>
       </w:r>
     </w:p>
     <w:p>
       <w:r>
-        <w:t>Svaret kom av ren reflex.</w:t>
-      </w:r>
-    </w:p>
-    <w:p>
-      <w:r>
-        <w:t xml:space="preserve">Egentligen hade han tänkt skynda före. Om han hann en bit innan Albin och de andra kom ut skulle de kanske inte hinna </w:t>
-      </w:r>
-      <w:proofErr w:type="gramStart"/>
-      <w:r>
-        <w:t>ikapp</w:t>
-      </w:r>
-      <w:proofErr w:type="gramEnd"/>
-      <w:r>
-        <w:t xml:space="preserve"> honom. Men nu var det kanske redan för sent.</w:t>
-      </w:r>
-    </w:p>
-    <w:p>
-      <w:r>
-        <w:t>”Då kan vi väl följas åt en bit?” sade Anna.</w:t>
-      </w:r>
-    </w:p>
-    <w:p>
-      <w:r>
-        <w:t>”Ja”, svarade Myr igen.</w:t>
-      </w:r>
-    </w:p>
-    <w:p>
-      <w:r>
-        <w:t>De började gå.</w:t>
-      </w:r>
-    </w:p>
-    <w:p>
-      <w:r>
-        <w:t>Myr sade inte mycket. Han visste inte riktigt vad han skulle säga. Han gick bredvid henne och försökte komma på om detta faktiskt var den första riktiga konversation han haft under hela dagen. Han var inte ens säker på om han hade yttrat ett enda ord innan han mötte henne.</w:t>
-      </w:r>
-    </w:p>
-    <w:p>
-      <w:r>
-        <w:t>De hann knappt hundra meter från skolan innan Myr såg dem.</w:t>
-      </w:r>
-    </w:p>
-    <w:p>
-      <w:r>
-        <w:t xml:space="preserve">Albin stod längre fram på gatan tillsammans med Gustav, Henrik och </w:t>
-      </w:r>
-      <w:r>
-        <w:t>Oskar</w:t>
-      </w:r>
-      <w:r>
-        <w:t>. De stod lutade mot husväggen som om de hade väntat där en längre stund.</w:t>
-      </w:r>
-    </w:p>
-    <w:p>
-      <w:r>
-        <w:t>Myr stannade nästan.</w:t>
-      </w:r>
-    </w:p>
-    <w:p>
-      <w:r>
-        <w:t>Albin fick syn på honom och log.</w:t>
-      </w:r>
-    </w:p>
-    <w:p>
-      <w:r>
-        <w:t>”Där är du ju.”</w:t>
-      </w:r>
-    </w:p>
-    <w:p>
-      <w:r>
-        <w:t>Myr hann inte svara innan Gustav knuffade till honom. Henrik gjorde detsamma från andra sidan. Myr tog ett steg bakåt men sade ingenting.</w:t>
-      </w:r>
-    </w:p>
-    <w:p>
-      <w:r>
-        <w:t>Albin såg på Anna.</w:t>
-      </w:r>
-    </w:p>
-    <w:p>
-      <w:r>
-        <w:t>”Vad gör du med honom?”</w:t>
-      </w:r>
-    </w:p>
-    <w:p>
-      <w:r>
-        <w:t>Anna höjde hakan.</w:t>
-      </w:r>
-    </w:p>
-    <w:p>
-      <w:r>
-        <w:t>”Vi går hem.”</w:t>
-      </w:r>
-    </w:p>
-    <w:p>
-      <w:r>
-        <w:t>”Med honom?”</w:t>
-      </w:r>
-    </w:p>
-    <w:p>
-      <w:r>
-        <w:t>”Ja.”</w:t>
-      </w:r>
-    </w:p>
-    <w:p>
-      <w:r>
         <w:t>Albin skrattade kort.</w:t>
       </w:r>
     </w:p>
@@ -2557,12 +2576,12 @@
     </w:p>
     <w:p>
       <w:r>
+        <w:t>Albins ansikte hårdnade.</w:t>
+      </w:r>
+    </w:p>
+    <w:p>
+      <w:r>
         <w:lastRenderedPageBreak/>
-        <w:t>Albins ansikte hårdnade.</w:t>
-      </w:r>
-    </w:p>
-    <w:p>
-      <w:r>
         <w:t>Han tog ett steg fram och knuffade henne.</w:t>
       </w:r>
     </w:p>
@@ -16345,10 +16364,4184 @@
     </w:p>
     <w:p>
       <w:r>
+        <w:t>Det var dock inte byggnaderna som fångade hans uppmärksamhet när de kom närmare, utan trädet.</w:t>
+      </w:r>
+    </w:p>
+    <w:p>
+      <w:r>
+        <w:t>Han hade lagt märke till det redan på avstånd och tyckt att det såg enormt ut. Nu när de närmade sig började han förstå hur mycket han hade underskattat dess storlek. De knotiga grenarna sträckte sig långt ut över klipporna, och de breda kronorna av lila blommor bredde ut sig över delar av akademin. Vatten strömmade från grenarna och föll i långa, skimrande kaskader ner längs bergssidan. På avstånd hade det varit svårt att avgöra var trädet slutade och vattenfallen började.</w:t>
+      </w:r>
+    </w:p>
+    <w:p>
+      <w:r>
+        <w:t xml:space="preserve">Myr försökte uppskatta hur stor stammen var, men visste inte riktigt var han skulle börja. Den var åtminstone lika bred som hela skolbyggnaden hemma, kanske ännu bredare. </w:t>
+      </w:r>
+      <w:r>
+        <w:lastRenderedPageBreak/>
+        <w:t>Han hade ingen aning om hur högt trädet sträckte sig eller hur långt dess grenar nådde bakom akademins torn. Ju närmare de kom, desto svårare blev det att se trädet som en enda varelse. Det var som om en hel del av berget hade vuxit ihop med det.</w:t>
+      </w:r>
+    </w:p>
+    <w:p>
+      <w:r>
+        <w:t>Han vände blicken mellan trädet och byggnaderna, osäker på vilket av dem han egentligen borde titta på. Akademin var väldig, men bredvid trädet fick den nästan något mindre över sig. Ändå verkade hela platsen vara byggd med trädet som en självklar del av den, som om ingen någonsin hade föreställt sig att akademin skulle kunna finnas utan det.</w:t>
+      </w:r>
+    </w:p>
+    <w:p>
+      <w:r>
         <w:t>Myr försökte föreställa sig hur det skulle vara att gå omkring där inne. För första gången på länge hade han en fråga som inte handlade om hur världen fungerade, utan om vad som väntade honom där.</w:t>
       </w:r>
     </w:p>
-    <w:p/>
+    <w:p>
+      <w:r>
+        <w:t>Kvasten svängde långsamt in mot akademin. Myr försökte följa trädets grenar med blicken medan de passerade ovanför de yttersta taken. Vattnet strömmade längs de knotiga grenarna och föll i långa kaskader över klipporna. När de kom närmare byggnaderna upptäckte han att några av vattenfallen rann bakom murar och försvann in i smala öppningar i berget, medan andra fortsatte ner mot dalen. Ljudet från vattnet fyllde luften och blandades med vindens sus.</w:t>
+      </w:r>
+    </w:p>
+    <w:p>
+      <w:r>
+        <w:t>Sonya styrde kvasten mot en öppen gård mellan byggnaderna. Där fanns gott om plats att landa, omgiven av höga fasader och valv som förband de olika delarna av akademin. Stenläggningen bildade ett mönster som löpte ut från en rund yta i mitten, och längs gårdens kanter växte växter med mörka stjälkar och smala, lila blad.</w:t>
+      </w:r>
+    </w:p>
+    <w:p>
+      <w:r>
+        <w:t>Myr hann bara kasta en snabb blick omkring sig innan kvasten sjönk ner och hans fötter nådde marken.</w:t>
+      </w:r>
+    </w:p>
+    <w:p>
+      <w:r>
+        <w:t>Han klev av och sträckte på benen. Efter timmar i luften kändes det ovant att stå stilla. Han såg upp mot byggnaderna som reste sig runt gården. På nära håll var de ännu mer imponerande än från luften. Väggarna bestod av stora, mörka partier som på avstånd hade sett ut som sten, men ytan var märkligt jämn. Här och där löpte tunna linjer genom materialet, så diskreta att han först trodde att de var sprickor. När han tittade närmare verkade de snarare följa byggnadens former, som om materialet hade formats i stället för att fogas samman bit för bit.</w:t>
+      </w:r>
+    </w:p>
+    <w:p>
+      <w:r>
+        <w:t>Han kunde inte avgöra hur det hade gått till. Kanske var det bara någon byggteknik han aldrig hade sett förut.</w:t>
+      </w:r>
+    </w:p>
+    <w:p>
+      <w:proofErr w:type="spellStart"/>
+      <w:r>
+        <w:t>Elarion</w:t>
+      </w:r>
+      <w:proofErr w:type="spellEnd"/>
+      <w:r>
+        <w:t xml:space="preserve"> och Lyra hade redan klivit av sina kvastar. De utbytte några ord med Sonya innan </w:t>
+      </w:r>
+      <w:proofErr w:type="spellStart"/>
+      <w:r>
+        <w:t>Elarion</w:t>
+      </w:r>
+      <w:proofErr w:type="spellEnd"/>
+      <w:r>
+        <w:t xml:space="preserve"> vände sig mot Myr.</w:t>
+      </w:r>
+    </w:p>
+    <w:p>
+      <w:r>
+        <w:t>”Vi behöver gå in en stund”, sade han. ”Sonya kan visa dig runt under tiden.”</w:t>
+      </w:r>
+    </w:p>
+    <w:p>
+      <w:r>
+        <w:t>Myr nickade. Han hade så många frågor att han inte visste vilken han skulle börja med.</w:t>
+      </w:r>
+    </w:p>
+    <w:p>
+      <w:r>
+        <w:lastRenderedPageBreak/>
+        <w:t>”Vi möts vid arenaplattformen senare i dag”, sade Lyra och pekade mot en del av akademin som sträckte sig ut från berget längre bort. ”Du kommer att se den när Sonya visar dig runt.”</w:t>
+      </w:r>
+    </w:p>
+    <w:p>
+      <w:r>
+        <w:t xml:space="preserve">Sedan gick hon och </w:t>
+      </w:r>
+      <w:proofErr w:type="spellStart"/>
+      <w:r>
+        <w:t>Elarion</w:t>
+      </w:r>
+      <w:proofErr w:type="spellEnd"/>
+      <w:r>
+        <w:t xml:space="preserve"> mot en hög port i huvudbyggnaden. Myr följde dem med blicken när portarna öppnades och de försvann in bakom dem.</w:t>
+      </w:r>
+    </w:p>
+    <w:p>
+      <w:r>
+        <w:t>Han vände sig mot Sonya. Bakom henne reste sig akademins väggar i flera nivåer, med torn, valv och broar som band samman byggnaderna. Allt såg ut att höra ihop, trots att det var svårt att förstå var en del slutade och nästa började.</w:t>
+      </w:r>
+    </w:p>
+    <w:p>
+      <w:r>
+        <w:t>”Så”, sade Sonya och såg sig omkring på gården. ”Vad vill du se först?”</w:t>
+      </w:r>
+    </w:p>
+    <w:p>
+      <w:r>
+        <w:t>Myr tittade upp mot tornen, sedan mot trädet vars lila krona syntes ovanför taken.</w:t>
+      </w:r>
+    </w:p>
+    <w:p>
+      <w:r>
+        <w:t>”Jag vet inte ens vad jag tittar på än”, svarade han.</w:t>
+      </w:r>
+    </w:p>
+    <w:p>
+      <w:r>
+        <w:t>Sonya följde Myrs blick mot trädet. Hon verkade fundera ett ögonblick innan hon började gå över gården.</w:t>
+      </w:r>
+    </w:p>
+    <w:p>
+      <w:r>
+        <w:t>”Kom”, sade hon. ”Vi börjar där.”</w:t>
+      </w:r>
+    </w:p>
+    <w:p>
+      <w:r>
+        <w:t>Myr följde efter henne. De passerade en av de breda valvgångarna och kom ut på en öppen del av gården där trädet syntes mellan byggnaderna. Härifrån kunde han se mer av den väldiga stammen och hur de tjocka grenarna vred sig ut över klipporna. De lila blomkronorna bredde ut sig i flera lager, och vattnet rann längs grenarnas undersidor innan det föll fritt mot avsatserna nedanför. Några av vattenfallen försvann bakom akademins byggnader, medan andra störtade ner i dimman.</w:t>
+      </w:r>
+    </w:p>
+    <w:p>
+      <w:r>
+        <w:t>”Det är svårt att förstå hur stort det är”, sade Myr.</w:t>
+      </w:r>
+    </w:p>
+    <w:p>
+      <w:r>
+        <w:t>”Du är inte den första som säger det.”</w:t>
+      </w:r>
+    </w:p>
+    <w:p>
+      <w:r>
+        <w:t>Sonya stannade vid en låg mur. Därifrån kunde de se hur en av de bredare grenarna sträckte sig över en del av akademin, så långt att den nästan tycktes vila ovanför ett av tornen.</w:t>
+      </w:r>
+    </w:p>
+    <w:p>
+      <w:r>
+        <w:t>”Vet man hur gammalt det är?” frågade Myr.</w:t>
+      </w:r>
+    </w:p>
+    <w:p>
+      <w:r>
+        <w:t>”Nej. Inte ens i närheten.” Sonya såg upp mot kronan. ”Vi vet faktiskt inte särskilt mycket om trädet alls. Det är unikt för den här världen, och såvitt vi vet finns det inget annat liknande någon annanstans.”</w:t>
+      </w:r>
+    </w:p>
+    <w:p>
+      <w:r>
+        <w:t>”Men ni vet vad det gör?”</w:t>
+      </w:r>
+    </w:p>
+    <w:p>
+      <w:r>
+        <w:t>”En del.” Hon pekade mot vattnet som strömmade från en av grenarna. ”Vattnet som rinner därifrån är fyllt av energi. Den sprids vidare ut i världen och når platser som ligger</w:t>
+      </w:r>
+      <w:r>
+        <w:t xml:space="preserve"> </w:t>
+      </w:r>
+      <w:r>
+        <w:t>långt härifrån</w:t>
+      </w:r>
+      <w:r>
+        <w:t>.</w:t>
+      </w:r>
+      <w:r>
+        <w:t>”</w:t>
+      </w:r>
+    </w:p>
+    <w:p>
+      <w:r>
+        <w:lastRenderedPageBreak/>
+        <w:t>Myr följde vattenfallet med blicken tills det försvann bakom en avsats.</w:t>
+      </w:r>
+    </w:p>
+    <w:p>
+      <w:r>
+        <w:t>”Så trädet förser hela världen med energi?”</w:t>
+      </w:r>
+    </w:p>
+    <w:p>
+      <w:r>
+        <w:t>”Det är ungefär så vi förstår det. Vi vet att trädet har en enormt viktig betydelse för världen, men vi vet inte exakt hur allt hänger ihop. Vi vet inte varifrån det kommer, hur länge det har funnits eller varför det ser ut som det gör.”</w:t>
+      </w:r>
+    </w:p>
+    <w:p>
+      <w:r>
+        <w:t>Myr tittade återigen upp mot grenarna. Det hade varit lätt att tro att trädet bara var en märklig del av landskapet, ännu en sak som var annorlunda i den här världen. Nu kändes det snarare som om det fanns något bakom hela dess existens som ingen riktigt kunde förklara.</w:t>
+      </w:r>
+    </w:p>
+    <w:p>
+      <w:r>
+        <w:t>”Och ingen har lyckats ta reda på det?”</w:t>
+      </w:r>
+    </w:p>
+    <w:p>
+      <w:r>
+        <w:t>”Folk har försökt förstå det i väldigt lång tid”, svarade Sonya. ”Men att något är viktigt betyder inte att vi automatiskt förstår det.”</w:t>
+      </w:r>
+    </w:p>
+    <w:p>
+      <w:r>
+        <w:t>Hon började gå igen, den här gången längs muren som ledde tillbaka mot akademins byggnader.</w:t>
+      </w:r>
+    </w:p>
+    <w:p>
+      <w:r>
+        <w:t>Myr kastade en sista blick mot trädet innan han följde efter. Han hade kommit hit med fler frågor än han kunde räkna, och nu hade han fått ännu en som förmodligen inte skulle vara lätt att besvara.</w:t>
+      </w:r>
+    </w:p>
+    <w:p>
+      <w:r>
+        <w:t>Sonya ledde honom tillbaka genom valvgången och in mellan akademins byggnader. Myr försökte hålla reda på vägen, men det var svårare än han hade trott. Gångarna delade sig åt flera håll, trappor ledde upp till broar och öppningar i väggarna visade sig ibland vara passager till helt andra delar av komplexet. Allt tycktes vara sammanbyggt, men på ett sätt som gjorde det svårt att förstå hur långt byggnaderna egentligen sträckte sig.</w:t>
+      </w:r>
+    </w:p>
+    <w:p>
+      <w:r>
+        <w:t>De mötte sin första häxa vid en bred trappa. Hon bar en mörk rock med långa ärmar och hade något som liknade en bunt tunna stavar under armen. När hon fick syn på Myr saktade hon in. Hennes blick gick från hans ansikte till Sonya och sedan tillbaka till honom, som om hon behövde bekräfta det hon redan förstått.</w:t>
+      </w:r>
+    </w:p>
+    <w:p>
+      <w:r>
+        <w:t>”Är det där verkligen en människa?” frågade hon.</w:t>
+      </w:r>
+    </w:p>
+    <w:p>
+      <w:r>
+        <w:t>”Ja”, svarade Sonya.</w:t>
+      </w:r>
+    </w:p>
+    <w:p>
+      <w:r>
+        <w:t>Häxan såg på Myr ytterligare några sekunder. Det verkade som om hon ville fråga något mer, men hon nöjde sig med att nicka kort innan hon fortsatte nerför trappan. Hon vände sig om en gång till innan hon försvann runt ett hörn.</w:t>
+      </w:r>
+    </w:p>
+    <w:p>
+      <w:r>
+        <w:t>Myr följde henne med blicken. Han visste redan att han var den första människan som någonsin kommit till den här världen, men det var något annat att se hur den kunskapen märktes hos dem som mötte honom.</w:t>
+      </w:r>
+    </w:p>
+    <w:p>
+      <w:r>
+        <w:lastRenderedPageBreak/>
+        <w:t>Lite längre fram passerade de två trollkarlar som stod vid en öppning i väggen och diskuterade något som Myr inte kunde höra. Den ena tystnade mitt i en mening när han upptäckte honom. Den andra följde hans blick och blev lika tyst. De betraktade Myr några sekunder innan den ena till slut sade något lågt till den andra. Sedan fortsatte de samtalet, även om båda sneglade efter honom när han passerade.</w:t>
+      </w:r>
+    </w:p>
+    <w:p>
+      <w:r>
+        <w:t>Efter ytterligare några möten började Myr märka ett mönster. Några nöjde sig med att kasta en extra blick på honom. Andra vände sig om när han hade gått förbi. Ingen verkade fientlig, men det var uppenbart att hans närvaro väckte en nyfikenhet som de inte alltid lyckades dölja.</w:t>
+      </w:r>
+    </w:p>
+    <w:p>
+      <w:r>
+        <w:t>Ju längre de gick, desto mer började han lägga märke till hur mycket plats det fanns omkring dem. Breda korridorer sträckte sig mellan stora salar. Trappor försvann uppåt och nedåt, och genom öppna valv kunde han se ytterligare gårdar och byggnadsdelar. Ändå mötte de bara enstaka personer åt gången.</w:t>
+      </w:r>
+    </w:p>
+    <w:p>
+      <w:r>
+        <w:t>Han hade föreställt sig att en skola av den här storleken skulle vara full av elever och lärare. I stället kändes det som om de rörde sig genom en plats som var byggd för betydligt fler än dem som faktiskt använde den.</w:t>
+      </w:r>
+    </w:p>
+    <w:p>
+      <w:r>
+        <w:t>Myr såg på Sonya, som gick framför honom utan att verka lägga märke till hur glest det var mellan människorna de mötte.</w:t>
+      </w:r>
+    </w:p>
+    <w:p>
+      <w:r>
+        <w:t>”Hur många går egentligen här?” frågade han.</w:t>
+      </w:r>
+    </w:p>
+    <w:p>
+      <w:r>
+        <w:t>Sonya kastade en blick över axeln.</w:t>
+      </w:r>
+    </w:p>
+    <w:p>
+      <w:r>
+        <w:t>”Jag vet faktiskt inte riktigt”, svarade hon. ”Det är fler än man kanske tror, men jag har aldrig försökt räkna dem.”</w:t>
+      </w:r>
+    </w:p>
+    <w:p>
+      <w:r>
+        <w:t>Myr såg sig omkring igen. De breda korridorerna sträckte sig mellan stora salar, och trappor försvann uppåt och nedåt. Genom öppna valv kunde han skymta ytterligare gårdar och byggnadsdelar, men nästan ingenstans såg han mer än någon enstaka person.</w:t>
+      </w:r>
+    </w:p>
+    <w:p>
+      <w:r>
+        <w:t>”Det känns som om det borde vara fler”, sade han.</w:t>
+      </w:r>
+    </w:p>
+    <w:p>
+      <w:r>
+        <w:t>”Akademin är stor”, svarade Sonya. ”Du har inte sett särskilt mycket av den än.”</w:t>
+      </w:r>
+    </w:p>
+    <w:p>
+      <w:r>
+        <w:t>Det var inget riktigt svar på hans fråga, men Myr kunde inte avgöra om det berodde på att Sonya själv inte visste eller om det fanns mer hon inte berättade. Han lät frågan vila och följde efter henne när hon vek av in i en ny korridor.</w:t>
+      </w:r>
+    </w:p>
+    <w:p>
+      <w:r>
+        <w:t>Sonya fortsatte genom korridoren och Myr följde efter. Efter en stund öppnade sig gången mot en hög port som stod på glänt. Bakom den kunde han skymta ett stort rum med högt tak och långa fönster som släppte in ljus från bergssidan.</w:t>
+      </w:r>
+    </w:p>
+    <w:p>
+      <w:r>
+        <w:t>”Vi börjar här”, sade Sonya och gick in.</w:t>
+      </w:r>
+    </w:p>
+    <w:p>
+      <w:r>
+        <w:lastRenderedPageBreak/>
+        <w:t>Myr stannade nästan omedelbart innanför dörren. Stora salen var betydligt större än han hade väntat sig. Långa bord sträckte sig över golvet, med gott om plats mellan dem och tillräckligt många sittplatser för att rymma långt fler människor än han hittills hade sett på akademin. Högt ovanför borden löpte balkonger längs väggarna, sammanbundna av smala gångar. Längst bort reste sig en bred, upphöjd del av golvet, nådd via flera trappsteg. Myr kunde inte avgöra vad den användes till, men den verkade vara placerad så att alla i salen skulle kunna se dit.</w:t>
+      </w:r>
+    </w:p>
+    <w:p>
+      <w:r>
+        <w:t>”Är det här alla samlas?” frågade han.</w:t>
+      </w:r>
+    </w:p>
+    <w:p>
+      <w:r>
+        <w:t>”När det behövs. Vissa tillfällen kräver mer plats än andra.”</w:t>
+      </w:r>
+    </w:p>
+    <w:p>
+      <w:r>
+        <w:t>Han gick några steg längre in och såg upp mot taket. Höga valv sträckte sig över rummet, och de mörka ytorna fortsatte från väggarna utan några tydliga skarvar. Det var svårt att se hur konstruktionen hölls uppe. Han hade aldrig sett en byggnad där så stora ytor tycktes sitta ihop så sömlöst.</w:t>
+      </w:r>
+    </w:p>
+    <w:p>
+      <w:r>
+        <w:t>”Hur många får plats här?”</w:t>
+      </w:r>
+    </w:p>
+    <w:p>
+      <w:r>
+        <w:t>”Fler än du tror”, svarade Sonya.</w:t>
+      </w:r>
+    </w:p>
+    <w:p>
+      <w:r>
+        <w:t>Myr sneglade på henne, men hon verkade inte ha för avsikt att utveckla svaret. Han lät blicken vandra en sista gång över salen innan han följde med henne ut.</w:t>
+      </w:r>
+    </w:p>
+    <w:p>
+      <w:r>
+        <w:t>Nästa rum var ett klassrum. Det stod tomt, och deras steg ekade svagt när de gick in. Bord och sittplatser stod ordnade i rader framför en bred yta längst fram. Myr kände inte igen något som liknade en vanlig skoltavla. I stället var en del av väggen slät och nästan blank, med en svag glans som förändrades när han rörde sig genom rummet. På ett sidobord låg några mindre föremål som han inte kunde identifiera.</w:t>
+      </w:r>
+    </w:p>
+    <w:p>
+      <w:r>
+        <w:t>”Är det här ni lär er magi?” frågade han.</w:t>
+      </w:r>
+    </w:p>
+    <w:p>
+      <w:r>
+        <w:t>”Bland annat. Alla lektioner hålls inte i samma sorts rum.”</w:t>
+      </w:r>
+    </w:p>
+    <w:p>
+      <w:r>
+        <w:t>Myr gick fram till ett av borden och lade handen mot kanten. Ytan var fast och sval, men kändes varken riktigt som trä eller sten. Han drog fingertopparna längs den och försökte avgöra vad den kunde vara gjord av.</w:t>
+      </w:r>
+    </w:p>
+    <w:p>
+      <w:r>
+        <w:t>”Vad är det där?” frågade han och pekade mot väggen längst fram.</w:t>
+      </w:r>
+    </w:p>
+    <w:p>
+      <w:r>
+        <w:t>Sonya följde hans blick.</w:t>
+      </w:r>
+    </w:p>
+    <w:p>
+      <w:r>
+        <w:t>”Det beror på vad som ska användas under lektionen. Ibland behöver man en yta att arbeta mot, ibland något annat.”</w:t>
+      </w:r>
+    </w:p>
+    <w:p>
+      <w:r>
+        <w:t>Myr tittade på väggen igen. Svaret gjorde honom inte mycket klokare, men han började ana att han skulle behöva vänja sig vid att inte förstå allt på en gång. Om han ställde en fråga om varje sak som verkade märklig skulle rundturen knappast komma särskilt långt.</w:t>
+      </w:r>
+    </w:p>
+    <w:p>
+      <w:r>
+        <w:lastRenderedPageBreak/>
+        <w:t>De fortsatte till biblioteket. Redan vid ingången märkte Myr hur annorlunda det kändes jämfört med de andra rummen. Hyllor sträckte sig högt längs väggarna och fortsatte upp över flera nivåer, förbundna med gångar och trappor. Böckerna varierade kraftigt i storlek och form. Vissa var smala och höga, andra så tjocka att de såg ut att vara mer lämpade för ett bord än för en hylla. Några hade mörka, släta omslag, medan andra bar mönster som löpte över ryggarna.</w:t>
+      </w:r>
+    </w:p>
+    <w:p>
+      <w:r>
+        <w:t>Längre in stod bord och mindre sittplatser utspridda mellan hyllorna. Några personer satt försjunkna i sitt arbete, till synes obekymrade om att Myr och Sonya hade kommit in.</w:t>
+      </w:r>
+    </w:p>
+    <w:p>
+      <w:r>
+        <w:t>Myr sänkte automatiskt rösten.</w:t>
+      </w:r>
+    </w:p>
+    <w:p>
+      <w:r>
+        <w:t>”Har ni böcker om allt?”</w:t>
+      </w:r>
+    </w:p>
+    <w:p>
+      <w:r>
+        <w:t>”Nej”, sade Sonya. ”Men om du letar efter något särskilt är det här ett bra ställe att börja på.”</w:t>
+      </w:r>
+    </w:p>
+    <w:p>
+      <w:r>
+        <w:t>Han såg upp längs hyllorna. Det måste finnas tusentals böcker här, kanske ännu fler. Bara att hitta en enda bok bland alla dessa verkade kunna ta lång tid, och han hade ingen aning om var han ens skulle börja. Samtidigt väcktes en tanke som fick honom att vilja stanna kvar betydligt längre än rundturen tillät: någonstans här inne kanske det fanns svar på sådant som ingen ännu hade berättat för honom.</w:t>
+      </w:r>
+    </w:p>
+    <w:p>
+      <w:r>
+        <w:t>Myr lät blicken vila på bokhyllorna en sista gång innan Sonya började gå mot utgången. Han följde efter henne genom biblioteket och ut i korridoren, där de snart kom fram till en bred öppning mot den inre gården.</w:t>
+      </w:r>
+    </w:p>
+    <w:p>
+      <w:r>
+        <w:t>Ljuset föll över stenläggningen och de omgivande byggnaderna. Sonya tog vägen längs utsidan av klassrummen, där höga fönster löpte i jämna rader längs väggen. På andra sidan gården kunde Myr se det väldiga trädet resa sig över taken. De lila blomkronorna bredde ut sig över akademin, och vattnet som strömmade från grenarna föll ner över klipporna i långa, skimrande vattenfall.</w:t>
+      </w:r>
+    </w:p>
+    <w:p>
+      <w:r>
+        <w:t>Han hann kasta flera blickar mot trädet medan de gick. Det var svårt att vänja sig vid att något så stort kunde finnas så nära en byggnad utan att helt överskugga den. Ju längre de kom längs gården, desto tydligare blev det hur grenarna sträckte sig över olika delar av akademin.</w:t>
+      </w:r>
+    </w:p>
+    <w:p>
+      <w:r>
+        <w:t>När de nästan var framme vid trädet vek Sonya av mot ett par breda trappor som ledde ner från den inre gården. Trapporna sträckte sig ut från akademin mot en lägre bergsplatå. På flera ställen gick de över smala klyftor i berget, där trappstegen vilade på kraftiga valv och brospann.</w:t>
+      </w:r>
+    </w:p>
+    <w:p>
+      <w:r>
+        <w:t xml:space="preserve">Myr stannade till vid början av trappan. Under den första övergången forsade vatten genom en klyfta, så nära att han kunde se strömmarna slå mot klippväggarna innan de </w:t>
+      </w:r>
+      <w:r>
+        <w:lastRenderedPageBreak/>
+        <w:t>försvann ner i dimman. Vattnet fortsatte under stenvalven och dök upp igen längre bort som ett av de många vattenfallen längs bergssidan.</w:t>
+      </w:r>
+    </w:p>
+    <w:p>
+      <w:r>
+        <w:t>”Det forsande vattnet är väldigt rofyllande”, konstaterade han.</w:t>
+      </w:r>
+    </w:p>
+    <w:p>
+      <w:r>
+        <w:t>”Ja”, sade Sonya. ”Jag har inte tänkt på det så förut, men jag håller nog med.”</w:t>
+      </w:r>
+    </w:p>
+    <w:p>
+      <w:r>
+        <w:t>Hon fortsatte nerför trappan, och Myr följde efter. De passerade ännu en klyfta där vattnet strömmade under dem. Här var bron smalare, och mellan stenarna kunde han se hur vattnet kastade sig över en lägre kant innan det försvann ur sikte. Ljudet steg upp runt dem och blandades med suset från trädkronorna ovanför.</w:t>
+      </w:r>
+    </w:p>
+    <w:p>
+      <w:r>
+        <w:t>Det var märkligt att gå så nära vattenfallen utan att befinna sig på själva bergssidan. Trapporna ledde nästan rakt ut från den inre gården, och varje brospann förde dem vidare mot den lägre platån. Ett femtiotal trappsteg skilde nivåerna åt, men vägen kändes mer som en sammanhängande förbindelse mellan olika delar av akademin än som en nedstigning längs berget.</w:t>
+      </w:r>
+    </w:p>
+    <w:p>
+      <w:r>
+        <w:t>När de till sist nådde den nedre platån bredde berggrunden ut sig under byggnaderna. Växthusen och forskningssalarna låg samlade här, avskilda från huvudbyggnaden men fortfarande förbundna med den genom trapporna och broarna. Vattnet fortsatte att forsa under dem och vidare genom klyftorna, på väg mot fallen nedanför.</w:t>
+      </w:r>
+    </w:p>
+    <w:p>
+      <w:r>
+        <w:t>Sonya pekade mot en av byggnaderna med genomskinliga väggar.</w:t>
+      </w:r>
+    </w:p>
+    <w:p>
+      <w:r>
+        <w:t>”Där börjar vi.”</w:t>
+      </w:r>
+    </w:p>
+    <w:p>
+      <w:r>
+        <w:t>Sonya öppnade dörren och gick in. Myr följde efter och stannade strax innanför tröskeln för att se sig omkring.</w:t>
+      </w:r>
+    </w:p>
+    <w:p>
+      <w:r>
+        <w:t>Rummet var större än han först hade trott. Ljuset föll in genom de genomskinliga väggarna och fick det att kännas som om de befann sig utomhus, trots att de stod under tak. Längre in stod flera bord med krukor, glasbehållare och olika redskap. Några av borden var täckta av jord och växter, medan andra hade släta ytor där små föremål låg ordnade i grupper. Bakom en rad höga växter syntes ytterligare en del av byggnaden, där taket höjde sig över ett område fyllt av gröna blad.</w:t>
+      </w:r>
+    </w:p>
+    <w:p>
+      <w:r>
+        <w:t>Det luktade fuktig jord och något sött som Myr inte riktigt kunde placera. Han tog några steg in, försiktigt för att inte stöta till något.</w:t>
+      </w:r>
+    </w:p>
+    <w:p>
+      <w:r>
+        <w:t>”Vad är det här för ställe egentligen?” frågade han.</w:t>
+      </w:r>
+    </w:p>
+    <w:p>
+      <w:r>
+        <w:t>”Växthusen och forskningssalarna”, svarade Sonya. ”Här odlar de sådant som behöver särskilda förhållanden, och här undersöker de växter och andra saker som finns i världen. En del av det som växer här finns inte någon annanstans.”</w:t>
+      </w:r>
+    </w:p>
+    <w:p>
+      <w:r>
+        <w:lastRenderedPageBreak/>
+        <w:t>Myr lät blicken vandra över borden. I en av glasbehållarna växte en smal stjälk som delade sig i flera grenar, men i stället för vanliga blad bar den små genomskinliga kulor. Inuti kulorna rörde sig ljusa strimmor, nästan som om något glödde långt där inne.</w:t>
+      </w:r>
+    </w:p>
+    <w:p>
+      <w:r>
+        <w:t>”Vad är det där?”</w:t>
+      </w:r>
+    </w:p>
+    <w:p>
+      <w:r>
+        <w:t>Sonya följde hans blick.</w:t>
+      </w:r>
+    </w:p>
+    <w:p>
+      <w:r>
+        <w:t>”Jag vet faktiskt inte. Det är nog bäst att fråga någon som arbetar här.”</w:t>
+      </w:r>
+    </w:p>
+    <w:p>
+      <w:r>
+        <w:t>Myr såg sig omkring igen. Han hade föreställt sig att en akademi mest skulle bestå av klassrum, böcker och lärare som stod framför tavlor. Här verkade det finnas lika mycket att upptäcka utanför lektionerna som under dem. Samtidigt var det svårt att veta vad han fick röra vid och vad han borde låta vara.</w:t>
+      </w:r>
+    </w:p>
+    <w:p>
+      <w:r>
+        <w:t>”Får man gå runt här själv?” frågade han.</w:t>
+      </w:r>
+    </w:p>
+    <w:p>
+      <w:r>
+        <w:t>”På vissa ställen, ja. Men inte överallt. En del försök kan vara farliga, och vissa saker behöver vara precis som de är medan de undersöks.” Sonya gav honom en blick som gjorde det tydligt att hon inte tänkte låta honom börja peta på allt han såg. ”Så det är nog klokt att fråga innan du testar något.”</w:t>
+      </w:r>
+    </w:p>
+    <w:p>
+      <w:r>
+        <w:t>”Jag tänkte inte testa något.”</w:t>
+      </w:r>
+    </w:p>
+    <w:p>
+      <w:r>
+        <w:t>”Nej, förstås.”</w:t>
+      </w:r>
+    </w:p>
+    <w:p>
+      <w:r>
+        <w:t>Hon log lite och fortsatte längre in mellan borden. Myr följde efter, den här gången med händerna nära kroppen. Han ville gärna veta mer om allt han såg, men han hade ingen lust att råka förstöra något under sin första rundtur.</w:t>
+      </w:r>
+    </w:p>
+    <w:p>
+      <w:r>
+        <w:t>De passerade ett område där växterna växte i långa rader. Några var låga och bredbladiga, andra sträckte sig nästan upp till taket. Vid en av väggarna stod flera stora kärl med vatten, och tunna rör ledde därifrån till bäddarna. Myr kunde inte avgöra om det var vanliga bevattningssystem eller om de fyllde någon annan funktion.</w:t>
+      </w:r>
+    </w:p>
+    <w:p>
+      <w:r>
+        <w:t>”Är det mest växter ni undersöker här?” frågade han.</w:t>
+      </w:r>
+    </w:p>
+    <w:p>
+      <w:r>
+        <w:t>”Det är en stor del av det. Men forskningssalarna används till annat också. Allt får inte plats i ett växthus, och allt som behöver undersökas växer inte i jord.”</w:t>
+      </w:r>
+    </w:p>
+    <w:p>
+      <w:r>
+        <w:t>Myr nickade, även om svaret väckte fler frågor än det besvarade. Han försökte välja en av dem, men innan han hann säga något stannade Sonya vid en öppning som ledde vidare till nästa del av byggnaden.</w:t>
+      </w:r>
+    </w:p>
+    <w:p>
+      <w:r>
+        <w:t>”Vi behöver inte se precis allting i dag”, sade hon. ”Annars kommer vi aldrig hinna tillbaka till de andra.”</w:t>
+      </w:r>
+    </w:p>
+    <w:p>
+      <w:r>
+        <w:lastRenderedPageBreak/>
+        <w:t>Myr kastade en sista blick mot de genomskinliga kulorna i glasbehållaren. Han ville veta vad som rörde sig där inne, men han lät frågan stanna hos sig själv och följde med Sonya vidare.</w:t>
+      </w:r>
+    </w:p>
+    <w:p>
+      <w:r>
+        <w:t>När de kom ut från växthusen igen slog ljudet från vattenfallen emot dem på nytt. Myr märkte hur lugnet inom honom växte när han hörde vattnet forsa genom klyftorna. Det var märkligt, med tanke på hur mycket han hade upplevt sedan de lämnade hans gamla värld. Gårdagen hade varit utmattande, och huvudvärken hade varit så kraftig att han knappt orkat tänka klart. Ändå hade migränen inte kommit tillbaka den här morgonen.</w:t>
+      </w:r>
+    </w:p>
+    <w:p>
+      <w:r>
+        <w:t>Han hade väntat sig att den skulle återvända så snart han började röra på sig och ta in alla nya intryck. Men ju längre de hade färdats, desto bättre hade han mått. Nu, när han lyssnade till vattnet, kände han sig nästan oväntat avslappnad. Kanske var det bara för att han äntligen hade fått vila. Eller så hade ljudet något med saken att göra. Han kunde inte veta, men han ville gärna stanna kvar i känslan en stund.</w:t>
+      </w:r>
+    </w:p>
+    <w:p>
+      <w:r>
+        <w:t>Sonya hade redan börjat gå mot huvudbyggnaden, så Myr skyndade efter. De korsade den inre gården och gick in genom öppningen i fasaden. Där inne dämpades vattenljudet, men det försvann inte helt. Det låg kvar som ett avlägset brus bakom de andra ljuden i byggnaden.</w:t>
+      </w:r>
+    </w:p>
+    <w:p>
+      <w:r>
+        <w:t>De tog trappan upp till matsalen och sällskapsutrymmena. Här var det öppnare än i korridorerna de passerat tidigare. Bord och sittplatser stod utspridda i olika grupper, och längre in fanns mindre avskilda utrymmen där man kunde slå sig ner utan att behöva sitta mitt bland alla andra. Några personer satt och pratade, medan andra verkade ha samlats kring något de höll på med. När Myr och Sonya kom in vände sig flera av dem om. Någon stannade mitt i en mening, och en annan följde Myr med blicken tills han passerat.</w:t>
+      </w:r>
+    </w:p>
+    <w:p>
+      <w:r>
+        <w:t>Han hade börjat vänja sig vid reaktionerna, men det var fortfarande svårt att inte lägga märke till dem. Det var uppenbart att hans närvaro väckte frågor, även om ingen kom fram och ställde dem.</w:t>
+      </w:r>
+    </w:p>
+    <w:p>
+      <w:r>
+        <w:t>”Är det här ni brukar äta?” frågade han.</w:t>
+      </w:r>
+    </w:p>
+    <w:p>
+      <w:r>
+        <w:t>”Ja, matsalen ligger här. Utrymmena runt omkring används mest när man vill umgås eller bara ha någonstans att vara mellan lektionerna.”</w:t>
+      </w:r>
+    </w:p>
+    <w:p>
+      <w:r>
+        <w:t>Myr såg sig omkring. Det påminde honom lite om gemensamma utrymmen på hans gamla skola, men här fanns ingen tydlig gräns mellan matsal och sällskapsrum. Allt flöt samman till en större plats där människor kunde välja var de ville sitta och vad de ville göra.</w:t>
+      </w:r>
+    </w:p>
+    <w:p>
+      <w:r>
+        <w:t>”Brukar det vara så här lugnt?” frågade han.</w:t>
+      </w:r>
+    </w:p>
+    <w:p>
+      <w:r>
+        <w:t>Sonya följde hans blick mot de andra.</w:t>
+      </w:r>
+    </w:p>
+    <w:p>
+      <w:r>
+        <w:lastRenderedPageBreak/>
+        <w:t>”Det varierar. Alla är inte här samtidigt, och en del har annat att göra.”</w:t>
+      </w:r>
+    </w:p>
+    <w:p>
+      <w:r>
+        <w:t>Myr undrade hur många som egentligen brukade vistas på akademin. Byggnaden var stor, och även om han bara hade sett en del av den hade han svårt att föreställa sig att de människor han mött hittills utgjorde särskilt många.</w:t>
+      </w:r>
+    </w:p>
+    <w:p>
+      <w:r>
+        <w:t>”Hur många är ni här egentligen?”</w:t>
+      </w:r>
+    </w:p>
+    <w:p>
+      <w:r>
+        <w:t>Sonya funderade en stund innan hon svarade.</w:t>
+      </w:r>
+    </w:p>
+    <w:p>
+      <w:r>
+        <w:t>”Jag är faktiskt inte riktigt säker. Det är fler än man kanske tror, men jag har aldrig försökt räkna dem.”</w:t>
+      </w:r>
+    </w:p>
+    <w:p>
+      <w:r>
+        <w:t>”Det känns som att det borde vara fler.”</w:t>
+      </w:r>
+    </w:p>
+    <w:p>
+      <w:r>
+        <w:t>”Akademin är stor”, sade hon. ”Du har inte sett särskilt mycket av den än.”</w:t>
+      </w:r>
+    </w:p>
+    <w:p>
+      <w:r>
+        <w:t>Myr lät blicken vandra över rummet en gång till. Det var svårt att avgöra om det var byggnadens storlek som gav honom den känslan eller om han helt enkelt ännu inte hade förstått hur livet på akademin fungerade. Han frågade inte mer, utan följde med Sonya när hon fortsatte mot trappan.</w:t>
+      </w:r>
+    </w:p>
+    <w:p>
+      <w:r>
+        <w:t>De gick upp ytterligare en våning, till den del där lärarna hade sina rum och kontor. Här var det tystare. Dörrar låg längs korridoren, och bakom några av dem hördes röster eller ljudet av något som flyttades över ett bord. Sonya visade honom inte varje rum, utan pekade bara ut området medan de gick förbi.</w:t>
+      </w:r>
+    </w:p>
+    <w:p>
+      <w:r>
+        <w:t>”Det är här lärarna brukar arbeta när de inte undervisar”, förklarade hon. ”De har sina egna rum, och några av kontoren används också för möten.”</w:t>
+      </w:r>
+    </w:p>
+    <w:p>
+      <w:r>
+        <w:t>Myr kastade en blick in genom en öppen dörr. Rummet innanför var fullt av böcker och papper, och på ett stort bord låg flera föremål som han inte kände igen. Han hann inte se mer innan de hade passerat.</w:t>
+      </w:r>
+    </w:p>
+    <w:p>
+      <w:r>
+        <w:t>”Kan man gå hit om man behöver fråga en lärare något?”</w:t>
+      </w:r>
+    </w:p>
+    <w:p>
+      <w:r>
+        <w:t>”Självklart. Om de har tid brukar det gå bra. Annars får man komma tillbaka senare.”</w:t>
+      </w:r>
+    </w:p>
+    <w:p>
+      <w:r>
+        <w:t>Det verkade rimligt. Myr hade fortfarande svårt att föreställa sig hur undervisningen skulle fungera här, men det skulle han förmodligen få reda på när det väl blev dags.</w:t>
+      </w:r>
+    </w:p>
+    <w:p>
+      <w:r>
+        <w:t>De fortsatte till en utgång på andra sidan byggnaden. Utanför ledde en bro över en djup klyfta mellan bergets olika delar. Vattnet forsade långt nedanför, och dimman från fallen drev upp längs klippväggarna. Myr stannade till ett ögonblick. Även här hördes det välbekanta bruset, och han kände hur lugnet återvände så snart han lät uppmärksamheten vila på det.</w:t>
+      </w:r>
+    </w:p>
+    <w:p>
+      <w:r>
+        <w:lastRenderedPageBreak/>
+        <w:t>Han följde efter Sonya över bron. På andra sidan låg en öppen platå med en stenlagd yta i mitten. Några personer passerade över torget, men Sonya gick vidare utan att stanna. De skulle bara tvärs över det för att komma till arenaplattformen på andra sidan.</w:t>
+      </w:r>
+    </w:p>
+    <w:p>
+      <w:r>
+        <w:t xml:space="preserve">Plattformen låg öppen mot berget, med gott om utrymme för människor att röra sig. När de närmade sig fick Myr syn på </w:t>
+      </w:r>
+      <w:proofErr w:type="spellStart"/>
+      <w:r>
+        <w:t>Elarion</w:t>
+      </w:r>
+      <w:proofErr w:type="spellEnd"/>
+      <w:r>
+        <w:t xml:space="preserve"> och Lyra. De stod en bit bort och pratade, men </w:t>
+      </w:r>
+      <w:proofErr w:type="spellStart"/>
+      <w:r>
+        <w:t>Elarion</w:t>
+      </w:r>
+      <w:proofErr w:type="spellEnd"/>
+      <w:r>
+        <w:t xml:space="preserve"> upptäckte dem och vände sig mot dem.</w:t>
+      </w:r>
+    </w:p>
+    <w:p>
+      <w:r>
+        <w:t>”Där är ni ju”, sade han. ”Har ni hunnit se något av akademin?”</w:t>
+      </w:r>
+    </w:p>
+    <w:p>
+      <w:r>
+        <w:t>”En del”, svarade Sonya. ”Men det finns fortfarande mycket kvar.”</w:t>
+      </w:r>
+    </w:p>
+    <w:p>
+      <w:proofErr w:type="spellStart"/>
+      <w:r>
+        <w:t>Elarion</w:t>
+      </w:r>
+      <w:proofErr w:type="spellEnd"/>
+      <w:r>
+        <w:t xml:space="preserve"> nickade och vände sig mot Myr.</w:t>
+      </w:r>
+    </w:p>
+    <w:p>
+      <w:r>
+        <w:t>”Bra. Då ska vi se till att du får en bättre uppfattning om vad som väntar dig här.”</w:t>
+      </w:r>
+    </w:p>
+    <w:p>
+      <w:r>
+        <w:t>Han gjorde en kort paus innan han fortsatte.</w:t>
+      </w:r>
+    </w:p>
+    <w:p>
+      <w:r>
+        <w:t>”Men först behöver vi prata om hur du tänker göra framöver. Vill du stanna här och gå på akademin?”</w:t>
+      </w:r>
+    </w:p>
+    <w:p>
+      <w:r>
+        <w:t xml:space="preserve">Frågan kom så direkt att Myr inte hade väntat sig den. Han såg från </w:t>
+      </w:r>
+      <w:proofErr w:type="spellStart"/>
+      <w:r>
+        <w:t>Elarion</w:t>
+      </w:r>
+      <w:proofErr w:type="spellEnd"/>
+      <w:r>
+        <w:t xml:space="preserve"> till Lyra och sedan tillbaka igen. Sedan de hade kommit till den här världen hade så mycket hänt att han knappt hunnit tänka på vad han själv ville. Akademin hade verkat självklar som nästa steg, men nu när någon faktiskt frågade honom kände han hur stort beslutet var.</w:t>
+      </w:r>
+    </w:p>
+    <w:p>
+      <w:r>
+        <w:t>”Ja”, svarade han efter en stund. ”Jag tror det. Jag vill lära mig mer om den här världen. Och om magi.”</w:t>
+      </w:r>
+    </w:p>
+    <w:p>
+      <w:r>
+        <w:t xml:space="preserve">”Det var ungefär vad jag hoppades att du skulle säga”, sade </w:t>
+      </w:r>
+      <w:proofErr w:type="spellStart"/>
+      <w:r>
+        <w:t>Elarion</w:t>
+      </w:r>
+      <w:proofErr w:type="spellEnd"/>
+      <w:r>
+        <w:t>. ”Men då behöver vi ordna några saker först.”</w:t>
+      </w:r>
+    </w:p>
+    <w:p>
+      <w:r>
+        <w:t>Lyra korsade armarna och kastade en blick mot akademins byggnader.</w:t>
+      </w:r>
+    </w:p>
+    <w:p>
+      <w:r>
+        <w:t xml:space="preserve">”Vi har båda en hel del arbete som inte kan vänta. Vi kan hjälpa dig att komma </w:t>
+      </w:r>
+      <w:proofErr w:type="gramStart"/>
+      <w:r>
+        <w:t>igång</w:t>
+      </w:r>
+      <w:proofErr w:type="gramEnd"/>
+      <w:r>
+        <w:t>, men vi kan inte följa med dig överallt eller se till att du har sällskap varje gång du behöver ta dig någonstans.”</w:t>
+      </w:r>
+    </w:p>
+    <w:p>
+      <w:r>
+        <w:t>Myr nickade långsamt. Han hade inte riktigt tänkt på hur det skulle fungera i praktiken. Han kunde följa med Sonya runt akademin, men det var en annan sak att faktiskt bo här och kunna ta sig mellan olika platser på egen hand.</w:t>
+      </w:r>
+    </w:p>
+    <w:p>
+      <w:r>
+        <w:t>”Var ska jag bo?” frågade han.</w:t>
+      </w:r>
+    </w:p>
+    <w:p>
+      <w:proofErr w:type="spellStart"/>
+      <w:r>
+        <w:t>Elarion</w:t>
+      </w:r>
+      <w:proofErr w:type="spellEnd"/>
+      <w:r>
+        <w:t xml:space="preserve"> såg på Lyra, som i sin tur vände sig mot Sonya. Det blev en kort paus innan Sonya tog till orda.</w:t>
+      </w:r>
+    </w:p>
+    <w:p>
+      <w:r>
+        <w:t>”Han kan bo hos mig ett tag, om han vill.”</w:t>
+      </w:r>
+    </w:p>
+    <w:p>
+      <w:r>
+        <w:lastRenderedPageBreak/>
+        <w:t>Myr tittade förvånat på henne. Hon hade visat honom runt hela förmiddagen, men han hade inte räknat med att hon skulle erbjuda honom att bo hos sig.</w:t>
+      </w:r>
+    </w:p>
+    <w:p>
+      <w:r>
+        <w:t>”Har du plats för mig?”</w:t>
+      </w:r>
+    </w:p>
+    <w:p>
+      <w:r>
+        <w:t xml:space="preserve">”Ja. Min </w:t>
+      </w:r>
+      <w:proofErr w:type="spellStart"/>
+      <w:r>
+        <w:t>Mansor</w:t>
+      </w:r>
+      <w:proofErr w:type="spellEnd"/>
+      <w:r>
+        <w:t xml:space="preserve"> har nyligen genomgått en evolution och blivit en villa. Jag har fler rum än jag behöver just nu, så det borde inte vara något problem.”</w:t>
+      </w:r>
+    </w:p>
+    <w:p>
+      <w:r>
+        <w:t>”En villa?” upprepade Myr. Han mindes de märkliga, flytande husvarelserna de hade sett under resan, men han hade inte förstått att de kunde förändras så mycket under sin livstid.</w:t>
+      </w:r>
+    </w:p>
+    <w:p>
+      <w:r>
+        <w:t>”Det är ett av utvecklingsstadierna”, förklarade Sonya. ”Och efter den senaste förändringen finns det gott om utrymme.”</w:t>
+      </w:r>
+    </w:p>
+    <w:p>
+      <w:proofErr w:type="spellStart"/>
+      <w:r>
+        <w:t>Elarion</w:t>
+      </w:r>
+      <w:proofErr w:type="spellEnd"/>
+      <w:r>
+        <w:t xml:space="preserve"> nickade, som om förslaget löste en fråga han själv hade funderat på.</w:t>
+      </w:r>
+    </w:p>
+    <w:p>
+      <w:r>
+        <w:t>”Det låter som en bra lösning. Myr kan bo hos dig tills han kan klara sig själv.”</w:t>
+      </w:r>
+    </w:p>
+    <w:p>
+      <w:r>
+        <w:t xml:space="preserve">”Det är framför allt transporterna som blir ett problem i början”, sade Lyra. ”Han kan inte ta sig upp till en </w:t>
+      </w:r>
+      <w:proofErr w:type="spellStart"/>
+      <w:r>
+        <w:t>Mansor</w:t>
+      </w:r>
+      <w:proofErr w:type="spellEnd"/>
+      <w:r>
+        <w:t xml:space="preserve"> på egen hand ännu, och vi kan inte alltid avvara tid för att flyga honom dit han behöver.”</w:t>
+      </w:r>
+    </w:p>
+    <w:p>
+      <w:r>
+        <w:t xml:space="preserve">Myr såg på dem. Han hade inte tänkt på att det skulle kunna bli svårt att ens komma hem efter en lektion. </w:t>
+      </w:r>
+      <w:proofErr w:type="spellStart"/>
+      <w:r>
+        <w:t>Mansorerna</w:t>
+      </w:r>
+      <w:proofErr w:type="spellEnd"/>
+      <w:r>
+        <w:t xml:space="preserve"> svävade ovanför marken, och deras tentakler hängde så högt att han inte kunde nå dem utan hjälp. Att lära sig flyga var förstås en möjlighet, men han hade inte ens börjat lära sig magi än.</w:t>
+      </w:r>
+    </w:p>
+    <w:p>
+      <w:r>
+        <w:t>”Så jag skulle bo hos dig tills jag kan ta mig runt själv?” frågade han och vände sig mot Sonya.</w:t>
+      </w:r>
+    </w:p>
+    <w:p>
+      <w:r>
+        <w:t>”Precis. Du behöver inte bestämma hur länge det ska vara redan nu. Vi kan ta det som det kommer.”</w:t>
+      </w:r>
+    </w:p>
+    <w:p>
+      <w:r>
+        <w:t>Myr funderade en stund. Han kände fortfarande Sonya ganska lite, men hon hade varit vänlig mot honom sedan de träffades, och det verkade vara den mest praktiska lösningen. Dessutom skulle han få möjlighet att lära känna henne bättre.</w:t>
+      </w:r>
+    </w:p>
+    <w:p>
+      <w:r>
+        <w:t>”Då gör jag gärna det”, sade han.</w:t>
+      </w:r>
+    </w:p>
+    <w:p>
+      <w:r>
+        <w:t>Sonya log.</w:t>
+      </w:r>
+    </w:p>
+    <w:p>
+      <w:r>
+        <w:t>”Bra. Då är det bestämt.”</w:t>
+      </w:r>
+    </w:p>
+    <w:p>
+      <w:proofErr w:type="spellStart"/>
+      <w:r>
+        <w:t>Elarion</w:t>
+      </w:r>
+      <w:proofErr w:type="spellEnd"/>
+      <w:r>
+        <w:t xml:space="preserve"> verkade nöjd med att frågan var löst. Han såg ut över akademins område och vände sig sedan tillbaka mot Myr.</w:t>
+      </w:r>
+    </w:p>
+    <w:p>
+      <w:r>
+        <w:lastRenderedPageBreak/>
+        <w:t xml:space="preserve">”Då behöver vi också prata om hur du ska börja dina studier. Det finns en del du behöver lära dig innan du kan följa den vanliga undervisningen, men vi ska se till att du kommer </w:t>
+      </w:r>
+      <w:proofErr w:type="gramStart"/>
+      <w:r>
+        <w:t>igång</w:t>
+      </w:r>
+      <w:proofErr w:type="gramEnd"/>
+      <w:r>
+        <w:t>.”</w:t>
+      </w:r>
+    </w:p>
+    <w:p>
+      <w:r>
+        <w:t>Myr kände hur förväntan blandades med nervositet. Han hade velat lära sig magi ända sedan han förstått att den här världen fungerade på helt andra villkor än hans egen. Nu verkade det som om han faktiskt skulle få chansen.</w:t>
+      </w:r>
+    </w:p>
+    <w:p>
+      <w:proofErr w:type="spellStart"/>
+      <w:r>
+        <w:t>Elarion</w:t>
+      </w:r>
+      <w:proofErr w:type="spellEnd"/>
+      <w:r>
+        <w:t xml:space="preserve"> såg ut att fundera på något innan han vände sig mot Myr igen.</w:t>
+      </w:r>
+    </w:p>
+    <w:p>
+      <w:r>
+        <w:t>”Vi träffas i klassrum sju om fyra timmar. Då kan vi gå igenom det viktigaste och prata om hur du ska börja lära dig magi.”</w:t>
+      </w:r>
+    </w:p>
+    <w:p>
+      <w:r>
+        <w:t xml:space="preserve">Myr hann öppna munnen för att fråga något, men </w:t>
+      </w:r>
+      <w:proofErr w:type="spellStart"/>
+      <w:r>
+        <w:t>Elarion</w:t>
+      </w:r>
+      <w:proofErr w:type="spellEnd"/>
+      <w:r>
+        <w:t xml:space="preserve"> fortsatte innan han fick chansen.</w:t>
+      </w:r>
+    </w:p>
+    <w:p>
+      <w:r>
+        <w:t>”Jag tänker att du behöver lite tid att vila först. Du har haft en lång resa bakom dig, och det är ingen idé att försöka pressa in allting på en gång.”</w:t>
+      </w:r>
+    </w:p>
+    <w:p>
+      <w:r>
+        <w:t>Myr kände sig lättad över förslaget. Även om han hade återhämtat sig från huvudvärken var han fortfarande trött, och tanken på att få några timmar utan fler nya intryck tilltalade honom.</w:t>
+      </w:r>
+    </w:p>
+    <w:p>
+      <w:r>
+        <w:t xml:space="preserve">”Var befinner sig din </w:t>
+      </w:r>
+      <w:proofErr w:type="spellStart"/>
+      <w:r>
+        <w:t>Mansor</w:t>
+      </w:r>
+      <w:proofErr w:type="spellEnd"/>
+      <w:r>
+        <w:t>, Sonya?” frågade han. ”Är det långt härifrån?”</w:t>
+      </w:r>
+    </w:p>
+    <w:p>
+      <w:r>
+        <w:t>”Nej, inte särskilt. Den rör sig runt hörnet på berget just nu. Det tar ungefär tjugo minuter att flyga dit med kvast.”</w:t>
+      </w:r>
+    </w:p>
+    <w:p>
+      <w:proofErr w:type="spellStart"/>
+      <w:r>
+        <w:t>Elarion</w:t>
+      </w:r>
+      <w:proofErr w:type="spellEnd"/>
+      <w:r>
+        <w:t xml:space="preserve"> nickade, som om han redan hade tänkt i samma banor.</w:t>
+      </w:r>
+    </w:p>
+    <w:p>
+      <w:r>
+        <w:t>”Då kanske du kan visa Myr var han ska bo. Han får möjlighet att vila lite, och ni hinner äta innan ni kommer tillbaka.”</w:t>
+      </w:r>
+    </w:p>
+    <w:p>
+      <w:r>
+        <w:t>Han tog fram ett paket med mat som han räckte över till Sonya.</w:t>
+      </w:r>
+    </w:p>
+    <w:p>
+      <w:r>
+        <w:t>”Här. Ta med det här så har ni något att äta. Se bara till att ni är tillbaka i god tid till mötet.”</w:t>
+      </w:r>
+    </w:p>
+    <w:p>
+      <w:r>
+        <w:t>Sonya tog emot paketet och höll det under armen.</w:t>
+      </w:r>
+    </w:p>
+    <w:p>
+      <w:r>
+        <w:t>”Det ska vi ordna.”</w:t>
+      </w:r>
+    </w:p>
+    <w:p>
+      <w:r>
+        <w:t>Myr såg mellan dem. Det kändes märkligt att redan ha fått en plats att bo på i en värld där han för bara några dagar sedan inte ens visste att den fanns. Samtidigt var det skönt att åtminstone en del av det som väntade honom började falla på plats.</w:t>
+      </w:r>
+    </w:p>
+    <w:p>
+      <w:r>
+        <w:t xml:space="preserve">”Då ses vi om fyra timmar”, sade </w:t>
+      </w:r>
+      <w:proofErr w:type="spellStart"/>
+      <w:r>
+        <w:t>Elarion</w:t>
+      </w:r>
+      <w:proofErr w:type="spellEnd"/>
+      <w:r>
+        <w:t>.</w:t>
+      </w:r>
+    </w:p>
+    <w:p>
+      <w:r>
+        <w:t>”Vi ses då”, svarade Sonya.</w:t>
+      </w:r>
+    </w:p>
+    <w:p>
+      <w:r>
+        <w:lastRenderedPageBreak/>
+        <w:t xml:space="preserve">Lyra nickade åt dem innan hon följde med </w:t>
+      </w:r>
+      <w:proofErr w:type="spellStart"/>
+      <w:r>
+        <w:t>Elarion</w:t>
+      </w:r>
+      <w:proofErr w:type="spellEnd"/>
+      <w:r>
+        <w:t xml:space="preserve"> bort från plattformen. De började prata med varandra igen nästan genast, och efter några steg försvann de bakom en del av byggnaden.</w:t>
+      </w:r>
+    </w:p>
+    <w:p>
+      <w:r>
+        <w:t>Sonya vände sig mot Myr.</w:t>
+      </w:r>
+    </w:p>
+    <w:p>
+      <w:r>
+        <w:t>”Nå, ska vi gå och se var du ska bo?”</w:t>
+      </w:r>
+    </w:p>
+    <w:p>
+      <w:r>
+        <w:t>Myr nickade. Han var nyfiken på hur ett levande hus såg ut på nära håll, särskilt ett som var tillräckligt stort för att kallas en villa. Och om han skulle bo där ett tag ville han förstås gärna se det med egna ögon.</w:t>
+      </w:r>
+    </w:p>
+    <w:p>
+      <w:r>
+        <w:t>”Ja. Jag vill gärna se det.”</w:t>
+      </w:r>
+    </w:p>
+    <w:p>
+      <w:r>
+        <w:t>”Då hämtar vi kvasten och ger oss av. Det är inte särskilt långt, men det kan vara lite svårt att förstå hur allt hänger ihop härifrån marken.”</w:t>
+      </w:r>
+    </w:p>
+    <w:p>
+      <w:r>
+        <w:t>Hon började gå mot platsen där de hade lämnat kvasten tidigare, och Myr följde efter. För första gången den dagen visste han vad nästa steg skulle bli, och han kunde koncentrera sig på just det.</w:t>
+      </w:r>
+    </w:p>
+    <w:p>
+      <w:r>
+        <w:t>De hämtade kvasten och lämnade akademin bakom sig. Sonya satte sig först och Myr tog plats bakom henne, som han hade gjort under flygresan tidigare på dagen. När de lyfte såg han hur tornen och broarna långsamt försvann bakom bergets utskjutande klippor.</w:t>
+      </w:r>
+    </w:p>
+    <w:p>
+      <w:r>
+        <w:t xml:space="preserve">De flög runt bergssidan, och efter en stund började Sonya peka ut några av de andra </w:t>
+      </w:r>
+      <w:proofErr w:type="spellStart"/>
+      <w:r>
+        <w:t>Mansorerna</w:t>
+      </w:r>
+      <w:proofErr w:type="spellEnd"/>
+      <w:r>
+        <w:t xml:space="preserve"> som svävade längre bort. De rörde sig så långsamt att det var svårt att avgöra deras riktning utan att följa dem en längre stund. Några befann sig nära klippväggarna, medan andra svävade över öppnare delar av landskapet. Myr försökte känna igen formerna från den tidigare resan, men på avstånd var det svårt att avgöra hur stora de egentligen var.</w:t>
+      </w:r>
+    </w:p>
+    <w:p>
+      <w:r>
+        <w:t>Efter ungefär tjugo minuter svängde Sonya runt en utskjutande del av berget. Där, en bit från klippväggen, svävade en stor byggnad med flera våningar och breda fönster. Under den hängde långa, genomskinliga tentakler som följde bergets former utan att vidröra marken.</w:t>
+      </w:r>
+    </w:p>
+    <w:p>
+      <w:r>
+        <w:t>”Där är den”, sade Sonya.</w:t>
+      </w:r>
+    </w:p>
+    <w:p>
+      <w:r>
+        <w:t xml:space="preserve">Myr lutade sig fram för att se bättre. </w:t>
+      </w:r>
+      <w:proofErr w:type="spellStart"/>
+      <w:r>
+        <w:t>Mansoren</w:t>
+      </w:r>
+      <w:proofErr w:type="spellEnd"/>
+      <w:r>
+        <w:t xml:space="preserve"> var betydligt större än de mindre husvarelser han hade sett tidigare. Den hade flera utskjutande delar och en bred överdel som gav den ett utseende som påminde om en villa, även om den inte riktigt såg ut att vara konstruerad på samma sätt som husen i hans gamla värld.</w:t>
+      </w:r>
+    </w:p>
+    <w:p>
+      <w:r>
+        <w:lastRenderedPageBreak/>
+        <w:t>Framför ingången sträckte sig en stor veranda, tillräckligt rymlig för att de skulle kunna landa utan problem. Sonya styrde kvasten dit och saktade in när de närmade sig. Några ögonblick senare satte de ner fötterna på verandans fasta underlag.</w:t>
+      </w:r>
+    </w:p>
+    <w:p>
+      <w:r>
+        <w:t xml:space="preserve">Myr steg av och såg sig omkring. Från den här höjden kunde han se ut över bergssidan, med vattenfallen som föll mellan klipporna längre bort. Under verandan hängde </w:t>
+      </w:r>
+      <w:proofErr w:type="spellStart"/>
+      <w:r>
+        <w:t>Mansorens</w:t>
+      </w:r>
+      <w:proofErr w:type="spellEnd"/>
+      <w:r>
+        <w:t xml:space="preserve"> tentakler fritt i luften. De följde terrängen nedanför utan att röra vid den, och deras genomskinliga ytor fångade ljuset när de rörde sig svagt.</w:t>
+      </w:r>
+    </w:p>
+    <w:p>
+      <w:r>
+        <w:t>Sonya gick fram till dörren och öppnade den.</w:t>
+      </w:r>
+    </w:p>
+    <w:p>
+      <w:r>
+        <w:t>”Välkommen hem till mig”, sade hon innan hon gick in.</w:t>
+      </w:r>
+    </w:p>
+    <w:p>
+      <w:r>
+        <w:t>Myr följde efter.</w:t>
+      </w:r>
+    </w:p>
+    <w:p>
+      <w:r>
+        <w:t xml:space="preserve">Inne i </w:t>
+      </w:r>
+      <w:proofErr w:type="spellStart"/>
+      <w:r>
+        <w:t>Mansoren</w:t>
+      </w:r>
+      <w:proofErr w:type="spellEnd"/>
+      <w:r>
+        <w:t xml:space="preserve"> var det varmt och stilla. Rummen var större än han hade väntat sig, och det fanns gott om plats mellan möblerna. Fönstren släppte in ljus från berget utanför, och genom ett av dem kunde han se vattenfallen på avstånd.</w:t>
+      </w:r>
+    </w:p>
+    <w:p>
+      <w:r>
+        <w:t>”Det finns fler rum än jag behöver, så du får välja var du helst vill sova senare. Vi behöver inte ordna allt i dag.”</w:t>
+      </w:r>
+    </w:p>
+    <w:p>
+      <w:r>
+        <w:t>Myr gick in i rummet och såg sig omkring. Där stod en säng, ett litet bord och en stol. Det var enkelt, men det kändes ändå märkligt att tänka på det som sitt rum. För bara en kort tid sedan hade han inte ens vetat att den här världen fanns. Nu hade han fått en plats att bo på och skulle snart börja lära sig magi.</w:t>
+      </w:r>
+    </w:p>
+    <w:p>
+      <w:r>
+        <w:t xml:space="preserve">Sonya tog fram paketet med mat som </w:t>
+      </w:r>
+      <w:proofErr w:type="spellStart"/>
+      <w:r>
+        <w:t>Elarion</w:t>
+      </w:r>
+      <w:proofErr w:type="spellEnd"/>
+      <w:r>
+        <w:t xml:space="preserve"> hade gett dem.</w:t>
+      </w:r>
+    </w:p>
+    <w:p>
+      <w:r>
+        <w:t>”Vi kan äta innan vi vilar”, sade hon. ”Det är bättre att du får i dig något först.”</w:t>
+      </w:r>
+    </w:p>
+    <w:p>
+      <w:r>
+        <w:t>De satte sig vid ett bord i det större rummet. Maten var enkel men god, och Myr märkte att han var hungrigare än han hade trott. Smakerna var bekanta nog för att kännas behagliga, även om det fanns en svag metallisk ton i eftersmaken. Den var inte stark, bara tillräcklig för att han skulle lägga märke till den när han slutade tänka på själva maten.</w:t>
+      </w:r>
+    </w:p>
+    <w:p>
+      <w:r>
+        <w:t>Han åt vidare medan Sonya berättade lite om hur hon brukade ordna sina dagar. Myr försökte lyssna, men tankarna gled gång på gång tillbaka till mötet senare på eftermiddagen. Om bara några timmar skulle han få börja lära sig magi på riktigt. Han visste fortfarande inte vad det skulle innebära, men föreställningen gjorde honom rastlös av förväntan.</w:t>
+      </w:r>
+    </w:p>
+    <w:p>
+      <w:r>
+        <w:t>När de hade ätit ställde Sonya undan det som blivit över och visade honom var han kunde lägga sig.</w:t>
+      </w:r>
+    </w:p>
+    <w:p>
+      <w:r>
+        <w:t>”Du kan vila en stund här. Vi har gott om tid, men jag väcker dig innan vi behöver ge oss av.”</w:t>
+      </w:r>
+    </w:p>
+    <w:p>
+      <w:r>
+        <w:lastRenderedPageBreak/>
+        <w:t xml:space="preserve">Myr nickade och satte sig på sängkanten. Han tänkte att det skulle bli svårt att somna. Han var för uppspelt, och så fort han blundade började han föreställa sig allt han skulle få lära sig. Hur fungerade magi egentligen? Skulle han kunna göra samma saker som </w:t>
+      </w:r>
+      <w:proofErr w:type="spellStart"/>
+      <w:r>
+        <w:t>Elarion</w:t>
+      </w:r>
+      <w:proofErr w:type="spellEnd"/>
+      <w:r>
+        <w:t>? Och hur lång tid skulle det ta innan han kunde använda den själv?</w:t>
+      </w:r>
+    </w:p>
+    <w:p>
+      <w:r>
+        <w:t xml:space="preserve">Han lade sig ändå ner, mest för att vila kroppen. Först låg han stilla och lyssnade på de svaga ljuden från </w:t>
+      </w:r>
+      <w:proofErr w:type="spellStart"/>
+      <w:r>
+        <w:t>Mansoren</w:t>
+      </w:r>
+      <w:proofErr w:type="spellEnd"/>
+      <w:r>
+        <w:t>. Sedan började tankarna bli långsammare. Han hade inte förstått hur trött han var förrän han slutade försöka hålla sig vaken.</w:t>
+      </w:r>
+    </w:p>
+    <w:p>
+      <w:r>
+        <w:t>När Sonya kom för att väcka honom hade han sovit betydligt längre än han hade tänkt sig.</w:t>
+      </w:r>
+    </w:p>
+    <w:p>
+      <w:r>
+        <w:t>”Myr? Du behöver vakna nu.”</w:t>
+      </w:r>
+    </w:p>
+    <w:p>
+      <w:r>
+        <w:t>Han rörde på sig och öppnade ögonen. Under några sekunder visste han inte riktigt var han befann sig, men sedan kom han ihåg resan, akademin och mötet som väntade.</w:t>
+      </w:r>
+    </w:p>
+    <w:p>
+      <w:r>
+        <w:t>”Hur länge har jag sovit?”</w:t>
+      </w:r>
+    </w:p>
+    <w:p>
+      <w:r>
+        <w:t>”Tillräckligt länge för att vi behöver skynda oss lite”, svarade Sonya. ”Men vi hinner om vi ger oss av snart.”</w:t>
+      </w:r>
+    </w:p>
+    <w:p>
+      <w:r>
+        <w:t>Myr satte sig upp och drog handen genom håret. Tröttheten fanns fortfarande kvar, men tanken på vad som väntade gjorde det lättare att komma upp ur sängen. Han hade nästan glömt hur ivrig han varit innan han lade sig.</w:t>
+      </w:r>
+    </w:p>
+    <w:p>
+      <w:r>
+        <w:t xml:space="preserve">De gjorde sig snabbt i ordning och tog sig ut till kvasten. När de lämnade </w:t>
+      </w:r>
+      <w:proofErr w:type="spellStart"/>
+      <w:r>
+        <w:t>Mansoren</w:t>
+      </w:r>
+      <w:proofErr w:type="spellEnd"/>
+      <w:r>
+        <w:t xml:space="preserve"> hade eftermiddagen hunnit gå långt, och ljuset över bergssidan hade förändrats. De flög tillbaka mot akademin medan skuggorna från tornen sträckte sig över klipporna.</w:t>
+      </w:r>
+    </w:p>
+    <w:p>
+      <w:r>
+        <w:t>Myr kände sig fortfarande sömnig, men under tröttheten hade förväntan börjat vakna igen. Snart skulle han få veta hur hans undervisning skulle börja.</w:t>
+      </w:r>
+    </w:p>
+    <w:p>
+      <w:r>
+        <w:t xml:space="preserve">När de närmade sig akademin hade eftermiddagsljuset förändrats. Solen stod lägre bakom bergen och kastade långa skuggor över klipporna. Myr kände sig fortfarande sömnig efter vilan, men förväntan hade börjat ta över igen. Han försökte föreställa sig hur det skulle gå till när han väl fick lära sig magi. Skulle </w:t>
+      </w:r>
+      <w:proofErr w:type="spellStart"/>
+      <w:r>
+        <w:t>Elarion</w:t>
+      </w:r>
+      <w:proofErr w:type="spellEnd"/>
+      <w:r>
+        <w:t xml:space="preserve"> visa honom något direkt, eller skulle han först behöva lära sig en massa saker som han ännu inte ens visste fanns?</w:t>
+      </w:r>
+    </w:p>
+    <w:p>
+      <w:r>
+        <w:t>Sonya styrde kvasten mot den inre gården och landade där de hade börjat rundturen tidigare under dagen. Myr steg av och sträckte på sig innan han följde med henne in i byggnaden.</w:t>
+      </w:r>
+    </w:p>
+    <w:p>
+      <w:r>
+        <w:t xml:space="preserve">De tog sig genom korridorerna och kom snart fram till klassrummet där de skulle träffa </w:t>
+      </w:r>
+      <w:proofErr w:type="spellStart"/>
+      <w:r>
+        <w:t>Elarion</w:t>
+      </w:r>
+      <w:proofErr w:type="spellEnd"/>
+      <w:r>
+        <w:t xml:space="preserve"> och Lyra. </w:t>
+      </w:r>
+      <w:proofErr w:type="spellStart"/>
+      <w:r>
+        <w:t>Elarion</w:t>
+      </w:r>
+      <w:proofErr w:type="spellEnd"/>
+      <w:r>
+        <w:t xml:space="preserve"> var redan där. Han stod vid ett av borden, medan Lyra satt en bit bort med några föremål framför sig. När de kom in såg </w:t>
+      </w:r>
+      <w:proofErr w:type="spellStart"/>
+      <w:r>
+        <w:t>Elarion</w:t>
+      </w:r>
+      <w:proofErr w:type="spellEnd"/>
+      <w:r>
+        <w:t xml:space="preserve"> upp.</w:t>
+      </w:r>
+    </w:p>
+    <w:p>
+      <w:r>
+        <w:lastRenderedPageBreak/>
+        <w:t>”Där är ni. Jag började undra om ni hade somnat allihop”, sade han.</w:t>
+      </w:r>
+    </w:p>
+    <w:p>
+      <w:r>
+        <w:t>Sonya log svagt.</w:t>
+      </w:r>
+    </w:p>
+    <w:p>
+      <w:r>
+        <w:t>”Myr behövde vila lite. Vi är här nu.”</w:t>
+      </w:r>
+    </w:p>
+    <w:p>
+      <w:r>
+        <w:t>”Bra. Då kan vi börja.”</w:t>
+      </w:r>
+    </w:p>
+    <w:p>
+      <w:r>
+        <w:t>Myr såg sig omkring. Klassrummet var tomt förutom dem, och eftermiddagssolen föll in genom fönstren och lyste upp den främre delen av rummet. Han hade väntat sig att det skulle finnas böcker, anteckningspapper eller kanske någon sorts utrustning framme, men borden var till största delen tomma. Det gjorde honom osäker på vad de egentligen skulle börja med.</w:t>
+      </w:r>
+    </w:p>
+    <w:p>
+      <w:proofErr w:type="spellStart"/>
+      <w:r>
+        <w:t>Elarion</w:t>
+      </w:r>
+      <w:proofErr w:type="spellEnd"/>
+      <w:r>
+        <w:t xml:space="preserve"> verkade märka hans blick.</w:t>
+      </w:r>
+    </w:p>
+    <w:p>
+      <w:r>
+        <w:t>”Innan vi börjar behöver vi prata lite om vad du ska lära dig och i vilken ordning. Du har mycket att ta igen, men vi ska inte försöka göra allt på en gång.”</w:t>
+      </w:r>
+    </w:p>
+    <w:p>
+      <w:r>
+        <w:t>Myr nickade. Han var beredd på att det skulle ta tid, även om han helst hade velat börja med något som kändes mer som riktig magi.</w:t>
+      </w:r>
+    </w:p>
+    <w:p>
+      <w:r>
+        <w:t>”Vad ska jag lära mig först?” frågade han.</w:t>
+      </w:r>
+    </w:p>
+    <w:p>
+      <w:r>
+        <w:t>”Att läsa och skriva.”</w:t>
+      </w:r>
+    </w:p>
+    <w:p>
+      <w:r>
+        <w:t>Myr stirrade på honom ett ögonblick.</w:t>
+      </w:r>
+    </w:p>
+    <w:p>
+      <w:r>
+        <w:t>”Läsa och skriva?”</w:t>
+      </w:r>
+    </w:p>
+    <w:p>
+      <w:r>
+        <w:t>”Ja.”</w:t>
+      </w:r>
+    </w:p>
+    <w:p>
+      <w:r>
+        <w:t>”Men jag kan redan det.”</w:t>
+      </w:r>
+    </w:p>
+    <w:p>
+      <w:proofErr w:type="spellStart"/>
+      <w:r>
+        <w:t>Elarion</w:t>
+      </w:r>
+      <w:proofErr w:type="spellEnd"/>
+      <w:r>
+        <w:t xml:space="preserve"> höjde inte rösten och verkade inte heller förvånad över invändningen.</w:t>
+      </w:r>
+    </w:p>
+    <w:p>
+      <w:r>
+        <w:t>”På ditt språk, ja. Men om du ska kunna studera här behöver du kunna läsa det som används i den här världen och skriva så att andra kan förstå vad du menar.”</w:t>
+      </w:r>
+    </w:p>
+    <w:p>
+      <w:r>
+        <w:t>Myr öppnade munnen för att svara, men stängde den igen. Det var förstås rimligt. Han hade inte tänkt särskilt mycket på hur språket fungerade här. Alla han mött hittills hade talat med honom utan problem, och det hade varit lätt att glömma att det inte betydde att han kunde läsa deras böcker eller skriva till dem.</w:t>
+      </w:r>
+    </w:p>
+    <w:p>
+      <w:r>
+        <w:t>”Hur lång tid tar det?” frågade han.</w:t>
+      </w:r>
+    </w:p>
+    <w:p>
+      <w:r>
+        <w:t>”Det beror på hur du lär dig och hur mycket du övar. Vi börjar med grunderna och ser hur det går.”</w:t>
+      </w:r>
+    </w:p>
+    <w:p>
+      <w:r>
+        <w:t xml:space="preserve">Myr sneglade mot borden igen. Han hade föreställt sig att hans första lektion skulle innebära att han fick lära sig att göra något med energi, kanske något i stil med det han </w:t>
+      </w:r>
+      <w:r>
+        <w:lastRenderedPageBreak/>
+        <w:t xml:space="preserve">sett </w:t>
+      </w:r>
+      <w:proofErr w:type="spellStart"/>
+      <w:r>
+        <w:t>Elarion</w:t>
+      </w:r>
+      <w:proofErr w:type="spellEnd"/>
+      <w:r>
+        <w:t xml:space="preserve"> göra. Att börja med läsning och skrivning kändes inte riktigt som den sorts magiska äventyr han hade sett framför sig.</w:t>
+      </w:r>
+    </w:p>
+    <w:p>
+      <w:r>
+        <w:t>Samtidigt visste han att han inte kunde lära sig särskilt mycket om den här världen om han inte kunde förstå det som stod skrivet här. Om akademins bibliotek innehöll svar på några av hans frågor skulle han förr eller senare behöva kunna läsa böckerna själv.</w:t>
+      </w:r>
+    </w:p>
+    <w:p>
+      <w:r>
+        <w:t>”Okej”, sade han till slut. ”Då börjar vi där.”</w:t>
+      </w:r>
+    </w:p>
+    <w:p>
+      <w:proofErr w:type="spellStart"/>
+      <w:r>
+        <w:t>Elarion</w:t>
+      </w:r>
+      <w:proofErr w:type="spellEnd"/>
+      <w:r>
+        <w:t xml:space="preserve"> nickade och flyttade undan ett av föremålen på bordet framför sig.</w:t>
+      </w:r>
+    </w:p>
+    <w:p>
+      <w:r>
+        <w:t>”Bra. Då ska vi se var vi ska börja.”</w:t>
+      </w:r>
+    </w:p>
+    <w:p>
+      <w:proofErr w:type="spellStart"/>
+      <w:r>
+        <w:t>Elarion</w:t>
+      </w:r>
+      <w:proofErr w:type="spellEnd"/>
+      <w:r>
+        <w:t xml:space="preserve"> böjde sig ner och tog fram en påse som han ställde på bordet framför Myr. Den var tillverkad av ett material som Myr hade svårt att placera. Ytan var matt och hade en svag struktur, men när </w:t>
+      </w:r>
+      <w:proofErr w:type="spellStart"/>
+      <w:r>
+        <w:t>Elarion</w:t>
+      </w:r>
+      <w:proofErr w:type="spellEnd"/>
+      <w:r>
+        <w:t xml:space="preserve"> flyttade påsen över bordet vek den sig mjukt utan att förlora formen. Det såg inte ut som tyg, men inte heller som något slags läder han kände igen.</w:t>
+      </w:r>
+    </w:p>
+    <w:p>
+      <w:r>
+        <w:t xml:space="preserve">”Det här är sådant du kommer att behöva under dina studier”, sade </w:t>
+      </w:r>
+      <w:proofErr w:type="spellStart"/>
+      <w:r>
+        <w:t>Elarion</w:t>
+      </w:r>
+      <w:proofErr w:type="spellEnd"/>
+      <w:r>
+        <w:t>. ”Vi har försökt ordna det viktigaste åt dig.”</w:t>
+      </w:r>
+    </w:p>
+    <w:p>
+      <w:r>
+        <w:t xml:space="preserve">Myr drog påsen närmare och tittade på den från olika håll. Han kunde inte avgöra vad den var gjord av, så till slut öppnade han den i stället. Inuti låg flera föremål som han ännu inte visste vad han skulle använda till. </w:t>
+      </w:r>
+      <w:proofErr w:type="spellStart"/>
+      <w:r>
+        <w:t>Elarion</w:t>
+      </w:r>
+      <w:proofErr w:type="spellEnd"/>
+      <w:r>
+        <w:t xml:space="preserve"> sträckte ner handen och tog upp en bok.</w:t>
+      </w:r>
+    </w:p>
+    <w:p>
+      <w:r>
+        <w:t>”Den här ska du skriva i.”</w:t>
+      </w:r>
+    </w:p>
+    <w:p>
+      <w:r>
+        <w:t>Han räckte över boken till Myr, som tog emot den med båda händerna. Den var inte särskilt stor, men kändes tyngre än han hade väntat sig. Omslaget var slätt på vissa ställen och strävare på andra, som om materialet hade formats efter något som från början varit levande.</w:t>
+      </w:r>
+    </w:p>
+    <w:p>
+      <w:r>
+        <w:t xml:space="preserve">”Vi har också ordnat kläder åt dig”, fortsatte </w:t>
+      </w:r>
+      <w:proofErr w:type="spellStart"/>
+      <w:r>
+        <w:t>Elarion</w:t>
+      </w:r>
+      <w:proofErr w:type="spellEnd"/>
+      <w:r>
+        <w:t>. ”En vän till Sonya har hjälpt till med det. Hon kommer att lämna en koffert på Sonyas veranda innan ni återvänder för kvällen.”</w:t>
+      </w:r>
+    </w:p>
+    <w:p>
+      <w:r>
+        <w:t>Myr nickade och lät boken vila mot bordet medan han försökte föreställa sig hur de hade ordnat allt så snabbt. Han hade inte ens hunnit fundera på vad han skulle behöva för att gå i skolan, men tydligen hade andra redan börjat lösa de praktiska problemen åt honom.</w:t>
+      </w:r>
+    </w:p>
+    <w:p>
+      <w:proofErr w:type="spellStart"/>
+      <w:r>
+        <w:t>Elarion</w:t>
+      </w:r>
+      <w:proofErr w:type="spellEnd"/>
+      <w:r>
+        <w:t xml:space="preserve"> gick till ett skåp längst bak i klassrummet och öppnade det. Efter en kort stunds letande tog han fram ytterligare en bok och kom tillbaka till bordet.</w:t>
+      </w:r>
+    </w:p>
+    <w:p>
+      <w:r>
+        <w:t>”Den här ska du börja med när du lär dig läsa.”</w:t>
+      </w:r>
+    </w:p>
+    <w:p>
+      <w:r>
+        <w:lastRenderedPageBreak/>
+        <w:t>Han lade den framför Myr bredvid den första. Myr betraktade dem båda. De såg inte riktigt ut som böckerna han var van vid. Ryggarna saknade tydliga skarvar, och sidorna hade en märklig yta som fångade ljuset på ett sätt han inte kunde förklara.</w:t>
+      </w:r>
+    </w:p>
+    <w:p>
+      <w:r>
+        <w:t>Han öppnade först boken han skulle skriva i. Sidan under fingrarna kändes både som papper och läder, men var uppenbart ingetdera. Den hade en mjukhet som påminde om papper, samtidigt som ytan gav ett svagt motstånd när han drog fingertoppen över den. Han fick en känsla av att materialet kom från någon sorts växt, men han kunde inte säga varför.</w:t>
+      </w:r>
+    </w:p>
+    <w:p>
+      <w:r>
+        <w:t>Det var något med boken som gjorde honom obekväm. När han höll den framför sig fick han nästan intrycket att den betraktade honom tillbaka, som om den undersökte honom lika noggrant som han undersökte den.</w:t>
+      </w:r>
+    </w:p>
+    <w:p>
+      <w:r>
+        <w:t>Han slog igen den och öppnade den andra.</w:t>
+      </w:r>
+    </w:p>
+    <w:p>
+      <w:r>
+        <w:t>Där fanns text, men inte sådan han kunde läsa. Sidorna var fyllda av linjer som tycktes höra ihop och bilda ett sammanhängande mönster. Ändå kunde han inte urskilja några tydliga tecken eller ens någon bild som han kunde känna igen. Allt verkade flyta in i varandra, som om hans ögon kunde se detaljerna men hjärnan inte förmådde skilja dem åt.</w:t>
+      </w:r>
+    </w:p>
+    <w:p>
+      <w:r>
+        <w:t>Han bläddrade försiktigt till nästa sida. Samma sak där. Sidorna var inte tomma, men innehållet förblev obegripligt.</w:t>
+      </w:r>
+    </w:p>
+    <w:p>
+      <w:r>
+        <w:t>”Vad är det här för material?” frågade han och strök återigen fingret över sidan i den första boken.</w:t>
+      </w:r>
+    </w:p>
+    <w:p>
+      <w:r>
+        <w:t xml:space="preserve">”Det får du kanske reda på så småningom”, svarade </w:t>
+      </w:r>
+      <w:proofErr w:type="spellStart"/>
+      <w:r>
+        <w:t>Elarion</w:t>
+      </w:r>
+      <w:proofErr w:type="spellEnd"/>
+      <w:r>
+        <w:t>. Han sade det utan att göra någon större sak av frågan och pekade sedan mot böckerna. ”Men det viktigaste just nu är hur du ska använda dem.”</w:t>
+      </w:r>
+    </w:p>
+    <w:p>
+      <w:r>
+        <w:t>Myr lade ifrån sig den öppna boken och såg upp.</w:t>
+      </w:r>
+    </w:p>
+    <w:p>
+      <w:r>
+        <w:t xml:space="preserve">”Vi skriver inte med bläck och fjäder”, fortsatte </w:t>
+      </w:r>
+      <w:proofErr w:type="spellStart"/>
+      <w:r>
+        <w:t>Elarion</w:t>
+      </w:r>
+      <w:proofErr w:type="spellEnd"/>
+      <w:r>
+        <w:t>. ”Det var sådant man använde i människornas värld när jag senast var där. Här kommunicerar vi med sidan när vi vill läsa eller skriva något.”</w:t>
+      </w:r>
+    </w:p>
+    <w:p>
+      <w:r>
+        <w:t xml:space="preserve">Myr såg ner på böckerna igen. Han försökte föreställa sig hur man kunde kommunicera med en sida utan att skriva på den, men han hade ingen aning om vad </w:t>
+      </w:r>
+      <w:proofErr w:type="spellStart"/>
+      <w:r>
+        <w:t>Elarion</w:t>
+      </w:r>
+      <w:proofErr w:type="spellEnd"/>
+      <w:r>
+        <w:t xml:space="preserve"> menade.</w:t>
+      </w:r>
+    </w:p>
+    <w:p>
+      <w:proofErr w:type="spellStart"/>
+      <w:r>
+        <w:t>Elarion</w:t>
+      </w:r>
+      <w:proofErr w:type="spellEnd"/>
+      <w:r>
+        <w:t xml:space="preserve"> tog upp ett löst blad från bordet. Det såg ut att vara tillverkat av samma märkliga material som bokens sidor. Han höll upp det framför sig och slöt ögonen.</w:t>
+      </w:r>
+    </w:p>
+    <w:p>
+      <w:r>
+        <w:t>Till en början hände ingenting.</w:t>
+      </w:r>
+    </w:p>
+    <w:p>
+      <w:r>
+        <w:t xml:space="preserve">Myr hann undra om </w:t>
+      </w:r>
+      <w:proofErr w:type="spellStart"/>
+      <w:r>
+        <w:t>Elarion</w:t>
+      </w:r>
+      <w:proofErr w:type="spellEnd"/>
+      <w:r>
+        <w:t xml:space="preserve"> behövde göra något mer, men sedan började tunna linjer framträda på bladet. De växte fram nära den punkt där </w:t>
+      </w:r>
+      <w:proofErr w:type="spellStart"/>
+      <w:r>
+        <w:t>Elarion</w:t>
+      </w:r>
+      <w:proofErr w:type="spellEnd"/>
+      <w:r>
+        <w:t xml:space="preserve"> höll det, för att sedan </w:t>
+      </w:r>
+      <w:r>
+        <w:lastRenderedPageBreak/>
+        <w:t>breda ut sig över ytan. Nya linjer fogades till de första, och snart bildade de ett mönster som såg lika sammanhängande ut som det i läroboken.</w:t>
+      </w:r>
+    </w:p>
+    <w:p>
+      <w:proofErr w:type="spellStart"/>
+      <w:r>
+        <w:t>Elarion</w:t>
+      </w:r>
+      <w:proofErr w:type="spellEnd"/>
+      <w:r>
+        <w:t xml:space="preserve"> stod helt stilla med slutna ögon. Hans hand rörde sig inte över sidan, och han höll inget skrivredskap. Ändå fortsatte linjerna att växa fram, som om de kom från själva platsen där hans fingrar vilade mot bladet.</w:t>
+      </w:r>
+    </w:p>
+    <w:p>
+      <w:r>
+        <w:t xml:space="preserve">Myr lutade sig närmare. Han försökte följa hur mönstret uppstod, men det gick för fort för att han skulle kunna förstå vad som styrde det. När </w:t>
+      </w:r>
+      <w:proofErr w:type="spellStart"/>
+      <w:r>
+        <w:t>Elarion</w:t>
+      </w:r>
+      <w:proofErr w:type="spellEnd"/>
+      <w:r>
+        <w:t xml:space="preserve"> till sist öppnade ögonen var bladet täckt av tecken som Myr fortfarande inte kunde läsa.</w:t>
+      </w:r>
+    </w:p>
+    <w:p>
+      <w:r>
+        <w:t xml:space="preserve">”Så där går det till”, sade </w:t>
+      </w:r>
+      <w:proofErr w:type="spellStart"/>
+      <w:r>
+        <w:t>Elarion</w:t>
+      </w:r>
+      <w:proofErr w:type="spellEnd"/>
+      <w:r>
+        <w:t xml:space="preserve"> och räckte över bladet till honom.</w:t>
+      </w:r>
+    </w:p>
+    <w:p>
+      <w:r>
+        <w:t>Myr tog emot det försiktigt. De tunna linjerna låg kvar på ytan, tydliga och sammanhängande. Han vred bladet en aning, som om en annan vinkel skulle kunna hjälpa honom att förstå vad han såg.</w:t>
+      </w:r>
+    </w:p>
+    <w:p>
+      <w:r>
+        <w:t>”Men hur vet sidan vad du vill skriva?” frågade han.</w:t>
+      </w:r>
+    </w:p>
+    <w:p>
+      <w:proofErr w:type="spellStart"/>
+      <w:r>
+        <w:t>Elarion</w:t>
+      </w:r>
+      <w:proofErr w:type="spellEnd"/>
+      <w:r>
+        <w:t xml:space="preserve"> log svagt.</w:t>
+      </w:r>
+    </w:p>
+    <w:p>
+      <w:r>
+        <w:t>”Det är en del av det du ska lära dig.”</w:t>
+      </w:r>
+    </w:p>
+    <w:p>
+      <w:proofErr w:type="spellStart"/>
+      <w:r>
+        <w:t>Elarion</w:t>
+      </w:r>
+      <w:proofErr w:type="spellEnd"/>
+      <w:r>
+        <w:t xml:space="preserve"> lade den lösa sidan på bordet framför Myr och sköt sedan fram boken han hade fått tidigare.</w:t>
+      </w:r>
+    </w:p>
+    <w:p>
+      <w:r>
+        <w:t>”Vi börjar med att skriva”, sa han. ”Det är den lättaste delen här i vår värld.”</w:t>
+      </w:r>
+    </w:p>
+    <w:p>
+      <w:r>
+        <w:t xml:space="preserve">Myr såg på sidan. De tunna raderna som </w:t>
+      </w:r>
+      <w:proofErr w:type="spellStart"/>
+      <w:r>
+        <w:t>Elarion</w:t>
+      </w:r>
+      <w:proofErr w:type="spellEnd"/>
+      <w:r>
+        <w:t xml:space="preserve"> hade frammanat låg kvar, jämna och prydliga, trots att ingen penna hade rört vid ytan.</w:t>
+      </w:r>
+    </w:p>
+    <w:p>
+      <w:r>
+        <w:t>”Lättare än att läsa?”</w:t>
+      </w:r>
+    </w:p>
+    <w:p>
+      <w:r>
+        <w:t>”För de flesta, ja. Läsningen kräver att du lär dig förstå det som redan finns nedtecknat. När du skriver behöver du framför allt lära dig att styra det som redan sker naturligt.”</w:t>
+      </w:r>
+    </w:p>
+    <w:p>
+      <w:r>
+        <w:t>Myr rynkade pannan. ”Vad menar du med naturligt?”</w:t>
+      </w:r>
+    </w:p>
+    <w:p>
+      <w:proofErr w:type="spellStart"/>
+      <w:r>
+        <w:t>Elarion</w:t>
+      </w:r>
+      <w:proofErr w:type="spellEnd"/>
+      <w:r>
+        <w:t xml:space="preserve"> tog upp sidan och höll den mellan två fingrar.</w:t>
+      </w:r>
+    </w:p>
+    <w:p>
+      <w:r>
+        <w:t>”En sida som den här försöker i vanliga fall hitta ett minne att dokumentera. Den söker efter något i ditt sinne som går att bevara, något som redan har hänt och som du fortfarande bär med dig. Om du inte styr den själv kan den försöka fånga upp ett minne som ligger nära till hands.”</w:t>
+      </w:r>
+    </w:p>
+    <w:p>
+      <w:r>
+        <w:t>”Så den väljer själv vad jag ska skriva?”</w:t>
+      </w:r>
+    </w:p>
+    <w:p>
+      <w:r>
+        <w:t xml:space="preserve">”Den försöker hjälpa dig att skriva. Det är inte riktigt samma sak.” </w:t>
+      </w:r>
+      <w:proofErr w:type="spellStart"/>
+      <w:r>
+        <w:t>Elarion</w:t>
+      </w:r>
+      <w:proofErr w:type="spellEnd"/>
+      <w:r>
+        <w:t xml:space="preserve"> lade tillbaka sidan. ”Du behöver lära dig att fokusera på det minne eller den tanke du själv vill dokumentera. När sidan börjar registrera det du har i huvudet kommer den också att </w:t>
+      </w:r>
+      <w:r>
+        <w:lastRenderedPageBreak/>
+        <w:t>hjälpa dig att stärka bilden av just det minnet eller den tanken. På så sätt blir det lättare att fånga detaljerna och hålla kvar dem medan du skriver.”</w:t>
+      </w:r>
+    </w:p>
+    <w:p>
+      <w:r>
+        <w:t>Myr såg åter på raderna. Han försökte föreställa sig hur det skulle kännas att ha en sida som sökte bland hans minnen. Tanken var märklig nog i sig, men det var framför allt det där med att sidan kunde förstärka en bild som gjorde honom osäker. Han var van vid att minnen dök upp när de ville, inte att han medvetet kunde välja ett och sedan göra det tydligare.</w:t>
+      </w:r>
+    </w:p>
+    <w:p>
+      <w:r>
+        <w:t>”Är det därför du blundade när du skrev nyss?” frågade han.</w:t>
+      </w:r>
+    </w:p>
+    <w:p>
+      <w:r>
+        <w:t>”Det hjälper mig att hålla fokus. Du behöver inte göra likadant, men det kan vara lättare att börja om du slipper bli distraherad av allt omkring dig.”</w:t>
+      </w:r>
+    </w:p>
+    <w:p>
+      <w:proofErr w:type="spellStart"/>
+      <w:r>
+        <w:t>Elarion</w:t>
+      </w:r>
+      <w:proofErr w:type="spellEnd"/>
+      <w:r>
+        <w:t xml:space="preserve"> satte sig på andra sidan bordet och vek ihop händerna.</w:t>
+      </w:r>
+    </w:p>
+    <w:p>
+      <w:r>
+        <w:t>”Det är betydligt lättare att skriva om ett minne än om en tanke. Ett minne finns redan i sin helhet, även om du inte kommer ihåg varenda detalj. Det har en början, ett händelseförlopp och något som har hänt. En tanke är inte alltid färdig. Den kan vara vag, ofullständig eller förändras medan du försöker formulera den. Om du inte vet vad du vill säga kan sidan inte alltid avgöra vilken del av tanken du vill bevara.”</w:t>
+      </w:r>
+    </w:p>
+    <w:p>
+      <w:r>
+        <w:t>”Men om den hjälper mig att göra bilden tydligare, borde den väl kunna hjälpa mig att formulera tanken också?”</w:t>
+      </w:r>
+    </w:p>
+    <w:p>
+      <w:r>
+        <w:t xml:space="preserve">”Till viss del. Men det är skillnad mellan att hjälpa dig hålla fast vid något du redan tänkt och att bestämma vad du egentligen menar.” </w:t>
+      </w:r>
+      <w:proofErr w:type="spellStart"/>
+      <w:r>
+        <w:t>Elarion</w:t>
+      </w:r>
+      <w:proofErr w:type="spellEnd"/>
+      <w:r>
+        <w:t xml:space="preserve"> lät blicken vila på sidan. ”Det senare vill du inte lämna över till den.”</w:t>
+      </w:r>
+    </w:p>
+    <w:p>
+      <w:r>
+        <w:t>Myr nickade långsamt. Han började ana att det fanns en hake med nästan allt i den här världen. Inte nödvändigtvis en farlig hake, men något han behövde förstå innan han kunde använda det utan att göra fel.</w:t>
+      </w:r>
+    </w:p>
+    <w:p>
+      <w:r>
+        <w:t>”Vad händer om jag inte fokuserar på någonting särskilt?”</w:t>
+      </w:r>
+    </w:p>
+    <w:p>
+      <w:r>
+        <w:t>”Då kan sidan välja ett minne som den uppfattar som tydligt eller betydelsefullt. Det behöver inte vara det du själv hade valt.”</w:t>
+      </w:r>
+    </w:p>
+    <w:p>
+      <w:r>
+        <w:t>”Och om jag låter den fortsätta?”</w:t>
+      </w:r>
+    </w:p>
+    <w:p>
+      <w:proofErr w:type="spellStart"/>
+      <w:r>
+        <w:t>Elarion</w:t>
+      </w:r>
+      <w:proofErr w:type="spellEnd"/>
+      <w:r>
+        <w:t xml:space="preserve"> blev allvarligare, men inte sträng.</w:t>
+      </w:r>
+    </w:p>
+    <w:p>
+      <w:r>
+        <w:t>”Då måste du vara försiktig. När du skriver samarbetar du med sidan. Den hjälper dig att hålla kvar minnet eller tanken, men det är fortfarande du som ska styra vad som blir nedtecknat. Om du låter den ta över helt kan du förlora greppet om det du försökte skriva. I värsta fall kan du till och med tappa själva minnet eller tanken.”</w:t>
+      </w:r>
+    </w:p>
+    <w:p>
+      <w:r>
+        <w:t>Myr rätade lite på sig.</w:t>
+      </w:r>
+    </w:p>
+    <w:p>
+      <w:r>
+        <w:lastRenderedPageBreak/>
+        <w:t>”Tappa ett minne? Som att glömma det?”</w:t>
+      </w:r>
+    </w:p>
+    <w:p>
+      <w:r>
+        <w:t>”Ja. Eller så kan det bli svårare att komma åt det igen. Det är inte något som händer varje gång någon tappar fokus, men det är en risk du måste känna till. Särskilt när du är ny och inte har lärt dig att känna skillnaden mellan att låta sidan hjälpa dig och att låta den göra arbetet åt dig.”</w:t>
+      </w:r>
+    </w:p>
+    <w:p>
+      <w:r>
+        <w:t xml:space="preserve">Myr tittade ner på sina händer. Det kändes underligt att något så vardagligt som att skriva kunde kräva så mycket kontroll. Hemma hade han aldrig behövt fundera över vad ett minne var, eller hur han skulle hålla fast vid det. Om han ville skriva något tog han bara en penna och satte </w:t>
+      </w:r>
+      <w:proofErr w:type="gramStart"/>
+      <w:r>
+        <w:t>igång</w:t>
+      </w:r>
+      <w:proofErr w:type="gramEnd"/>
+      <w:r>
+        <w:t>. Orden kom kanske långsamt, men själva minnet låg kvar där det låg.</w:t>
+      </w:r>
+    </w:p>
+    <w:p>
+      <w:r>
+        <w:t>Här kunde själva skrivandet påverka det han försökte bevara.</w:t>
+      </w:r>
+    </w:p>
+    <w:p>
+      <w:r>
+        <w:t>”Borde jag börja med ett minne då?” frågade han.</w:t>
+      </w:r>
+    </w:p>
+    <w:p>
+      <w:r>
+        <w:t xml:space="preserve">”Det tycker jag.” </w:t>
+      </w:r>
+      <w:proofErr w:type="spellStart"/>
+      <w:r>
+        <w:t>Elarion</w:t>
+      </w:r>
+      <w:proofErr w:type="spellEnd"/>
+      <w:r>
+        <w:t xml:space="preserve"> sköt fram den tomma sidan. ”Välj något enkelt. Något du känner väl och som inte är alltför viktigt för dig. Du ska inte behöva oroa dig för att förlora det medan du lär dig.”</w:t>
+      </w:r>
+    </w:p>
+    <w:p>
+      <w:r>
+        <w:t>Myr lät blicken vandra över sidan. Den såg inte längre riktigt tom ut. Han visste att inga nya rader hade dykt upp, men nu när han förstod vad den försökte göra fick han en känsla av att den väntade på honom.</w:t>
+      </w:r>
+    </w:p>
+    <w:p>
+      <w:r>
+        <w:t>Han försökte välja ett minne. Det första som dök upp var för stort och rörigt: hans första dag i den här världen, alla märkliga varelser och den första gången han hade sett magi. Han sköt undan det och letade efter något mindre.</w:t>
+      </w:r>
+    </w:p>
+    <w:p>
+      <w:r>
+        <w:t>Till slut fastnade han för en vanlig morgon hemma. Han mindes köket, ljuset från fönstret och ljudet av någon som rörde sig i rummet intill. Det var inget särskilt med den morgonen. Just därför kändes den lämplig.</w:t>
+      </w:r>
+    </w:p>
+    <w:p>
+      <w:r>
+        <w:t xml:space="preserve">Han blundade, som </w:t>
+      </w:r>
+      <w:proofErr w:type="spellStart"/>
+      <w:r>
+        <w:t>Elarion</w:t>
+      </w:r>
+      <w:proofErr w:type="spellEnd"/>
+      <w:r>
+        <w:t xml:space="preserve"> hade gjort, och försökte hålla kvar bilden.</w:t>
+      </w:r>
+    </w:p>
+    <w:p>
+      <w:r>
+        <w:t xml:space="preserve">”Bra”, sa </w:t>
+      </w:r>
+      <w:proofErr w:type="spellStart"/>
+      <w:r>
+        <w:t>Elarion</w:t>
+      </w:r>
+      <w:proofErr w:type="spellEnd"/>
+      <w:r>
+        <w:t xml:space="preserve"> stilla. ”Försök att inte beskriva minnet för dig själv ännu. Håll bara fast vid det som det är. När du känner att du har det framför dig kan du låta sidan börja.”</w:t>
+      </w:r>
+    </w:p>
+    <w:p>
+      <w:r>
+        <w:t>Myr koncentrerade sig på köket. Först var det bara en allmän känsla av rummet, men efter en stund började detaljerna framträda. Fönstret, bordsskivan, en kopp som stod nära kanten. Han mindes ljuset som föll in genom glaset och hur det förändrades när någon rörde sig framför fönstret. Det fanns också en lukt där, något svagt som han förknippade med morgnar hemma, även om han inte kunde säga exakt vad den kom ifrån.</w:t>
+      </w:r>
+    </w:p>
+    <w:p>
+      <w:r>
+        <w:t xml:space="preserve">”Bra”, sa </w:t>
+      </w:r>
+      <w:proofErr w:type="spellStart"/>
+      <w:r>
+        <w:t>Elarion</w:t>
+      </w:r>
+      <w:proofErr w:type="spellEnd"/>
+      <w:r>
+        <w:t xml:space="preserve"> stilla. ”Försök att inte beskriva minnet för dig själv ännu. Håll bara fast vid det som det är. När du känner att du har det framför dig kan du låta sidan börja.”</w:t>
+      </w:r>
+    </w:p>
+    <w:p>
+      <w:r>
+        <w:lastRenderedPageBreak/>
+        <w:t>Myr blundade och försökte hålla kvar hela bilden på en gång. Han hade ingen aning om hur länge han skulle göra det, men till slut kände han att minnet blev tydligare, som om han inte längre behövde leta efter de olika detaljerna. De fanns bara där.</w:t>
+      </w:r>
+    </w:p>
+    <w:p>
+      <w:r>
+        <w:t>Något förändrades under hans händer.</w:t>
+      </w:r>
+    </w:p>
+    <w:p>
+      <w:r>
+        <w:t>Han öppnade ögonen och tittade ner på sidan.</w:t>
+      </w:r>
+    </w:p>
+    <w:p>
+      <w:r>
+        <w:t xml:space="preserve">Det som växte fram där liknade inte alls det </w:t>
+      </w:r>
+      <w:proofErr w:type="spellStart"/>
+      <w:r>
+        <w:t>Elarion</w:t>
+      </w:r>
+      <w:proofErr w:type="spellEnd"/>
+      <w:r>
+        <w:t xml:space="preserve"> hade visat honom tidigare. Tunna linjer spred sig över pappret i flera riktningar, korsade varandra och böjde av i kurvor som tycktes sakna samband. Några löpte tätt intill varandra, andra drog sig ut mot sidans kanter innan de plötsligt vek tillbaka. Nya linjer uppstod mellan de gamla, och snart var det svårt att avgöra var en slutade och nästa började.</w:t>
+      </w:r>
+    </w:p>
+    <w:p>
+      <w:r>
+        <w:t>Vid första anblicken såg det nästan ut som om ett litet barn hade försökt rita ett åskmoln utan att lyfta handen från pappret. Ändå var det något med linjerna som fick Myr att tveka inför den jämförelsen. De verkade inte slumpmässiga. Varje böj, varje korsning och varje liten avstickare tycktes ha en funktion, även om han inte kunde begripa vilken.</w:t>
+      </w:r>
+    </w:p>
+    <w:p>
+      <w:r>
+        <w:t>Han lutade sig närmare.</w:t>
+      </w:r>
+    </w:p>
+    <w:p>
+      <w:r>
+        <w:t>”Vad är det där?”</w:t>
+      </w:r>
+    </w:p>
+    <w:p>
+      <w:r>
+        <w:t xml:space="preserve">”Det är ditt minne”, svarade </w:t>
+      </w:r>
+      <w:proofErr w:type="spellStart"/>
+      <w:r>
+        <w:t>Elarion</w:t>
+      </w:r>
+      <w:proofErr w:type="spellEnd"/>
+      <w:r>
+        <w:t>.</w:t>
+      </w:r>
+    </w:p>
+    <w:p>
+      <w:r>
+        <w:t>Myr såg upp på honom, sedan ner på sidan igen.</w:t>
+      </w:r>
+    </w:p>
+    <w:p>
+      <w:r>
+        <w:t>”Det där är väl inte ett kök?”</w:t>
+      </w:r>
+    </w:p>
+    <w:p>
+      <w:r>
+        <w:t>”Inte på det sätt du förväntar dig.”</w:t>
+      </w:r>
+    </w:p>
+    <w:p>
+      <w:r>
+        <w:t>Linjerna fortsatte att breda ut sig. Några av dem verkade nästan röra sig över varandra, trots att de låg stilla på pappret. Myr försökte följa en av de längre linjerna med blicken, men tappade bort den bland alla korsningar. När han började om från en annan punkt tyckte han sig känna igen något i mönstret, men sambandet gled undan innan han hann förstå det.</w:t>
+      </w:r>
+    </w:p>
+    <w:p>
+      <w:r>
+        <w:t xml:space="preserve">”Tänk dig att minnet inte bara består av det du ser”, sa </w:t>
+      </w:r>
+      <w:proofErr w:type="spellStart"/>
+      <w:r>
+        <w:t>Elarion</w:t>
+      </w:r>
+      <w:proofErr w:type="spellEnd"/>
+      <w:r>
+        <w:t>. ”Du har också avstånd, rörelser och sådant du uppfattar utan att egentligen titta efter det. Sidan försöker fånga alltihop. Problemet är att den måste få plats med det på en yta som bara har två dimensioner.”</w:t>
+      </w:r>
+    </w:p>
+    <w:p>
+      <w:r>
+        <w:t>Myr betraktade mönstret på nytt. Han kunde föreställa sig hur rummet hade sett ut, hur ljuset hade fallit och hur någon hade rört sig genom det. Men hur skulle allt det kunna rymmas i de tunna linjerna framför honom?</w:t>
+      </w:r>
+    </w:p>
+    <w:p>
+      <w:r>
+        <w:t>”Så den ritar rummet?”</w:t>
+      </w:r>
+    </w:p>
+    <w:p>
+      <w:r>
+        <w:t>”Den försöker bevara det du minns. Rummet är en del av det, men inte allt.”</w:t>
+      </w:r>
+    </w:p>
+    <w:p>
+      <w:proofErr w:type="spellStart"/>
+      <w:r>
+        <w:lastRenderedPageBreak/>
+        <w:t>Elarion</w:t>
+      </w:r>
+      <w:proofErr w:type="spellEnd"/>
+      <w:r>
+        <w:t xml:space="preserve"> pekade mot en tät samling linjer nära mitten av sidan.</w:t>
+      </w:r>
+    </w:p>
+    <w:p>
+      <w:r>
+        <w:t>”Här finns till exempel relationerna mellan olika saker. Var de befann sig i förhållande till varandra, hur de förändrades och hur du uppfattade dem. Om någon gick genom rummet behöver sidan inte bara bevara var personen var, utan också rörelsen. Och det du kände eller luktade kan vara en del av samma minne, även om det inte går att rita på ett vanligt sätt.”</w:t>
+      </w:r>
+    </w:p>
+    <w:p>
+      <w:r>
+        <w:t>Myr rynkade pannan. Han försökte hitta koppen i mönstret, men kunde inte ens avgöra vilken del av sidan som motsvarade fönstret.</w:t>
+      </w:r>
+    </w:p>
+    <w:p>
+      <w:r>
+        <w:t>”Hur ska jag någonsin kunna läsa det här?”</w:t>
+      </w:r>
+    </w:p>
+    <w:p>
+      <w:r>
+        <w:t xml:space="preserve">”Inte genom att bara titta på det”, sa </w:t>
+      </w:r>
+      <w:proofErr w:type="spellStart"/>
+      <w:r>
+        <w:t>Elarion</w:t>
+      </w:r>
+      <w:proofErr w:type="spellEnd"/>
+      <w:r>
+        <w:t>. ”Det är en av anledningarna till att du måste lära dig hur sidorna fungerar. Det du ser är bara den synliga återgivningen av något som inte är begränsat till det du kan se.”</w:t>
+      </w:r>
+    </w:p>
+    <w:p>
+      <w:r>
+        <w:t>Myr lät blicken glida över de många linjerna. Ju längre han tittade, desto mer tyckte han att de påminde om något han nästan förstod. Inte en bild, utan snarare ett försök att fånga flera bilder samtidigt, tillsammans med allt som hade hänt mellan dem. Som om någon hade tagit ett helt rum, fyllt det med rörelse, ljus, ljud och lukt och sedan pressat ihop alltsammans tills bara spåren fanns kvar.</w:t>
+      </w:r>
+    </w:p>
+    <w:p>
+      <w:r>
+        <w:t>Han försökte återvända till minnet. Köket blev tydligare igen, men den här gången lade han märke till hur mycket som hade förändrats under den korta stund han mindes det. Ljuset hade flyttat sig över bordet. Någon hade rört sig i rummet intill. Lukten hade varit starkare i början och sedan nästan försvunnit ur hans uppmärksamhet.</w:t>
+      </w:r>
+    </w:p>
+    <w:p>
+      <w:r>
+        <w:t>På sidan tillkom fler linjer, några så tunna att han knappt kunde urskilja dem. Andra drog sig genom det redan täta mönstret och tycktes binda samman delar som han inte kunde se något samband mellan.</w:t>
+      </w:r>
+    </w:p>
+    <w:p>
+      <w:r>
+        <w:t>Myr tappade fokus för ett ögonblick.</w:t>
+      </w:r>
+    </w:p>
+    <w:p>
+      <w:r>
+        <w:t>Linjerna slutade växa.</w:t>
+      </w:r>
+    </w:p>
+    <w:p>
+      <w:r>
+        <w:t xml:space="preserve">”Ta det lugnt”, sa </w:t>
+      </w:r>
+      <w:proofErr w:type="spellStart"/>
+      <w:r>
+        <w:t>Elarion</w:t>
+      </w:r>
+      <w:proofErr w:type="spellEnd"/>
+      <w:r>
+        <w:t>. ”Du behöver inte förstå allt som händer på sidan. Fortsätt hålla kvar minnet, men försök inte styra varje detalj. Det är då det blir svårare att skilja mellan det du vill bevara och det sidan försöker hjälpa dig med.”</w:t>
+      </w:r>
+    </w:p>
+    <w:p>
+      <w:r>
+        <w:t>Myr slöt ögonen igen. Han lät köket finnas där utan att försöka dela upp det i fönster, bord, kopp och rörelser. Han försökte inte heller hålla fast vid lukten eller ljuset var för sig. I stället lät han dem höra till samma minne.</w:t>
+      </w:r>
+    </w:p>
+    <w:p>
+      <w:r>
+        <w:t xml:space="preserve">När han öppnade ögonen hade mönstret tätnat ytterligare. Det var fortfarande omöjligt att förstå genom att betrakta det, men nu kunde han åtminstone se att det hade </w:t>
+      </w:r>
+      <w:r>
+        <w:lastRenderedPageBreak/>
+        <w:t>förändrats. Linjer som tidigare tycktes löpa åt olika håll hade fått nya förgreningar, och några av de tomma ytorna hade fyllts med tunna, slingrande spår.</w:t>
+      </w:r>
+    </w:p>
+    <w:p>
+      <w:r>
+        <w:t xml:space="preserve">”Stanna där”, sa </w:t>
+      </w:r>
+      <w:proofErr w:type="spellStart"/>
+      <w:r>
+        <w:t>Elarion</w:t>
+      </w:r>
+      <w:proofErr w:type="spellEnd"/>
+      <w:r>
+        <w:t>.</w:t>
+      </w:r>
+    </w:p>
+    <w:p>
+      <w:r>
+        <w:t>Myr avbröt koncentrationen. För ett ögonblick kändes det som om köket gled undan, men minnet försvann inte. Han kunde fortfarande återkalla det, även om det inte längre var lika levande som när han hade fokuserat på det.</w:t>
+      </w:r>
+    </w:p>
+    <w:p>
+      <w:proofErr w:type="spellStart"/>
+      <w:r>
+        <w:t>Elarion</w:t>
+      </w:r>
+      <w:proofErr w:type="spellEnd"/>
+      <w:r>
+        <w:t xml:space="preserve"> tog upp sidan och betraktade den.</w:t>
+      </w:r>
+    </w:p>
+    <w:p>
+      <w:r>
+        <w:t>”Det där var en bra början.”</w:t>
+      </w:r>
+    </w:p>
+    <w:p>
+      <w:r>
+        <w:t>Myr lutade sig fram. Han försökte hitta någon ordning i mönstret, men ju längre han tittade, desto mindre säker blev han på vad han såg. Det var tydligt att sidan hade registrerat något. Ändå kunde han inte avgöra om han tittade på ett rum, en rörelse, en lukt eller en blandning av alltihop.</w:t>
+      </w:r>
+    </w:p>
+    <w:p>
+      <w:r>
+        <w:t>”Har jag gjort rätt?” frågade han.</w:t>
+      </w:r>
+    </w:p>
+    <w:p>
+      <w:r>
+        <w:t xml:space="preserve">”Du höll fast vid minnet och lät sidan hjälpa dig att bevara det. Det är vad du skulle göra.” </w:t>
+      </w:r>
+      <w:proofErr w:type="spellStart"/>
+      <w:r>
+        <w:t>Elarion</w:t>
+      </w:r>
+      <w:proofErr w:type="spellEnd"/>
+      <w:r>
+        <w:t xml:space="preserve"> räckte tillbaka sidan. ”Nästa steg blir att lära dig styra vad som hamnar där och hur länge du låter sidan arbeta. Men först ska du vänja dig vid själva känslan.”</w:t>
+      </w:r>
+    </w:p>
+    <w:p>
+      <w:r>
+        <w:t>Myr tog emot sidan försiktigt. Han hade inte skrivit en enda bokstav med handen, och det fanns inte heller något på pappret som han kunde läsa. Ändå hade han lyckats bevara ett minne på ett sätt som han aldrig tidigare hade föreställt sig.</w:t>
+      </w:r>
+    </w:p>
+    <w:p>
+      <w:r>
+        <w:t>Det märkligaste var att han fortfarande kunde minnas morgonen tydligt, utan att känna att sidan hade tagit något ifrån honom.</w:t>
+      </w:r>
+    </w:p>
+    <w:p>
+      <w:r>
+        <w:t>Än så länge, tänkte han.</w:t>
+      </w:r>
+    </w:p>
+    <w:p>
+      <w:r>
+        <w:t xml:space="preserve">Han såg upp på </w:t>
+      </w:r>
+      <w:proofErr w:type="spellStart"/>
+      <w:r>
+        <w:t>Elarion</w:t>
+      </w:r>
+      <w:proofErr w:type="spellEnd"/>
+      <w:r>
+        <w:t>.</w:t>
+      </w:r>
+    </w:p>
+    <w:p>
+      <w:r>
+        <w:t>”Hur vet jag när sidan börjar ta över?”</w:t>
+      </w:r>
+    </w:p>
+    <w:p>
+      <w:r>
+        <w:t>”Det lär du dig genom att öva. Du kommer att märka när du börjar följa sidan i stället för att styra den. Men du måste vara uppmärksam, Myr. Det räcker inte att kunna få den att dokumentera ett minne. Du måste också veta när du ska sluta.”</w:t>
+      </w:r>
+    </w:p>
+    <w:p>
+      <w:r>
+        <w:t>Myr nickade och lade sidan framför sig igen. Den kändes inte lika främmande som tidigare. Inte ofarlig, precis, men åtminstone begriplig nog för att han skulle våga fortsätta.</w:t>
+      </w:r>
+    </w:p>
+    <w:p/>
+    <w:p/>
+    <w:p/>
+    <w:p>
+      <w:r>
+        <w:lastRenderedPageBreak/>
+        <w:t>Myr lät blicken vila på sidan igen. Han försökte följa en av de långa linjerna från ena kanten till den andra, men den försvann snart bland andra streck och förgreningar. När han trodde sig ha hittat ett mönster förändrades det, inte på själva pappret, utan i hans förståelse av det. Han hade fortfarande minnet av köket inom sig, och nu när han visste vad sidan innehöll kunde han nästan känna igen vissa delar av det i linjerna. Men bara nästan.</w:t>
+      </w:r>
+    </w:p>
+    <w:p>
+      <w:r>
+        <w:t>”Ska jag försöka med ett till minne?” frågade han.</w:t>
+      </w:r>
+    </w:p>
+    <w:p>
+      <w:r>
+        <w:t>”Inte riktigt än. Vi ska se till att du avslutar det första ordentligt.”</w:t>
+      </w:r>
+    </w:p>
+    <w:p>
+      <w:proofErr w:type="spellStart"/>
+      <w:r>
+        <w:t>Elarion</w:t>
+      </w:r>
+      <w:proofErr w:type="spellEnd"/>
+      <w:r>
+        <w:t xml:space="preserve"> pekade på sidan. Mönstret hade börjat sprida sig ända ut mot kanterna, men på flera ställen fanns fortfarande små tomma ytor kvar.</w:t>
+      </w:r>
+    </w:p>
+    <w:p>
+      <w:r>
+        <w:t>”Hur vet jag när det är färdigt?”</w:t>
+      </w:r>
+    </w:p>
+    <w:p>
+      <w:r>
+        <w:t>”Det beror på vad du vill dokumentera. Ett minne kan innehålla mer än du först tänker på. Du kanske minns ett rum, men när du börjar fokusera på det kommer du också ihåg hur luften kändes, vilka ljud du hörde och vad som hände medan du var där. Sidan försöker fånga det som hör till minnet. Men du bestämmer hur mycket du vill bevara.”</w:t>
+      </w:r>
+    </w:p>
+    <w:p>
+      <w:r>
+        <w:t>Myr såg ner på sitt arbete. Han hade inte tänkt på ljuden från morgonen tidigare, men nu kunde han minnas dem. Ett svagt skrapande från ett annat rum, någon som ställde ner något på en hård yta och ett ljud utifrån som han inte längre kunde placera. När han lät uppmärksamheten stanna vid dessa detaljer började nya linjer växa fram på sidan. De slingrade sig mellan de redan befintliga, ibland tätt sammanflätade, ibland med långa avstånd mellan sig.</w:t>
+      </w:r>
+    </w:p>
+    <w:p>
+      <w:r>
+        <w:t xml:space="preserve">Han fortsatte en stund till. Det kändes inte längre lika ansträngande att hålla kvar minnet, men han märkte att det blev svårare att avgöra vilka detaljer han faktiskt ville bevara. Varje gång han tänkte på en sak dök något annat upp, och sidan verkade villigt följa med. Han förstod nu varför </w:t>
+      </w:r>
+      <w:proofErr w:type="spellStart"/>
+      <w:r>
+        <w:t>Elarion</w:t>
+      </w:r>
+      <w:proofErr w:type="spellEnd"/>
+      <w:r>
+        <w:t xml:space="preserve"> hade varnat honom för att låta den ta över.</w:t>
+      </w:r>
+    </w:p>
+    <w:p>
+      <w:r>
+        <w:t>Till slut drog han sig tillbaka från minnet och öppnade ögonen.</w:t>
+      </w:r>
+    </w:p>
+    <w:p>
+      <w:r>
+        <w:t>Sidan var nästan helt täckt. Linjerna nådde ut till kanterna och bildade ett tätt nätverk som såg ännu mer obegripligt ut än tidigare. Bara några små fläckar av den ursprungliga ytan syntes mellan strecken.</w:t>
+      </w:r>
+    </w:p>
+    <w:p>
+      <w:r>
+        <w:t>”Är den full nu?” frågade Myr.</w:t>
+      </w:r>
+    </w:p>
+    <w:p>
+      <w:proofErr w:type="spellStart"/>
+      <w:r>
+        <w:t>Elarion</w:t>
+      </w:r>
+      <w:proofErr w:type="spellEnd"/>
+      <w:r>
+        <w:t xml:space="preserve"> granskade sidan utan att röra vid den.</w:t>
+      </w:r>
+    </w:p>
+    <w:p>
+      <w:r>
+        <w:t>”Tillräckligt för den här övningen. Du skulle kunna fortsätta att hitta fler detaljer, men det betyder inte att du behöver dokumentera varenda en av dem.”</w:t>
+      </w:r>
+    </w:p>
+    <w:p>
+      <w:r>
+        <w:t>”Så det finns ingen gräns för hur mycket ett minne kan innehålla?”</w:t>
+      </w:r>
+    </w:p>
+    <w:p>
+      <w:r>
+        <w:lastRenderedPageBreak/>
+        <w:t>”Det finns gränser för vad en sida kan bevara, men ett minne är inte alltid så enkelt avgränsat som man först tror. Det viktiga är att du lär dig känna när du har fått med det du ville ha.”</w:t>
+      </w:r>
+    </w:p>
+    <w:p>
+      <w:r>
+        <w:t>Myr lade sidan bredvid boken. Han hade svårt att släppa tanken på att det där röriga mönstret faktiskt innehöll en hel morgon ur hans liv. Någonstans bland linjerna fanns fönstret, koppen, ljuset, rörelserna och lukten. Allt det han hade upplevt hade pressats ner på en enda sida, utan att han kunde peka ut var någonting fanns.</w:t>
+      </w:r>
+    </w:p>
+    <w:p>
+      <w:proofErr w:type="spellStart"/>
+      <w:r>
+        <w:t>Elarion</w:t>
+      </w:r>
+      <w:proofErr w:type="spellEnd"/>
+      <w:r>
+        <w:t xml:space="preserve"> tog upp boken som Myr fått tidigare och lade den framför honom.</w:t>
+      </w:r>
+    </w:p>
+    <w:p>
+      <w:r>
+        <w:t>”Nu ska vi prata om läsning.”</w:t>
+      </w:r>
+    </w:p>
+    <w:p>
+      <w:r>
+        <w:t>Myr såg på boken och sedan på den fulltecknade sidan.</w:t>
+      </w:r>
+    </w:p>
+    <w:p>
+      <w:r>
+        <w:t>”Jag trodde att vi redan hade gjort det. Du visade ju hur man skriver, och när jag skrev kunde jag på sätt och vis se vad som stod på sidan. Jag visste vad jag hade i minnet samtidigt som linjerna växte fram.”</w:t>
+      </w:r>
+    </w:p>
+    <w:p>
+      <w:r>
+        <w:t>”Precis. När du skriver och sidan dokumenterar ditt eget minne eller din egen tanke är du redan i kontakt med det som blir nedtecknat. Du behöver inte hitta någon väg in i det, eftersom det är du som tillför innehållet. Du upplever minnet medan sidan bevarar det.”</w:t>
+      </w:r>
+    </w:p>
+    <w:p>
+      <w:proofErr w:type="spellStart"/>
+      <w:r>
+        <w:t>Elarion</w:t>
+      </w:r>
+      <w:proofErr w:type="spellEnd"/>
+      <w:r>
+        <w:t xml:space="preserve"> sköt boken lite närmare Myr.</w:t>
+      </w:r>
+    </w:p>
+    <w:p>
+      <w:r>
+        <w:t>”Men när du läser något som någon annan har skrivit är det annorlunda. Då har du inte själv upplevt det som dokumenterats, och du kan inte utgå från att förstå innehållet bara genom att titta på sidan. Du måste hitta vägen in i någon annans dokumenterade minne eller tanke.”</w:t>
+      </w:r>
+    </w:p>
+    <w:p>
+      <w:r>
+        <w:t>Myr tittade på boken. Han hade redan förstått att läsningen skulle vara svårare, men han hade föreställt sig att det mest handlade om att lära sig tolka linjerna. Nu lät det som om själva läsandet krävde att han gjorde något med sitt eget sinne.</w:t>
+      </w:r>
+    </w:p>
+    <w:p>
+      <w:r>
+        <w:t>”Hur hittar man den vägen?”</w:t>
+      </w:r>
+    </w:p>
+    <w:p>
+      <w:r>
+        <w:t>”Genom att lära sig känna igen sidans naturliga sökande.”</w:t>
+      </w:r>
+    </w:p>
+    <w:p>
+      <w:proofErr w:type="spellStart"/>
+      <w:r>
+        <w:t>Elarion</w:t>
+      </w:r>
+      <w:proofErr w:type="spellEnd"/>
+      <w:r>
+        <w:t xml:space="preserve"> lade handen på boken, men öppnade den inte ännu.</w:t>
+      </w:r>
+    </w:p>
+    <w:p>
+      <w:r>
+        <w:t>”Kommer du ihåg hur sidan betedde sig när du började skriva? Den försökte hitta något att dokumentera. Den sökte efter ett minne eller en tanke som den kunde fånga upp. När du gav den något bestämt att arbeta med följde den ditt fokus och började bevara det.”</w:t>
+      </w:r>
+    </w:p>
+    <w:p>
+      <w:r>
+        <w:t>Myr nickade.</w:t>
+      </w:r>
+    </w:p>
+    <w:p>
+      <w:r>
+        <w:t xml:space="preserve">”En sida som redan innehåller ett dokumenterat minne fungerar på ett liknande sätt. Den vill fortsätta dokumentera. Den söker efter mer information som hör samman med det som redan finns där, efter fler detaljer ur samma minne eller tanke hos den som </w:t>
+      </w:r>
+      <w:r>
+        <w:lastRenderedPageBreak/>
+        <w:t>skrev det. När du lär dig känna igen den sökande rörelsen kan du följa den tillbaka till innehållet.”</w:t>
+      </w:r>
+    </w:p>
+    <w:p>
+      <w:r>
+        <w:t>”Så jag ska göra samma sak som när jag skrev?”</w:t>
+      </w:r>
+    </w:p>
+    <w:p>
+      <w:r>
+        <w:t>”Inte riktigt. När du skrev behövde du hitta ditt eget minne och låta sidan följa det. När du läser behöver du hitta det som sidan själv söker efter i det redan dokumenterade materialet. Det kan kännas främmande i början, eftersom du försöker närma dig något som kommer från någon annan.”</w:t>
+      </w:r>
+    </w:p>
+    <w:p>
+      <w:r>
+        <w:t>Myr funderade över det. Han försökte föreställa sig en sida som hela tiden letade efter mer information om något som redan hade hänt. Det var svårt att förstå hur en sida kunde vilja någonting alls, men han mindes känslan av hur den hade börjat arbeta under hans händer. Det hade inte varit som att hålla i en penna eller skriva en mening. Snarare hade det känts som om något hade börjat röra sig i samma riktning som hans uppmärksamhet.</w:t>
+      </w:r>
+    </w:p>
+    <w:p>
+      <w:r>
+        <w:t>”Och när jag hittar det?” frågade han.</w:t>
+      </w:r>
+    </w:p>
+    <w:p>
+      <w:r>
+        <w:t>”Då får du möjlighet att läsa minnet eller tanken. Du kommer inte bara att se ett mönster och försöka gissa vad det betyder. Du kommer att kunna ta del av det som dokumenterades.”</w:t>
+      </w:r>
+    </w:p>
+    <w:p>
+      <w:r>
+        <w:t>Myr såg åter på den fulltecknade sidan bredvid boken. Han hade trott att det svåraste skulle vara att lära sig skriva utan penna. Nu började han misstänka att det bara var den enklaste delen av undervisningen.</w:t>
+      </w:r>
+    </w:p>
+    <w:p>
+      <w:proofErr w:type="spellStart"/>
+      <w:r>
+        <w:t>Elarion</w:t>
+      </w:r>
+      <w:proofErr w:type="spellEnd"/>
+      <w:r>
+        <w:t xml:space="preserve"> öppnade boken.</w:t>
+      </w:r>
+    </w:p>
+    <w:p>
+      <w:r>
+        <w:t>”Vi tar det steg för steg. Börja med att försöka känna efter vad sidan söker efter, utan att försöka förstå innehållet ännu. Du behöver inte tvinga fram någonting. Försök bara hitta samma sorts känsla som du hade när din egen sida började dokumentera.”</w:t>
+      </w:r>
+    </w:p>
+    <w:p>
+      <w:r>
+        <w:t>Myr lutade sig fram över boken. Han visste inte riktigt vad han skulle leta efter, men den här gången försökte han låta bli att stirra på linjerna som om de vore en gåta. I stället försökte han uppmärksamma vad som fanns bakom dem.</w:t>
+      </w:r>
+    </w:p>
+    <w:p>
+      <w:r>
+        <w:t>För första gången sedan han kommit till akademin hade han en tydlig känsla av att han inte bara skulle behöva lära sig hur magin fungerade. Han skulle behöva lära sig att uppfatta världen på ett annat sätt.</w:t>
+      </w:r>
+    </w:p>
+    <w:p>
+      <w:r>
+        <w:t xml:space="preserve">Myr lät blicken vila på boken och försökte göra som </w:t>
+      </w:r>
+      <w:proofErr w:type="spellStart"/>
+      <w:r>
+        <w:t>Elarion</w:t>
+      </w:r>
+      <w:proofErr w:type="spellEnd"/>
+      <w:r>
+        <w:t xml:space="preserve"> hade sagt. Han slutade leta efter ett mönster bland linjerna och försökte i stället uppmärksamma det som fanns bakom dem. Till en början kände han ingenting särskilt. Sedan började han ana samma sorts dragning som han hade känt när hans egen sida sökte efter ett minne att dokumentera. Det var svagt, men det fanns där, som en riktning han kunde följa utan att riktigt veta vart den ledde.</w:t>
+      </w:r>
+    </w:p>
+    <w:p>
+      <w:r>
+        <w:lastRenderedPageBreak/>
+        <w:t>Han höll kvar uppmärksamheten och försökte komma närmare.</w:t>
+      </w:r>
+    </w:p>
+    <w:p>
+      <w:r>
+        <w:t>Då dök något annat upp. En känsla som inte riktigt var hans egen, främmande och svår att beskriva. Den verkade höra samman med det som fanns nedtecknat i boken, men så fort Myr försökte förstå den gled den undan. Han kunde ana att det fanns något där, något han kanske skulle kunna nå om han bara förstod hur han skulle fortsätta.</w:t>
+      </w:r>
+    </w:p>
+    <w:p>
+      <w:r>
+        <w:t>Men han kom inte längre.</w:t>
+      </w:r>
+    </w:p>
+    <w:p>
+      <w:r>
+        <w:t>Myr drog efter andan och släppte koncentrationen. Han kände sig inte särskilt trött, men huvudet var fullt av intryck. Det var som om han hade försökt lyssna efter en röst genom en vägg och precis börjat urskilja att någon befann sig på andra sidan.</w:t>
+      </w:r>
+    </w:p>
+    <w:p>
+      <w:proofErr w:type="spellStart"/>
+      <w:r>
+        <w:t>Elarion</w:t>
+      </w:r>
+      <w:proofErr w:type="spellEnd"/>
+      <w:r>
+        <w:t xml:space="preserve"> stängde boken.</w:t>
+      </w:r>
+    </w:p>
+    <w:p>
+      <w:r>
+        <w:t>”Det räcker för idag.”</w:t>
+      </w:r>
+    </w:p>
+    <w:p>
+      <w:r>
+        <w:t>Myr såg upp. ”Men jag var nästan där.”</w:t>
+      </w:r>
+    </w:p>
+    <w:p>
+      <w:r>
+        <w:t>”Du hittade den sökande känslan och kunde ana det främmande innehållet. Det är en bra början. Att faktiskt ta sig in i minnet eller tanken får vänta tills nästa lektion.”</w:t>
+      </w:r>
+    </w:p>
+    <w:p>
+      <w:r>
+        <w:t>Myr hade tänkt protestera, men hejdade sig. Han visste fortfarande inte vad han hade varit på väg att upptäcka, och kanske var det just därför han ville försöka igen. Ändå förstod han att han inte skulle komma längre bara genom att fortsätta på måfå.</w:t>
+      </w:r>
+    </w:p>
+    <w:p>
+      <w:r>
+        <w:t xml:space="preserve">Det var först när </w:t>
+      </w:r>
+      <w:proofErr w:type="spellStart"/>
+      <w:r>
+        <w:t>Elarion</w:t>
+      </w:r>
+      <w:proofErr w:type="spellEnd"/>
+      <w:r>
+        <w:t xml:space="preserve"> reste sig som Myr lade märke till att de inte längre var ensamma om att följa lektionen. Sonya och Lyra stod en bit bort. Båda såg på honom med en förvåning som de inte verkade ha hunnit dölja.</w:t>
+      </w:r>
+    </w:p>
+    <w:p>
+      <w:r>
+        <w:t>Myr tittade från den ena till den andra.</w:t>
+      </w:r>
+    </w:p>
+    <w:p>
+      <w:r>
+        <w:t>”Vad är det?”</w:t>
+      </w:r>
+    </w:p>
+    <w:p>
+      <w:proofErr w:type="spellStart"/>
+      <w:r>
+        <w:t>Elarion</w:t>
+      </w:r>
+      <w:proofErr w:type="spellEnd"/>
+      <w:r>
+        <w:t xml:space="preserve"> följde hans blick och tycktes först då lägga märke till deras reaktioner. Ett svagt leende drog över hans ansikte.</w:t>
+      </w:r>
+    </w:p>
+    <w:p>
+      <w:r>
+        <w:t>”Jag hade inte väntat mig att du skulle komma så här långt idag.”</w:t>
+      </w:r>
+    </w:p>
+    <w:p>
+      <w:r>
+        <w:t>”Hur långt då?”</w:t>
+      </w:r>
+    </w:p>
+    <w:p>
+      <w:r>
+        <w:t>”Det du har gjort här inne. Att lära sig styra en sida när man skriver är en sak. Att börja känna igen dess sökande och ana vägen in i någon annans dokumenterade minne är betydligt svårare.” Han gjorde en kort paus. ”Jag trodde att det skulle ta minst en månad att komma hit. Om det ens skulle visa sig möjligt.”</w:t>
+      </w:r>
+    </w:p>
+    <w:p>
+      <w:r>
+        <w:t>Myr stirrade på honom.</w:t>
+      </w:r>
+    </w:p>
+    <w:p>
+      <w:r>
+        <w:t>”En månad? Men jag har ju bara gjort det du sa åt mig att göra.”</w:t>
+      </w:r>
+    </w:p>
+    <w:p>
+      <w:r>
+        <w:lastRenderedPageBreak/>
+        <w:t xml:space="preserve">”Det är just det som är märkligt”, svarade </w:t>
+      </w:r>
+      <w:proofErr w:type="spellStart"/>
+      <w:r>
+        <w:t>Elarion</w:t>
+      </w:r>
+      <w:proofErr w:type="spellEnd"/>
+      <w:r>
+        <w:t>. ”Du har förstås inte lärt dig allt på en dag. Du kan fortfarande inte läsa det som finns i boken, och du har mycket kvar att öva på. Men du har förstått flera av de grundläggande stegen betydligt snabbare än jag hade räknat med.”</w:t>
+      </w:r>
+    </w:p>
+    <w:p>
+      <w:r>
+        <w:t>Myr såg åter på Sonya och Lyra. De verkade fortfarande lika förvånade, vilket gjorde honom ännu mer förbryllad.</w:t>
+      </w:r>
+    </w:p>
+    <w:p>
+      <w:r>
+        <w:t>”Varför trodde ni att det skulle vara så svårt? Är det för att jag är människa?”</w:t>
+      </w:r>
+    </w:p>
+    <w:p>
+      <w:proofErr w:type="spellStart"/>
+      <w:r>
+        <w:t>Elarion</w:t>
+      </w:r>
+      <w:proofErr w:type="spellEnd"/>
+      <w:r>
+        <w:t xml:space="preserve"> nickade.</w:t>
+      </w:r>
+    </w:p>
+    <w:p>
+      <w:r>
+        <w:t>”Man har försökt lära människor i människornas värld att använda sådana här sidor förut. Det har gjorts flera försök, men ingen har lyckats lära sig det på det sätt vi gör här.”</w:t>
+      </w:r>
+    </w:p>
+    <w:p>
+      <w:r>
+        <w:t>Myr blev tyst en stund.</w:t>
+      </w:r>
+    </w:p>
+    <w:p>
+      <w:r>
+        <w:t>”Ingen alls?”</w:t>
+      </w:r>
+    </w:p>
+    <w:p>
+      <w:r>
+        <w:t>”Inte vad vi känner till.”</w:t>
+      </w:r>
+    </w:p>
+    <w:p>
+      <w:r>
+        <w:t>Han tittade ner på sidan han själv hade fyllt med linjer. Plötsligt kändes den annorlunda. För en stund sedan hade han varit mest upptagen av hur märkligt det var att kunna dokumentera ett minne utan att skriva en enda bokstav. Nu undrade han vad det egentligen innebar att han hade lyckats göra något som andra människor inte hade klarat av.</w:t>
+      </w:r>
+    </w:p>
+    <w:p>
+      <w:r>
+        <w:t>”Men varför?” frågade han. ”Vad är det som gör att jag kan det?”</w:t>
+      </w:r>
+    </w:p>
+    <w:p>
+      <w:proofErr w:type="spellStart"/>
+      <w:r>
+        <w:t>Elarion</w:t>
+      </w:r>
+      <w:proofErr w:type="spellEnd"/>
+      <w:r>
+        <w:t xml:space="preserve"> skakade långsamt på huvudet.</w:t>
+      </w:r>
+    </w:p>
+    <w:p>
+      <w:r>
+        <w:t>”Det vet jag inte, Myr. Och jag tänker inte låtsas att jag har ett svar när jag inte har det.”</w:t>
+      </w:r>
+    </w:p>
+    <w:p>
+      <w:r>
+        <w:t>Svaret gjorde honom inte mindre nyfiken, men det var åtminstone ärligt. Myr hade redan märkt att den här världen rymde sådant som inte ens de som levde i den kunde förklara</w:t>
+      </w:r>
+      <w:r>
+        <w:t>.</w:t>
+      </w:r>
+    </w:p>
+    <w:p>
+      <w:proofErr w:type="spellStart"/>
+      <w:r>
+        <w:t>Elarion</w:t>
+      </w:r>
+      <w:proofErr w:type="spellEnd"/>
+      <w:r>
+        <w:t xml:space="preserve"> samlade ihop böckerna och lade den fulltecknade sidan åt sidan.</w:t>
+      </w:r>
+    </w:p>
+    <w:p>
+      <w:r>
+        <w:t>”Vi fortsätter nästa gång. Då får vi se om du kan hitta vägen lite längre in.”</w:t>
+      </w:r>
+    </w:p>
+    <w:p>
+      <w:r>
+        <w:t>Myr nickade, även om han helst hade velat fortsätta genast. Han reste sig från bordet och följde de andra med blicken när de började göra sig redo att lämna klassrummet. Först då insåg han hur mycket han hade hunnit lära sig under några få timmar.</w:t>
+      </w:r>
+    </w:p>
+    <w:p>
+      <w:r>
+        <w:t>Och hur mycket han fortfarande inte förstod.</w:t>
+      </w:r>
+    </w:p>
+    <w:p/>
+    <w:p/>
+    <w:p/>
+    <w:p>
+      <w:r>
+        <w:lastRenderedPageBreak/>
+        <w:t>När Myr och Sonya lämnade klassrummet gick de åt samma håll genom korridorerna som de hade passerat tidigare under dagen. Akademin var tystare nu. De hörde enstaka röster bakom stängda dörrar och ibland ljudet av steg längre bort, men det mesta av den rörelse som hade funnits där tidigare verkade ha avtagit. Myr följde Sonya genom en bred öppning och kom ut på den inre gården.</w:t>
+      </w:r>
+    </w:p>
+    <w:p>
+      <w:r>
+        <w:t>Det första han såg var trädet.</w:t>
+      </w:r>
+    </w:p>
+    <w:p>
+      <w:r>
+        <w:t>De lila blomkronorna som hade varit så imponerande i dagsljuset lyste nu mot mörkret. Ljuset kom inte från någon enskild punkt, utan tycktes finnas i själva bladen, som om varje litet blad bar på ett svagt sken. Det gav hela kronan ett mjukt, nästan overkligt ljus som spred sig ut över gården och de närmaste byggnaderna. Trädets stora grenar sträckte sig över akademin, och mellan dem rann vattnet som tidigare hade fångat solljuset. Nu lyste det också. Strömmarna glimmade i grenarna innan de kastade sig ut i luften och föll ner längs bergssidan, där vattenfallen fortsatte att lysa i mörkret.</w:t>
+      </w:r>
+    </w:p>
+    <w:p>
+      <w:r>
+        <w:t>Myr stannade utan att tänka på det.</w:t>
+      </w:r>
+    </w:p>
+    <w:p>
+      <w:r>
+        <w:t>Under dagen hade trädet varit svårt nog att förstå. Nu såg det nästan ut som om det hörde hemma i en annan värld än den han redan befann sig i. Det lila ljuset föll över stenläggningen och fick vattenytorna att skimra. Längre bort syntes de upplysta fallen mellan klipporna, som slingrande stråk av ljus mot den mörka bergväggen.</w:t>
+      </w:r>
+    </w:p>
+    <w:p>
+      <w:r>
+        <w:t>Han hade inte väntat sig att trädet skulle förändras så mycket när solen försvann.</w:t>
+      </w:r>
+    </w:p>
+    <w:p>
+      <w:r>
+        <w:t>Sedan lade han märke till rörelserna ovanför gården.</w:t>
+      </w:r>
+    </w:p>
+    <w:p>
+      <w:r>
+        <w:t>Något genomskinligt gled mellan grenarna. Först trodde han att det var en ljusreflektion från vattnet, men varelsen vek av åt sidan och fortsatte ut över den öppna ytan. Fler följde efter. De flög ljudlöst mellan byggnaderna och över trädkronorna, och deras kroppar fångade det lila skenet så att de blev synliga mot natthimlen.</w:t>
+      </w:r>
+    </w:p>
+    <w:p>
+      <w:r>
+        <w:t>Myr försökte följa en av dem med blicken.</w:t>
+      </w:r>
+    </w:p>
+    <w:p>
+      <w:r>
+        <w:t>De hade långsträckta kroppar och smala huvuden, med fyra utsträckta lemmar som påminde om vingar. Långa svansar följde efter dem när de svängde genom luften. De var genomskinliga, men inte helt osynliga. Ljuset från trädet gick igenom dem och bröts längs deras konturer, så att de ibland såg ut att vara gjorda av tunt glas. Några var små, inte mycket större än en fågel, medan andra var så stora att Myr uppskattade att de kunde vara två eller tre gånger längre än han själv.</w:t>
+      </w:r>
+    </w:p>
+    <w:p>
+      <w:r>
+        <w:t>De största rörde sig långsammare än de mindre, med mjuka, svepande rörelser. De påminde nästan om drakar, även om deras kroppar var smalare och deras rörelser mer följsamma än de drakbilder Myr hade sett i böcker hemma.</w:t>
+      </w:r>
+    </w:p>
+    <w:p>
+      <w:r>
+        <w:t>Han följde en av dem när den flög lågt över gården. Den vek undan för en pelare och steg sedan upp mot en av de högre broarna utan att verka behöva anstränga sig.</w:t>
+      </w:r>
+    </w:p>
+    <w:p>
+      <w:r>
+        <w:lastRenderedPageBreak/>
+        <w:t>”Vad är det där för något?” frågade han.</w:t>
+      </w:r>
+    </w:p>
+    <w:p>
+      <w:r>
+        <w:t>Sonya stannade bredvid honom och följde hans blick.</w:t>
+      </w:r>
+    </w:p>
+    <w:p>
+      <w:r>
+        <w:t>”Det är en nattglidare”, svarade hon. ”De brukar hålla till runt akademin, särskilt när det är mörkt.”</w:t>
+      </w:r>
+    </w:p>
+    <w:p>
+      <w:r>
+        <w:t>Myr såg på henne och sedan upp mot varelserna igen.</w:t>
+      </w:r>
+    </w:p>
+    <w:p>
+      <w:r>
+        <w:t>”Nattglidare?”</w:t>
+      </w:r>
+    </w:p>
+    <w:p>
+      <w:r>
+        <w:t>”Ja. De är ganska vanliga här. Du ser dem inte alltid, men när ljuset från trädet blir tydligare brukar de röra sig mer öppet över gårdarna.”</w:t>
+      </w:r>
+    </w:p>
+    <w:p>
+      <w:r>
+        <w:t>En mindre nattglidare flög förbi ovanför dem, så nära att Myr kunde urskilja tunna linjer längs dess genomskinliga vingar. Den svängde runt en gren och försvann bland de lila bladen. Ett ögonblick senare kom den ut på andra sidan tillsammans med två till, som om de hade följt efter varandra genom kronan.</w:t>
+      </w:r>
+    </w:p>
+    <w:p>
+      <w:r>
+        <w:t>”Var de här under dagen också?” frågade Myr. ”Jag såg inga sådana när vi gick runt.”</w:t>
+      </w:r>
+    </w:p>
+    <w:p>
+      <w:r>
+        <w:t>”De var här”, sade Sonya. ”De syntes bara inte.”</w:t>
+      </w:r>
+    </w:p>
+    <w:p>
+      <w:r>
+        <w:t>Myr vände sig mot henne.</w:t>
+      </w:r>
+    </w:p>
+    <w:p>
+      <w:r>
+        <w:t>”Hur kan de bara inte synas?”</w:t>
+      </w:r>
+    </w:p>
+    <w:p>
+      <w:r>
+        <w:t>Sonya ryckte lätt på axlarna.</w:t>
+      </w:r>
+    </w:p>
+    <w:p>
+      <w:r>
+        <w:t>”Jag vet inte exakt hur det fungerar. De blir väldigt svåra att urskilja i dagsljus, särskilt när de håller sig nära trädet och vattenfallen. De är genomskinliga redan från början, och när ljuset är starkt är det lätt att titta rakt igenom dem utan att lägga märke till att de finns där.”</w:t>
+      </w:r>
+    </w:p>
+    <w:p>
+      <w:r>
+        <w:t>Myr såg åter upp mot nattglidarna. Nu när han visste att de hade funnits där hela dagen försökte han föreställa sig hur många han hade passerat utan att upptäcka. Kanske hade de svävat mellan grenarna medan han stod och beundrade trädet. Kanske hade någon av dem flugit precis ovanför honom när han gick över gården.</w:t>
+      </w:r>
+    </w:p>
+    <w:p>
+      <w:r>
+        <w:t>Det var en märklig tanke. Han hade trott att han redan hade sett en stor del av det som fanns omkring akademin, men mörkret hade avslöjat något som hade varit där hela tiden.</w:t>
+      </w:r>
+    </w:p>
+    <w:p>
+      <w:r>
+        <w:t>Han fortsatte att betrakta dem en stund. Det lila skenet från trädet speglades i deras kroppar när de gled genom luften, och ibland var de nästan omöjliga att skilja från de ljusa vattenströmmarna bakom dem. De rörde sig mellan grenarna, över taken och ut mot de mörka klipporna, som om hela området var deras naturliga hem.</w:t>
+      </w:r>
+    </w:p>
+    <w:p>
+      <w:r>
+        <w:lastRenderedPageBreak/>
+        <w:t>För första gången den dagen kände Myr inte något behov av att genast ställa ännu en fråga. Han ville bara stå kvar och se på dem.</w:t>
+      </w:r>
+    </w:p>
+    <w:p>
+      <w:r>
+        <w:t>Myr stod kvar en stund till och följde nattglidarna med blicken. De tycktes aldrig flyga samma väg två gånger. En av de större gled ut från trädets krona, svängde runt en av de tjockare grenarna och försvann bakom ett vattenfall, medan två mindre följde efter varandra genom en öppning mellan bladen.</w:t>
+      </w:r>
+    </w:p>
+    <w:p>
+      <w:r>
+        <w:t>”Vi borde nog ge oss av”, sade Sonya till slut. ”Annars blir det sent innan vi kommer hem.”</w:t>
+      </w:r>
+    </w:p>
+    <w:p>
+      <w:r>
+        <w:t>Myr nickade, även om han gärna hade stannat längre. De lämnade den inre gården och gick mot platsen där de hade ställt kvasten tidigare. Under vägen kastade han flera blickar tillbaka mot trädet. Det lila ljuset syntes mellan byggnaderna, och vattenfallen fortsatte att lysa längs bergssidan.</w:t>
+      </w:r>
+    </w:p>
+    <w:p>
+      <w:r>
+        <w:t>När de kom fram till kvasten satte Sonya sig först. Myr slog sig ner bakom henne och gjorde sig redo att lyfta, men i stället för att styra ut från akademin vände Sonya kvasten mot trädet.</w:t>
+      </w:r>
+    </w:p>
+    <w:p>
+      <w:r>
+        <w:t>”Vi tar en liten omväg”, sade hon.</w:t>
+      </w:r>
+    </w:p>
+    <w:p>
+      <w:r>
+        <w:t>Innan Myr hann fråga vad hon menade hade de stigit upp över gården. Sonya styrde dem mot de lägre grenarna, där flera nattglidare rörde sig mellan de lila bladen. De kom närmare en av de större varelserna, som gled fram längs en gren med vingarna utsträckta. I det lila skenet såg den nästan ut att vara gjord av glas, med ljus som löpte längs kroppen när den rörde sig.</w:t>
+      </w:r>
+    </w:p>
+    <w:p>
+      <w:r>
+        <w:t>Sonya saktade ner och lät kvasten följa efter varelsen en bit. Sedan svängde hon mellan två grenar och fortsatte in i den öppnare delen av kronan. Myr höll sig fast medan de gled förbi blad som lyste alldeles intill dem. Vattnet rann över grenarna och föll ner i strömmande slöjor runt omkring, och nattglidarna flög mellan vattenstråken utan att verka störas av dem.</w:t>
+      </w:r>
+    </w:p>
+    <w:p>
+      <w:r>
+        <w:t>En mindre nattglidare kom plötsligt ut från en tät del av kronan och passerade framför kvasten. Myr hann se dess smala huvud och de genomskinliga vingarna innan den vek av uppåt. Han vred på huvudet för att följa den, men fick genast syn på en annan som flög parallellt med dem längre bort.</w:t>
+      </w:r>
+    </w:p>
+    <w:p>
+      <w:r>
+        <w:t>Sonya förde kvasten genom en öppning mellan grenarna och lät dem cirkla runt en av de större. Varelsen svängde undan, men fortsatte sedan sin flykt åt samma håll som de. Under några ögonblick rörde de sig nästan tillsammans, kvasten och nattglidaren, innan varelsen vek av mot en högre del av trädet.</w:t>
+      </w:r>
+    </w:p>
+    <w:p>
+      <w:r>
+        <w:t xml:space="preserve">Myr kunde inte låta bli att le. Det var en sak att se varelserna från gården, men här uppe kunde han urskilja detaljer som han inte hade lagt märke till tidigare. De tunna vingarna </w:t>
+      </w:r>
+      <w:r>
+        <w:lastRenderedPageBreak/>
+        <w:t>var inte helt släta, utan hade fina linjer som förgrenade sig ut mot kanterna. Kropparna tycktes skifta i genomskinlighet när de passerade framför vatten och blad, ibland nästan försvinna och sedan bli tydliga igen när de kom ut i det öppna.</w:t>
+      </w:r>
+    </w:p>
+    <w:p>
+      <w:r>
+        <w:t>”Du verkar tycka om dem”, sade Sonya.</w:t>
+      </w:r>
+    </w:p>
+    <w:p>
+      <w:r>
+        <w:t>”De är otroliga. Hur länge har de funnits här?”</w:t>
+      </w:r>
+    </w:p>
+    <w:p>
+      <w:r>
+        <w:t>”Det vet jag inte. De har funnits här så länge jag kan minnas, och jag har aldrig hört någon säga att de skulle vara nya.”</w:t>
+      </w:r>
+    </w:p>
+    <w:p>
+      <w:r>
+        <w:t>Hon styrde kvasten runt ännu en gren. En av nattglidarna flög ovanför dem och försvann in i den lila kronan, medan en annan gled ner mot ett vattenfall och följde strömmen en bit innan den vek av.</w:t>
+      </w:r>
+    </w:p>
+    <w:p>
+      <w:r>
+        <w:t>Efter ytterligare en sväng började Sonya styra dem bort från trädet. De passerade utanför de högsta grenarna och fick åter syn på akademins torn, som nu mest syntes som mörka former mot himlen. Bakom dem lyste trädet fortfarande starkt, men för varje meter de flög bort blev ljuset svagare.</w:t>
+      </w:r>
+    </w:p>
+    <w:p>
+      <w:r>
+        <w:t>Snart låg akademin bakom dem. Vattenfallen syntes ännu mellan klipporna, men deras sken nådde inte särskilt långt ut i landskapet. När de fortsatte bort från berget blev mörkret tätare, och Myr fick allt svårare att urskilja marken nedanför. De flög över ett område där klippor och kullar bara kunde anas som mörka skuggor. Himlen gav inte mycket ljus, och det fanns inga tydliga landmärken som han kunde använda för att förstå vart de var på väg.</w:t>
+      </w:r>
+    </w:p>
+    <w:p>
+      <w:r>
+        <w:t>Myr lutade sig lite närmare Sonya.</w:t>
+      </w:r>
+    </w:p>
+    <w:p>
+      <w:r>
+        <w:t>”Ser du ens vart vi flyger?”</w:t>
+      </w:r>
+    </w:p>
+    <w:p>
+      <w:r>
+        <w:t>”Tillräckligt bra.”</w:t>
+      </w:r>
+    </w:p>
+    <w:p>
+      <w:r>
+        <w:t>Han försökte titta framåt, men kunde knappt urskilja något alls. Det kändes som om de flög rakt ut i ett mörkt tomrum.</w:t>
+      </w:r>
+    </w:p>
+    <w:p>
+      <w:r>
+        <w:t xml:space="preserve">”Men hur vet du vart vi ska? Kommer du verkligen att hitta din </w:t>
+      </w:r>
+      <w:proofErr w:type="spellStart"/>
+      <w:r>
+        <w:t>Mansor</w:t>
+      </w:r>
+      <w:proofErr w:type="spellEnd"/>
+      <w:r>
+        <w:t>?”</w:t>
+      </w:r>
+    </w:p>
+    <w:p>
+      <w:r>
+        <w:t>Sonya skrattade till, utan att vända sig om.</w:t>
+      </w:r>
+    </w:p>
+    <w:p>
+      <w:r>
+        <w:t xml:space="preserve">”Ja, det kommer jag. Man får en mental koppling till sin </w:t>
+      </w:r>
+      <w:proofErr w:type="spellStart"/>
+      <w:r>
+        <w:t>Mansor</w:t>
+      </w:r>
+      <w:proofErr w:type="spellEnd"/>
+      <w:r>
+        <w:t>. Jag kan nästan alltid känna var den befinner sig.”</w:t>
+      </w:r>
+    </w:p>
+    <w:p>
+      <w:r>
+        <w:t>Myr såg ut över mörkret igen.</w:t>
+      </w:r>
+    </w:p>
+    <w:p>
+      <w:r>
+        <w:t>”Du kan alltså känna var den är, även om du inte ser den?”</w:t>
+      </w:r>
+    </w:p>
+    <w:p>
+      <w:r>
+        <w:t>”Precis. Det är inte så att jag får en karta i huvudet, men jag känner åt vilket håll jag behöver ta mig. Och när jag kommer närmare blir det lättare att hitta rätt.”</w:t>
+      </w:r>
+    </w:p>
+    <w:p>
+      <w:r>
+        <w:lastRenderedPageBreak/>
+        <w:t xml:space="preserve">Han försökte föreställa sig hur det skulle kännas att ha en sådan koppling till ett levande hus. </w:t>
+      </w:r>
+      <w:proofErr w:type="spellStart"/>
+      <w:r>
+        <w:t>Mansorerna</w:t>
+      </w:r>
+      <w:proofErr w:type="spellEnd"/>
+      <w:r>
+        <w:t xml:space="preserve"> hade redan varit märkliga nog när han sett dem sväva över landskapet under dagen. Att kunna känna var en av dem befann sig, nästan oberoende av avstånd och sikt, gjorde dem ännu mer främmande.</w:t>
+      </w:r>
+    </w:p>
+    <w:p>
+      <w:r>
+        <w:t xml:space="preserve">”Gäller det alla som bor i en </w:t>
+      </w:r>
+      <w:proofErr w:type="spellStart"/>
+      <w:r>
+        <w:t>Mansor</w:t>
+      </w:r>
+      <w:proofErr w:type="spellEnd"/>
+      <w:r>
+        <w:t>?” frågade han.</w:t>
+      </w:r>
+    </w:p>
+    <w:p>
+      <w:r>
+        <w:t>”Såvitt jag vet. Kopplingen är olika stark för olika personer, men den brukar räcka för att hitta hem.”</w:t>
+      </w:r>
+    </w:p>
+    <w:p>
+      <w:r>
+        <w:t>Myr höll sig fast och lät blicken vila på Sonya, som verkade helt obekymrad över att de flög genom mörkret. För henne var det uppenbarligen inget märkligt. Hon följde sin inre känsla lika naturligt som hon hade följt vägen mellan akademins byggnader tidigare under dagen.</w:t>
+      </w:r>
+    </w:p>
+    <w:p>
+      <w:r>
+        <w:t>Själv kunde han fortfarande knappt förstå hur hon visste vart de skulle. Men han behövde inte vänta särskilt länge på att få se om hon hade rätt.</w:t>
+      </w:r>
+    </w:p>
+    <w:p>
+      <w:r>
+        <w:t xml:space="preserve">Ljuset från verandan blev tydligare ju närmare de kom. Myr kunde nu se att det inte bara kom från fönstren. En koffert stod placerad intill dörren, upplyst av ett svagt sken som föll ut genom ett av rummen. Den måste vara den som </w:t>
+      </w:r>
+      <w:proofErr w:type="spellStart"/>
+      <w:r>
+        <w:t>Elarion</w:t>
+      </w:r>
+      <w:proofErr w:type="spellEnd"/>
+      <w:r>
+        <w:t xml:space="preserve"> hade sagt skulle levereras under dagen.</w:t>
+      </w:r>
+    </w:p>
+    <w:p>
+      <w:r>
+        <w:t>Sonya styrde kvasten mot verandan och landade mjukt. Myr steg av och sträckte på benen efter flygturen. Han kastade en sista blick ut över mörkret innan han följde efter Sonya in.</w:t>
+      </w:r>
+    </w:p>
+    <w:p>
+      <w:r>
+        <w:t xml:space="preserve">”Jag ska bara lägga undan mina saker”, sade han och lyfte kassen han hade fått av </w:t>
+      </w:r>
+      <w:proofErr w:type="spellStart"/>
+      <w:r>
+        <w:t>Elarion</w:t>
+      </w:r>
+      <w:proofErr w:type="spellEnd"/>
+      <w:r>
+        <w:t>.</w:t>
+      </w:r>
+    </w:p>
+    <w:p>
+      <w:r>
+        <w:t>Sonya nickade och visade honom mot rummet där han hade sovit tidigare. Han gick in, ställde kassen på sängen och såg sig omkring. Rummet kändes redan lite mer bekant än det hade gjort tidigare på dagen, även om det fortfarande var märkligt att tänka på det som sitt eget.</w:t>
+      </w:r>
+    </w:p>
+    <w:p>
+      <w:r>
+        <w:t>Han gick ut igen och hämtade kofferten från verandan. Den var tyngre än han hade väntat sig, men han lyckades bära in den och ställa den bredvid sängen. När han öppnade den låg kläderna prydligt vikta i olika högar. Där fanns byxor, tröjor, skjortor och några plagg vars snitt han inte riktigt kände igen. Allt såg ut att vara anpassat för honom, även om han inte visste hur någon hade kunnat ordna det så snabbt.</w:t>
+      </w:r>
+    </w:p>
+    <w:p>
+      <w:r>
+        <w:t>Myr började plocka upp kläderna och lade dem i byrån som stod nära sängen. Den var tillverkad av ett mörkt material med en slät yta, och lådorna gled nästan ljudlöst när han öppnade och stängde dem. Han lade tröjorna i en låda, byxorna i en annan och försökte hålla ordning på de plagg han ännu inte visste när han skulle använda.</w:t>
+      </w:r>
+    </w:p>
+    <w:p>
+      <w:r>
+        <w:lastRenderedPageBreak/>
+        <w:t>Det slog honom hur många saker i rummet som påminde om sådant han var van vid hemifrån. Sängen, stolen, byrån och det lilla bordet vid fönstret hade alla motsvarigheter i hans gamla värld. De såg inte riktigt likadana ut, men deras funktioner var uppenbara. Han undrade hur mycket av det som berodde på att människor och andra varelser helt enkelt behövde samma sorts saker, och hur mycket som kunde ha utvecklats på liknande sätt av en slump.</w:t>
+      </w:r>
+    </w:p>
+    <w:p>
+      <w:r>
+        <w:t>Han stannade med en skjorta i handen och såg sig omkring. Det var lätt att känna sig främmande i den här världen när han såg trädet, nattglidarna eller de levande husen. Men en byrå var fortfarande en byrå, även om den var byggd av ett material han inte kände igen.</w:t>
+      </w:r>
+    </w:p>
+    <w:p>
+      <w:r>
+        <w:t>När den sista högen var undanlagd vek han ihop den tomma kofferten och ställde den åt sidan. Han skulle kunna fundera mer på allt det där en annan gång. Just nu var han trött och hungrig.</w:t>
+      </w:r>
+    </w:p>
+    <w:p>
+      <w:r>
+        <w:t>Sonya dök upp i dörröppningen strax därefter.</w:t>
+      </w:r>
+    </w:p>
+    <w:p>
+      <w:r>
+        <w:t>”Är du färdig?”</w:t>
+      </w:r>
+    </w:p>
+    <w:p>
+      <w:r>
+        <w:t>”Ja, jag tror det.”</w:t>
+      </w:r>
+    </w:p>
+    <w:p>
+      <w:r>
+        <w:t>”Bra. Vill du äta lite innan det blir för sent?”</w:t>
+      </w:r>
+    </w:p>
+    <w:p>
+      <w:r>
+        <w:t>Myr märkte först då hur hungrig han faktiskt var. Han nickade och följde med henne till det större rummet, där hon hade ordnat fram mat. De åt tillsammans medan ljuset från fönstren föll över bordet. Maten var annorlunda än den han brukade äta hemma, men tillräckligt bekant för att han inte skulle behöva fundera särskilt mycket på vad han hade framför sig. Den svaga metalliska eftersmaken han hade lagt märke till tidigare fanns där igen.</w:t>
+      </w:r>
+    </w:p>
+    <w:p>
+      <w:r>
+        <w:t xml:space="preserve">Samtalet var lugnt och handlade mest om praktiska saker. Sonya berättade var han kunde hitta sådant han behövde i huset och vilka delar av </w:t>
+      </w:r>
+      <w:proofErr w:type="spellStart"/>
+      <w:r>
+        <w:t>Mansoren</w:t>
+      </w:r>
+      <w:proofErr w:type="spellEnd"/>
+      <w:r>
+        <w:t xml:space="preserve"> han gärna fick använda. Myr lyssnade och försökte komma ihåg allt, men efter en stund märkte han att han hade börjat gäspa.</w:t>
+      </w:r>
+    </w:p>
+    <w:p>
+      <w:r>
+        <w:t>När de hade ätit färdigt lutade han sig tillbaka och drog handen över ansiktet.</w:t>
+      </w:r>
+    </w:p>
+    <w:p>
+      <w:r>
+        <w:t>”Jag önskar att jag kunde tvätta mig innan jag går och lägger mig.”</w:t>
+      </w:r>
+    </w:p>
+    <w:p>
+      <w:r>
+        <w:t>”Det kan du förstås”, sade Sonya och reste sig. ”Kom, så visar jag dig.”</w:t>
+      </w:r>
+    </w:p>
+    <w:p>
+      <w:r>
+        <w:t>Han följde efter henne genom en kort korridor till ett mindre rum. Det liknade inte riktigt ett badrum hemma, även om han genast förstod att det var avsett för samma sak. Det fanns ingen dusch eller något badkar, bara en fri yta framför väggen och en slät panel som nästan smälte samman med resten av rummet.</w:t>
+      </w:r>
+    </w:p>
+    <w:p>
+      <w:r>
+        <w:lastRenderedPageBreak/>
+        <w:t>Sonya gick fram till väggen och lade handen mot en del av ytan. Efter ett ögonblick började något vitt komma fram ur en smal öppning. Det växte snabbt till ett mjukt skum som lade sig i en hög på den plana ytan framför dem.</w:t>
+      </w:r>
+    </w:p>
+    <w:p>
+      <w:r>
+        <w:t>Myr tog ett steg närmare.</w:t>
+      </w:r>
+    </w:p>
+    <w:p>
+      <w:r>
+        <w:t>”Vad är det där?”</w:t>
+      </w:r>
+    </w:p>
+    <w:p>
+      <w:r>
+        <w:t>”Det är det du använder för att tvätta dig.”</w:t>
+      </w:r>
+    </w:p>
+    <w:p>
+      <w:r>
+        <w:t>Han betraktade skummet. Det såg ut som vanligt tvålskum, men det fortsatte att komma fram utan att någon behållare tömdes. När Sonya strök handen genom det delade det sig och lade sig sedan åter till rätta.</w:t>
+      </w:r>
+    </w:p>
+    <w:p>
+      <w:r>
+        <w:t>”Hur fungerar det?”</w:t>
+      </w:r>
+    </w:p>
+    <w:p>
+      <w:r>
+        <w:t xml:space="preserve">”Det är en av </w:t>
+      </w:r>
+      <w:proofErr w:type="spellStart"/>
+      <w:r>
+        <w:t>Mansorens</w:t>
+      </w:r>
+      <w:proofErr w:type="spellEnd"/>
+      <w:r>
+        <w:t xml:space="preserve"> funktioner. Den kan ta hand om sådant som vi behöver i vardagen.” Hon pekade på skummet. ”Du använder det för att rengöra kroppen. När du är färdig drar det sig undan igen och absorberas av väggen.”</w:t>
+      </w:r>
+    </w:p>
+    <w:p>
+      <w:r>
+        <w:t xml:space="preserve">Myr såg på öppningen där skummet hade kommit fram. Han hade vant sig vid att </w:t>
+      </w:r>
+      <w:proofErr w:type="spellStart"/>
+      <w:r>
+        <w:t>Mansoren</w:t>
+      </w:r>
+      <w:proofErr w:type="spellEnd"/>
+      <w:r>
+        <w:t xml:space="preserve"> var levande, men det var fortfarande svårt att föreställa sig att ett hus kunde ha funktioner som dessa.</w:t>
+      </w:r>
+    </w:p>
+    <w:p>
+      <w:r>
+        <w:t>”Så den gör det här själv?”</w:t>
+      </w:r>
+    </w:p>
+    <w:p>
+      <w:r>
+        <w:t xml:space="preserve">”Ja. Det är bra för oss, eftersom vi kan hålla oss rena utan att behöva ordna allt på egen hand. Men det är bra för </w:t>
+      </w:r>
+      <w:proofErr w:type="spellStart"/>
+      <w:r>
+        <w:t>Mansoren</w:t>
+      </w:r>
+      <w:proofErr w:type="spellEnd"/>
+      <w:r>
+        <w:t xml:space="preserve"> också. Det här är en av sakerna den livnär sig på.”</w:t>
+      </w:r>
+    </w:p>
+    <w:p>
+      <w:r>
+        <w:t>Myr vände sig mot henne.</w:t>
+      </w:r>
+    </w:p>
+    <w:p>
+      <w:r>
+        <w:t>”Den äter skum?”</w:t>
+      </w:r>
+    </w:p>
+    <w:p>
+      <w:r>
+        <w:t>Sonya skrattade till.</w:t>
+      </w:r>
+    </w:p>
+    <w:p>
+      <w:r>
+        <w:t xml:space="preserve">”Inte riktigt. Det är inte själva skummet som är viktigt, utan det som följer med när det används. </w:t>
+      </w:r>
+      <w:proofErr w:type="spellStart"/>
+      <w:r>
+        <w:t>Mansoren</w:t>
+      </w:r>
+      <w:proofErr w:type="spellEnd"/>
+      <w:r>
+        <w:t xml:space="preserve"> kan ta </w:t>
+      </w:r>
+      <w:proofErr w:type="gramStart"/>
+      <w:r>
+        <w:t>till vara</w:t>
+      </w:r>
+      <w:proofErr w:type="gramEnd"/>
+      <w:r>
+        <w:t xml:space="preserve"> på sådant som vi inte behöver längre. Jag vet inte exakt hur den gör, men det är en del av hur den håller sig vid liv.”</w:t>
+      </w:r>
+    </w:p>
+    <w:p>
+      <w:r>
+        <w:t xml:space="preserve">Myr tittade på skummet igen. Det hade han inte väntat sig. Han hade tänkt på </w:t>
+      </w:r>
+      <w:proofErr w:type="spellStart"/>
+      <w:r>
+        <w:t>Mansoren</w:t>
+      </w:r>
+      <w:proofErr w:type="spellEnd"/>
+      <w:r>
+        <w:t xml:space="preserve"> som ett levande hus, men mest som en varelse som råkade ha rum, fönster och en veranda. Nu började han förstå att själva boendet också var en del av dess kropp och sätt att leva.</w:t>
+      </w:r>
+    </w:p>
+    <w:p>
+      <w:r>
+        <w:t>”Vill du att vi tvättar oss samtidigt?” frågade Sonya.</w:t>
+      </w:r>
+    </w:p>
+    <w:p>
+      <w:r>
+        <w:t>Myr vände sig mot henne och blev stående utan att svara. Han var inte säker på om han hade hört rätt.</w:t>
+      </w:r>
+    </w:p>
+    <w:p>
+      <w:r>
+        <w:t>”Vad menar du?”</w:t>
+      </w:r>
+    </w:p>
+    <w:p>
+      <w:r>
+        <w:lastRenderedPageBreak/>
+        <w:t>”Att vi tvättar oss samtidigt. Det är enklare än att vänta på varandra.”</w:t>
+      </w:r>
+    </w:p>
+    <w:p>
+      <w:r>
+        <w:t>Hon sade det så självklart att han först trodde att hon skämtade. Men Sonya såg inte ut att skämta. I stället började hon lossa på sina kläder, som om det inte fanns något märkligt alls med förslaget.</w:t>
+      </w:r>
+    </w:p>
+    <w:p>
+      <w:r>
+        <w:t>Myr stirrade på henne i ren förbluffelse. Han vände snabbt bort blicken och backade mot dörren.</w:t>
+      </w:r>
+    </w:p>
+    <w:p>
+      <w:r>
+        <w:t>”Jag… jag kan vänta utanför.”</w:t>
+      </w:r>
+    </w:p>
+    <w:p>
+      <w:r>
+        <w:t>”Varför då?” frågade Sonya och såg uppriktigt förvånad ut.</w:t>
+      </w:r>
+    </w:p>
+    <w:p>
+      <w:r>
+        <w:t>Myr hade redan fått upp dörren.</w:t>
+      </w:r>
+    </w:p>
+    <w:p>
+      <w:r>
+        <w:t>”Du kan börja. Jag kommer senare!”</w:t>
+      </w:r>
+    </w:p>
+    <w:p>
+      <w:r>
+        <w:t>Han skyndade ut i korridoren och stängde dörren bakom sig. Först när han stod ensam där insåg han hur snabbt han hade reagerat. Han stod kvar med ena handen på dörrhandtaget och försökte samla tankarna.</w:t>
+      </w:r>
+    </w:p>
+    <w:p>
+      <w:r>
+        <w:t>Efter en liten stund hörde han Sonya ropa inifrån rummet.</w:t>
+      </w:r>
+    </w:p>
+    <w:p>
+      <w:r>
+        <w:t>”Myr? Vill du inte tvätta dig samtidigt?”</w:t>
+      </w:r>
+    </w:p>
+    <w:p>
+      <w:r>
+        <w:t>Han drog ett djupt andetag innan han svarade.</w:t>
+      </w:r>
+    </w:p>
+    <w:p>
+      <w:r>
+        <w:t>”Människor som inte är tillsammans brukar inte göra så!”</w:t>
+      </w:r>
+    </w:p>
+    <w:p>
+      <w:r>
+        <w:t>Det blev tyst en kort stund.</w:t>
+      </w:r>
+    </w:p>
+    <w:p>
+      <w:r>
+        <w:t>”Men vi är ju på samma ställe”, svarade Sonya. ”Är vi inte tillsammans då?”</w:t>
+      </w:r>
+    </w:p>
+    <w:p>
+      <w:r>
+        <w:t>Myr slöt ögonen. Han visste inte hur han skulle förklara det utan att göra situationen ännu märkligare.</w:t>
+      </w:r>
+    </w:p>
+    <w:p>
+      <w:r>
+        <w:t>”Jag menar inte att vi bara råkar befinna oss i samma rum. Jag menar att människor brukar göra sådant tillsammans när de är… när de har ett förhållande.”</w:t>
+      </w:r>
+    </w:p>
+    <w:p>
+      <w:r>
+        <w:t>”Ett förhållande?” Sonya lät mer nyfiken än generad. ”Vad har det med att tvätta sig att göra?”</w:t>
+      </w:r>
+    </w:p>
+    <w:p>
+      <w:r>
+        <w:t>Myr öppnade munnen, men fick inte fram något svar direkt. Han hade aldrig behövt förklara något sådant här förut. Hemma hade han tagit för givet att det fanns saker som människor bara gjorde privat, och att man inte behövde diskutera varför.</w:t>
+      </w:r>
+    </w:p>
+    <w:p>
+      <w:r>
+        <w:t>”Det är… personligt”, fick han till slut fram.</w:t>
+      </w:r>
+    </w:p>
+    <w:p>
+      <w:r>
+        <w:t>”På vilket sätt?”</w:t>
+      </w:r>
+    </w:p>
+    <w:p>
+      <w:r>
+        <w:lastRenderedPageBreak/>
+        <w:t>Han lutade pannan mot väggen och undrade om han någonsin skulle lyckas ta sig ur den här diskussionen.</w:t>
+      </w:r>
+    </w:p>
+    <w:p>
+      <w:r>
+        <w:t>”Man vill inte att vem som helst ska se en naken.”</w:t>
+      </w:r>
+    </w:p>
+    <w:p>
+      <w:r>
+        <w:t>”Varför inte?”</w:t>
+      </w:r>
+    </w:p>
+    <w:p>
+      <w:r>
+        <w:t>Frågan kom utan minsta antydan till retlighet. Sonya verkade verkligen inte förstå vad han menade.</w:t>
+      </w:r>
+    </w:p>
+    <w:p>
+      <w:r>
+        <w:t>Myr vände sig bort från dörren och stirrade ner i golvet.</w:t>
+      </w:r>
+    </w:p>
+    <w:p>
+      <w:r>
+        <w:t>”För att det känns obekvämt. Man vill ha lite privatliv.”</w:t>
+      </w:r>
+    </w:p>
+    <w:p>
+      <w:r>
+        <w:t>Det blev tyst igen. Den här gången dröjde det längre innan Sonya svarade.</w:t>
+      </w:r>
+    </w:p>
+    <w:p>
+      <w:r>
+        <w:t>”Jag tror att jag förstår vad du menar”, sade hon till slut, men tonen avslöjade att hon fortfarande försökte få ihop hans förklaring med sin egen uppfattning. ”Men häxor och trollkarlar brukar inte tänka på det på samma sätt. Vi har inte riktigt förhållanden så som du beskriver dem. Åtminstone inte på det sättet att man måste vara särskilt utvald för att få dela sådana saker.”</w:t>
+      </w:r>
+    </w:p>
+    <w:p>
+      <w:r>
+        <w:t>Myr lyfte huvudet.</w:t>
+      </w:r>
+    </w:p>
+    <w:p>
+      <w:r>
+        <w:t>”Ni har inte förhållanden?”</w:t>
+      </w:r>
+    </w:p>
+    <w:p>
+      <w:r>
+        <w:t>”Inte som ni verkar ha dem i människornas värld. Vi kan tycka om varandra, förstås, och vi kan välja att tillbringa mycket tid tillsammans. Men det finns ingen självklar regel som säger att man bara får göra vissa saker med en enda person.” Hon gjorde en kort paus. ”Jag visste inte att det var så viktigt för dig.”</w:t>
+      </w:r>
+    </w:p>
+    <w:p>
+      <w:r>
+        <w:t>Myr visste inte vad han skulle säga. Han hade väntat sig att Sonya skulle bli generad när han sprang ut, eller åtminstone förstå att han ville vara ensam. I stället hade han hamnat i en diskussion om hur människor och häxor såg på närhet, och han var inte ens säker på att han själv kunde förklara alla skillnaderna.</w:t>
+      </w:r>
+    </w:p>
+    <w:p>
+      <w:r>
+        <w:t>”Det är inte så att jag tycker att du har gjort något fel”, sade han till slut. ”Jag blev bara överraskad.”</w:t>
+      </w:r>
+    </w:p>
+    <w:p>
+      <w:r>
+        <w:t>”Det märkte jag.”</w:t>
+      </w:r>
+    </w:p>
+    <w:p>
+      <w:r>
+        <w:t>Han kunde nästan höra leendet i hennes röst.</w:t>
+      </w:r>
+    </w:p>
+    <w:p>
+      <w:r>
+        <w:t>”Du behöver inte skämmas för det, Myr. Jag försökte bara hjälpa dig.”</w:t>
+      </w:r>
+    </w:p>
+    <w:p>
+      <w:r>
+        <w:t>”Jag vet.”</w:t>
+      </w:r>
+    </w:p>
+    <w:p>
+      <w:r>
+        <w:t>Han stod kvar en stund till innan han försiktigt frågade:</w:t>
+      </w:r>
+    </w:p>
+    <w:p>
+      <w:r>
+        <w:t>”Är du färdig snart?”</w:t>
+      </w:r>
+    </w:p>
+    <w:p>
+      <w:r>
+        <w:lastRenderedPageBreak/>
+        <w:t>”Jag är nästan klar. Du kan komma in när du vill, så visar jag dig hur du gör.”</w:t>
+      </w:r>
+    </w:p>
+    <w:p>
+      <w:r>
+        <w:t>Myr väntade tills han hörde att hon hade lämnat rummet innan han öppnade dörren på glänt och tittade in. Sonya hade klätt på sig igen och stod vid väggen. Det vita skummet hade nästan helt försvunnit. Tunna stråk drog sig tillbaka mot öppningen, där de långsamt absorberades tills ytan såg ut som förut.</w:t>
+      </w:r>
+    </w:p>
+    <w:p>
+      <w:r>
+        <w:t>Hon pekade på den plats där skummet hade kommit fram och förklarade hur han skulle använda det. Myr lyssnade noggrant, tacksam över att hon nu höll sig till det praktiska. Han behövde bara göra som hon visade och låta skummet rengöra kroppen innan det drog sig tillbaka av sig självt.</w:t>
+      </w:r>
+    </w:p>
+    <w:p>
+      <w:r>
+        <w:t>”Du behöver inte vara rädd för att göra fel”, sade Sonya. ”</w:t>
+      </w:r>
+      <w:proofErr w:type="spellStart"/>
+      <w:r>
+        <w:t>Mansoren</w:t>
+      </w:r>
+      <w:proofErr w:type="spellEnd"/>
+      <w:r>
+        <w:t xml:space="preserve"> är van vid att ta hand om oss.”</w:t>
+      </w:r>
+    </w:p>
+    <w:p>
+      <w:r>
+        <w:t>”Jag är inte rädd”, svarade Myr lite för snabbt.</w:t>
+      </w:r>
+    </w:p>
+    <w:p>
+      <w:r>
+        <w:t>Sonya höjde ögonbrynen, men sade inget mer om saken.</w:t>
+      </w:r>
+    </w:p>
+    <w:p>
+      <w:r>
+        <w:t>När hon lämnat rummet stängde Myr dörren och började tvätta sig. Skummet var mjukare än han hade väntat sig och kändes först svalt mot huden, men efter en stund blev känslan behaglig. Det rengjorde utan att han behövde gnugga särskilt mycket, och när han var färdig började det dra sig undan. Det gled långsamt över huden och försvann sedan mot väggen, där det absorberades tills inte ett spår fanns kvar.</w:t>
+      </w:r>
+    </w:p>
+    <w:p>
+      <w:r>
+        <w:t>Myr stod stilla en stund och försökte förstå vad han just hade upplevt. Han hade kommit till en värld där hus kunde leva, där böcker dokumenterade minnen och där människor kunde flyga genom mörkret genom att känna var deras hem befann sig. Nu hade han dessutom fått förklara för Sonya varför han inte ville tvätta sig tillsammans med henne, och upptäckt att det som kändes självklart för honom inte alls var självklart här.</w:t>
+      </w:r>
+    </w:p>
+    <w:p>
+      <w:r>
+        <w:t>Han torkade sig och gick tillbaka till sitt rum. Sonya befann sig i det större rummet när han passerade, men hon verkade inte vilja ta upp diskussionen igen. Hon önskade honom god natt, och Myr svarade innan han gick in till sig.</w:t>
+      </w:r>
+    </w:p>
+    <w:p>
+      <w:r>
+        <w:t>När han stängde dörren bakom sig kunde han inte låta bli att le lite åt det hela. Dagen hade varit full av saker han inte förstått, och tydligen skulle även de enklaste vardagssysslorna kunna bli till lektioner i hur annorlunda den här världen var.</w:t>
+      </w:r>
+    </w:p>
+    <w:p>
+      <w:r>
+        <w:t>Han satte sig på sängkanten och såg på byrån där han hade lagt sina kläder. Allt såg nästan vanligt ut. Sängen, möblerna och kläderna skulle ha kunnat finnas i hans gamla värld, men ingenting runt omkring dem fungerade riktigt som hemma.</w:t>
+      </w:r>
+    </w:p>
+    <w:p>
+      <w:r>
+        <w:t>Han lade sig ner och drog täcket över sig. Tankarna fortsatte en stund, från de lysande nattglidarna till de märkliga sidorna i klassrummet och Sonyas oförstående frågor. Han hade fått fler svar än han kunde ta in under en enda dag, men också fler frågor.</w:t>
+      </w:r>
+    </w:p>
+    <w:p>
+      <w:r>
+        <w:lastRenderedPageBreak/>
+        <w:t>Till slut blev tankarna långsammare. Ljudet från vattnet nådde honom svagt genom väggarna, och den välbekanta känslan av lugn kom tillbaka. Han slöt ögonen och lät sömnen ta över.</w:t>
+      </w:r>
+    </w:p>
+    <w:p/>
+    <w:p/>
+    <w:p/>
+    <w:p/>
+    <w:p/>
+    <w:p/>
+    <w:p/>
+    <w:p/>
+    <w:p/>
+    <w:p/>
+    <w:p/>
+    <w:p/>
+    <w:p/>
+    <w:p/>
+    <w:p/>
+    <w:p/>
+    <w:p/>
+    <w:p/>
+    <w:p/>
+    <w:p/>
+    <w:p/>
+    <w:p/>
+    <w:p/>
+    <w:p/>
+    <w:p/>
+    <w:p/>
+    <w:p>
+      <w:pPr>
+        <w:rPr>
+          <w:b/>
+          <w:bCs/>
+          <w:sz w:val="36"/>
+          <w:szCs w:val="36"/>
+        </w:rPr>
+      </w:pPr>
+      <w:r>
+        <w:rPr>
+          <w:b/>
+          <w:bCs/>
+          <w:sz w:val="36"/>
+          <w:szCs w:val="36"/>
+        </w:rPr>
+        <w:lastRenderedPageBreak/>
+        <w:t xml:space="preserve">Kapitel </w:t>
+      </w:r>
+      <w:r>
+        <w:rPr>
+          <w:b/>
+          <w:bCs/>
+          <w:sz w:val="36"/>
+          <w:szCs w:val="36"/>
+        </w:rPr>
+        <w:t>7</w:t>
+      </w:r>
+      <w:r>
+        <w:rPr>
+          <w:b/>
+          <w:bCs/>
+          <w:sz w:val="36"/>
+          <w:szCs w:val="36"/>
+        </w:rPr>
+        <w:t xml:space="preserve"> – </w:t>
+      </w:r>
+      <w:r>
+        <w:rPr>
+          <w:b/>
+          <w:bCs/>
+          <w:sz w:val="36"/>
+          <w:szCs w:val="36"/>
+        </w:rPr>
+        <w:t>Att bli självständig i en ny värld</w:t>
+      </w:r>
+    </w:p>
+    <w:p>
+      <w:r>
+        <w:t xml:space="preserve">Myr vaknade långsamt och låg kvar med blicken fäst vid taket. Under några sekunder visste han inte riktigt var han befann sig, men minnena från gårdagen började snart återvända. Akademin, det väldiga trädet med sina lila kronor och vattenfall, och lektionen med </w:t>
+      </w:r>
+      <w:proofErr w:type="spellStart"/>
+      <w:r>
+        <w:t>Elarion</w:t>
+      </w:r>
+      <w:proofErr w:type="spellEnd"/>
+      <w:r>
+        <w:t xml:space="preserve"> där han för första gången hade försökt skriva i den märkliga boken. Allt hade hänt under så kort tid att det fortfarande var svårt att förstå att det verkligen var hans nya vardag.</w:t>
+      </w:r>
+    </w:p>
+    <w:p>
+      <w:r>
+        <w:t>Han vände sig på sidan och såg mot fönstret. Morgonljuset föll in över golvet, och bortom glaset kunde han urskilja bergssidan och de avlägsna vattenfallen. Ljudet från det strömmande vattnet nådde honom även här inne, dämpat men ständigt närvarande. Han hade sovit gott, och för första gången på länge kände han sig någorlunda utvilad.</w:t>
+      </w:r>
+    </w:p>
+    <w:p>
+      <w:r>
+        <w:t>Tankarna fortsatte att vandra genom allt han hade upplevt sedan han kom till den här världen. Det fanns så mycket han ville lära sig. Han ville förstå hur magin fungerade, hur varelserna kunde leva på sätt som verkade omöjliga i hans gamla värld och varför så mycket här tycktes följa regler som han ännu inte kände till. Framför allt ville han bli tillräckligt självständig för att kunna ta sig runt utan att hela tiden behöva hjälp av någon annan.</w:t>
+      </w:r>
+    </w:p>
+    <w:p>
+      <w:r>
+        <w:t>Men efter en stund gled tankarna åt ett annat håll.</w:t>
+      </w:r>
+    </w:p>
+    <w:p>
+      <w:r>
+        <w:t>Familjen.</w:t>
+      </w:r>
+    </w:p>
+    <w:p>
+      <w:r>
+        <w:t>Han försökte låta bli att tänka på dem, men så fort tanken hade dykt upp började andra bilder följa efter. Han undrade vad de gjorde just nu, om de hade märkt att han var borta och vad de trodde hade hänt honom. Han visste inte ens om det var möjligt att återvända hem, än mindre hur han i så fall skulle göra det.</w:t>
+      </w:r>
+    </w:p>
+    <w:p>
+      <w:r>
+        <w:t>Myr drog täcket åt sidan och satte sig upp. Han ville inte fortsätta tänka på det. Inte nu. Han hade ingen aning om vad han skulle göra om han började fundera på allt han lämnat bakom sig, och han orkade inte försöka hitta svar på frågor som han inte ens visste om det fanns några svar på.</w:t>
+      </w:r>
+    </w:p>
+    <w:p>
+      <w:r>
+        <w:t xml:space="preserve">Han steg ur sängen, tog på sig kläderna och gick ut ur rummet. </w:t>
+      </w:r>
+      <w:proofErr w:type="spellStart"/>
+      <w:r>
+        <w:t>Mansoren</w:t>
+      </w:r>
+      <w:proofErr w:type="spellEnd"/>
+      <w:r>
+        <w:t xml:space="preserve"> var stilla. Från den större delen av bostaden kom inga ljud, och han antog att Sonya fortfarande sov. Han ville inte väcka henne, så i stället fortsatte han mot ytterdörren och öppnade den försiktigt.</w:t>
+      </w:r>
+    </w:p>
+    <w:p>
+      <w:r>
+        <w:t xml:space="preserve">Luften utanför var svalare än han hade väntat sig. Myr gick ut på verandan och stannade en stund för att se sig omkring. Därifrån hade han fri utsikt över bergssidan och det öppna landskapet bortom den. Långt nedanför föll vattnet mellan klipporna, och dimma låg kvar i några av de djupare klyftorna. Andra </w:t>
+      </w:r>
+      <w:proofErr w:type="spellStart"/>
+      <w:r>
+        <w:t>Mansorer</w:t>
+      </w:r>
+      <w:proofErr w:type="spellEnd"/>
+      <w:r>
+        <w:t xml:space="preserve"> svävade längre bort, utspridda över området. Några låg nära berget, medan andra befann sig längre ut över dalen.</w:t>
+      </w:r>
+    </w:p>
+    <w:p>
+      <w:r>
+        <w:lastRenderedPageBreak/>
+        <w:t xml:space="preserve">Han satte sig på en av de breda sittplatserna längs verandans kant. Under honom hängde </w:t>
+      </w:r>
+      <w:proofErr w:type="spellStart"/>
+      <w:r>
+        <w:t>Mansorens</w:t>
+      </w:r>
+      <w:proofErr w:type="spellEnd"/>
+      <w:r>
+        <w:t xml:space="preserve"> genomskinliga tentakler fritt i luften, och när han lutade sig fram kunde han se hur de rörde sig svagt medan huset långsamt förändrade sin position. Det var märkligt att sitta på en plats som kändes så stadig trots att hela bostaden svävade ovanför marken.</w:t>
+      </w:r>
+    </w:p>
+    <w:p>
+      <w:r>
+        <w:t>Efter en stund lät han blicken vandra tillbaka mot huset. Från utsidan var det svårt att få någon riktig uppfattning om hur rummen hängde ihop, men han hade redan börjat få en bild av planlösningen. Den centrala delen var rymlig och fungerade som en naturlig samlingsplats, med öppningar mot flera av de andra rummen. Därifrån kunde man ta sig vidare till sovrummen och andra mindre utrymmen, medan fönstren och dörrarna mot verandan släppte in ljus från flera håll. Det fanns gott om plats att röra sig utan att bostaden kändes onödigt uppdelad.</w:t>
+      </w:r>
+    </w:p>
+    <w:p>
+      <w:r>
+        <w:t xml:space="preserve">Myr hade ännu inte hunnit undersöka alla rum ordentligt. Det hade inte funnits någon anledning att göra det kvällen innan, när han varit trött efter dagens alla intryck. Nu när han tänkte på det insåg han att han knappt visste hur stor </w:t>
+      </w:r>
+      <w:proofErr w:type="spellStart"/>
+      <w:r>
+        <w:t>Mansoren</w:t>
+      </w:r>
+      <w:proofErr w:type="spellEnd"/>
+      <w:r>
+        <w:t xml:space="preserve"> egentligen var eller vilka möjligheter som fanns där inne. Samtidigt var det inte något han behövde ta reda på just nu.</w:t>
+      </w:r>
+    </w:p>
+    <w:p>
+      <w:r>
+        <w:t>Han lutade sig tillbaka och slöt ögonen en kort stund. Vattenfallen hördes tydligare här ute, och vinden drog genom håret utan att vara särskilt kall. Han försökte hålla kvar uppmärksamheten vid ljuden omkring sig i stället för att låta tankarna återvända till familjen. Det fungerade inte helt, men efter en stund kändes det åtminstone lättare att låta bli att följa varje tanke vidare.</w:t>
+      </w:r>
+    </w:p>
+    <w:p>
+      <w:r>
+        <w:t xml:space="preserve">Han visste inte hur länge han hade suttit där när han hörde rörelse inifrån </w:t>
+      </w:r>
+      <w:proofErr w:type="spellStart"/>
+      <w:r>
+        <w:t>Mansoren</w:t>
+      </w:r>
+      <w:proofErr w:type="spellEnd"/>
+      <w:r>
+        <w:t>. Först var det bara ett svagt ljud, men sedan hördes steg närma sig dörren.</w:t>
+      </w:r>
+    </w:p>
+    <w:p>
+      <w:r>
+        <w:t>Myr öppnade ögonen och vände sig mot ingången. När han hörde Sonyas röst inifrån reste han sig från sittplatsen och gick tillbaka in.</w:t>
+      </w:r>
+    </w:p>
+    <w:p>
+      <w:r>
+        <w:t>Sonya stod vid den centrala delen av bostaden när Myr kom in. Hon hade redan börjat plocka fram saker till frukosten, och på en av bänkarna stod några skålar bredvid ett fat med mat. Myr stannade till och såg på henne en stund innan han gick närmare.</w:t>
+      </w:r>
+    </w:p>
+    <w:p>
+      <w:r>
+        <w:t>”Kan du visa mig hur man gör frukost här?” frågade han.</w:t>
+      </w:r>
+    </w:p>
+    <w:p>
+      <w:r>
+        <w:t>Sonya vände sig mot honom. ”Vad menar du? Du kan väl bara sätta dig så ordnar jag det.”</w:t>
+      </w:r>
+    </w:p>
+    <w:p>
+      <w:r>
+        <w:t>”Det är just det jag inte vill.” Myr försökte formulera sig utan att låta otacksam. ”Jag kan inte förvänta mig att du ska göra allt åt mig hela tiden. Jag vill kunna hjälpa till, åtminstone med sådant som inte kräver magi.”</w:t>
+      </w:r>
+    </w:p>
+    <w:p>
+      <w:r>
+        <w:lastRenderedPageBreak/>
+        <w:t>Sonya betraktade honom en kort stund, sedan nickade hon. ”Det är väl rimligt. Kom hit, så ska jag visa dig.”</w:t>
+      </w:r>
+    </w:p>
+    <w:p>
+      <w:r>
+        <w:t>Hon började med att förklara vilka saker de brukade använda och var de förvarades. En del av maten behövde bara läggas fram, medan annat skulle blandas eller delas i mindre bitar innan det gick att äta. Myr fick prova själv, och efter några försök började han förstå hur det fungerade. När något krävde en rörelse han inte kände till visade Sonya honom hur hon gjorde, men hon lät honom inte försöka använda magi som han ännu inte hade lärt sig. Sådant fick vänta tills han hade fått grunderna på plats.</w:t>
+      </w:r>
+    </w:p>
+    <w:p>
+      <w:r>
+        <w:t>Det kändes bra att ha något konkret att göra. Myr behövde inte fråga om varje liten sak, och Sonya verkade inte ha något emot att han tog över en del av förberedelserna. När frukosten väl var färdig satte de sig tillsammans. De pratade om vad de skulle göra under dagen, och Myr frågade om han kunde fortsätta träna på det han hade lärt sig dagen innan. Sonya svarade att det säkert skulle finnas tid för det, men att han först behövde lära sig mer om hur magin fungerade innan han kunde klara sig helt på egen hand.</w:t>
+      </w:r>
+    </w:p>
+    <w:p>
+      <w:r>
+        <w:t>Efter maten började de plocka undan. Myr tog hand om några av skålarna medan Sonya samlade ihop resten av det som stod framme. Han försökte röra sig försiktigt för att inte vara i vägen, men när han vände sig för att ställa ifrån sig en skål råkade hans arm stöta till en annan. Den gled över kanten och slog i golvet.</w:t>
+      </w:r>
+    </w:p>
+    <w:p>
+      <w:r>
+        <w:t>Ljudet fick honom att rycka till. Innan han ens hann tänka hade han vänt sig mot Sonya, höjt armarna framför ansiktet och böjt undan huvudet.</w:t>
+      </w:r>
+    </w:p>
+    <w:p>
+      <w:r>
+        <w:t>”Förlåt”, fick han ur sig.</w:t>
+      </w:r>
+    </w:p>
+    <w:p>
+      <w:r>
+        <w:t>Han stod kvar så ett ögonblick, spänd och väntande, som om kroppen redan visste vad som skulle komma härnäst.</w:t>
+      </w:r>
+    </w:p>
+    <w:p>
+      <w:r>
+        <w:t>Men ingenting hände.</w:t>
+      </w:r>
+    </w:p>
+    <w:p>
+      <w:r>
+        <w:t>När Myr till slut såg upp hade Sonya stannat mitt i rörelsen. Hon såg på honom med en blick som först var förvånad och sedan förändrades till något mer bekymrat. Skålen låg fortfarande på golvet mellan dem.</w:t>
+      </w:r>
+    </w:p>
+    <w:p>
+      <w:r>
+        <w:t>”Myr … det är ingen fara”, sa hon försiktigt. ”Jag kommer inte att slå dig. Tror du att jag är sådan?”</w:t>
+      </w:r>
+    </w:p>
+    <w:p>
+      <w:r>
+        <w:t>Sonya såg på honom en stund. Hon verkade förstå att det inte var henne han var rädd för, och att det var jobbigt för honom att behöva förklara sin reaktion. Hennes ansiktsuttryck mjuknade, och snart log hon mot honom igen.</w:t>
+      </w:r>
+    </w:p>
+    <w:p>
+      <w:r>
+        <w:t>”Okej, jag förstår.”</w:t>
+      </w:r>
+    </w:p>
+    <w:p>
+      <w:r>
+        <w:t>Hon lät det stanna där och vände blicken mot skålen på golvet.</w:t>
+      </w:r>
+    </w:p>
+    <w:p>
+      <w:r>
+        <w:lastRenderedPageBreak/>
+        <w:t xml:space="preserve">”Den är en del av huset. Om den går sönder bryts den ned, och </w:t>
+      </w:r>
+      <w:proofErr w:type="spellStart"/>
+      <w:r>
+        <w:t>Mansoren</w:t>
+      </w:r>
+      <w:proofErr w:type="spellEnd"/>
+      <w:r>
+        <w:t xml:space="preserve"> kommer att förse oss med en ny.”</w:t>
+      </w:r>
+    </w:p>
+    <w:p>
+      <w:r>
+        <w:t>Myr såg ner på skålen. ”Så vi behöver inte göra något åt den?”</w:t>
+      </w:r>
+    </w:p>
+    <w:p>
+      <w:r>
+        <w:t xml:space="preserve">”Nej, den försvinner av sig själv efter ett tag.” Sonya gjorde en liten gest mot skärvorna. ”Det är en av fördelarna med att bo i en </w:t>
+      </w:r>
+      <w:proofErr w:type="spellStart"/>
+      <w:r>
+        <w:t>Mansor</w:t>
+      </w:r>
+      <w:proofErr w:type="spellEnd"/>
+      <w:r>
+        <w:t>.”</w:t>
+      </w:r>
+    </w:p>
+    <w:p>
+      <w:r>
+        <w:t>Myr såg på henne igen. Han var tacksam för att hon inte ställde fler frågor. Även om han inte visste om hon verkligen förstod vad han menade, verkade hon åtminstone acceptera att han inte ville berätta mer.</w:t>
+      </w:r>
+    </w:p>
+    <w:p>
+      <w:r>
+        <w:t xml:space="preserve">När de hade plockat undan det sista gjorde de sig redo att lämna </w:t>
+      </w:r>
+      <w:proofErr w:type="spellStart"/>
+      <w:r>
+        <w:t>Mansoren</w:t>
+      </w:r>
+      <w:proofErr w:type="spellEnd"/>
+      <w:r>
+        <w:t xml:space="preserve"> och flyga tillbaka till akademin. Myr kände sig fortfarande lite olustig efter det som hänt vid frukosten, även om Sonya hade gått vidare som om det inte varit något särskilt. Han försökte göra detsamma och följde med henne ut på verandan.</w:t>
+      </w:r>
+    </w:p>
+    <w:p>
+      <w:r>
+        <w:t>Under flygturen höll han sig mestadels tyst. Ju närmare de kom akademin, desto tydligare hördes det forsande vattnet från det stora trädet. Ljudet fick honom att slappna av, och den olustiga känslan från tidigare började långsamt ge med sig. När de närmade sig den inre gården vände han blicken mot trädets väldiga grenar. Han hoppades få syn på några nattglidare, som han hade gjort kvällen innan.</w:t>
+      </w:r>
+    </w:p>
+    <w:p>
+      <w:r>
+        <w:t>Bland de genomskinliga formerna och det strömmande vattnet tyckte han sig plötsligt ana en rörelse. Han försökte följa den med blicken, men kunde inte avgöra om det verkligen hade varit en nattglidare eller om han bara hade inbillat sig det. Grenarna var fulla av skiftande ljus och rörelser, och det var svårt att urskilja något så genomskinligt.</w:t>
+      </w:r>
+    </w:p>
+    <w:p>
+      <w:r>
+        <w:t>När de landade på innergården hade han fortfarande inte fått någon säker glimt av en enda nattglidare.</w:t>
+      </w:r>
+    </w:p>
+    <w:p>
+      <w:r>
+        <w:t xml:space="preserve">Sonya följde honom till klassrummet, där </w:t>
+      </w:r>
+      <w:proofErr w:type="spellStart"/>
+      <w:r>
+        <w:t>Elarion</w:t>
+      </w:r>
+      <w:proofErr w:type="spellEnd"/>
+      <w:r>
+        <w:t xml:space="preserve"> väntade. Lyra hade redan lämnat akademin för att ta hand om något annat hon behövde göra, så det var bara de tre där inne.</w:t>
+      </w:r>
+    </w:p>
+    <w:p>
+      <w:proofErr w:type="spellStart"/>
+      <w:r>
+        <w:t>Elarion</w:t>
+      </w:r>
+      <w:proofErr w:type="spellEnd"/>
+      <w:r>
+        <w:t xml:space="preserve"> hade lagt fram några av de märkliga sidorna på ett bord. När Myr kom in såg han upp och verkade komma ihåg något.</w:t>
+      </w:r>
+    </w:p>
+    <w:p>
+      <w:r>
+        <w:t>”Det var en sak jag glömde säga till dig i går”, började han. ”Eftersom du är den första människan som har skrivit på de här sidorna vill jag att vi övervakar dig när du använder dem, åtminstone under en period. Vi vet ännu inte hur väl du kan kontrollera deras påverkan, och jag vill inte riskera att du förlorar några minnen.”</w:t>
+      </w:r>
+    </w:p>
+    <w:p>
+      <w:r>
+        <w:t>Myr stannade till. Han hade inte tänkt särskilt mycket på risken efter gårdagens lektion, men nu mindes han hur märkliga sidorna hade känts när han försökte skriva och läsa på dem.</w:t>
+      </w:r>
+    </w:p>
+    <w:p>
+      <w:r>
+        <w:lastRenderedPageBreak/>
+        <w:t>”Så jag borde inte ha försökt skriva mer på egen hand?”</w:t>
+      </w:r>
+    </w:p>
+    <w:p>
+      <w:r>
+        <w:t xml:space="preserve">”Det är bäst att du väntar tills vi har haft fler lektioner tillsammans”, svarade </w:t>
+      </w:r>
+      <w:proofErr w:type="spellStart"/>
+      <w:r>
+        <w:t>Elarion</w:t>
+      </w:r>
+      <w:proofErr w:type="spellEnd"/>
+      <w:r>
+        <w:t>. ”Jag borde ha sagt det redan i går kväll.”</w:t>
+      </w:r>
+    </w:p>
+    <w:p>
+      <w:r>
+        <w:t>Myr kände sig plötsligt lättad över att han inte hade fortsatt öva på egen hand. Han hade varit nyfiken på sidorna och hade gärna försökt förstå dem bättre, men tanken på att av misstag förlora ett minne gjorde honom betydligt mindre ivrig att experimentera utan att veta vad han gjorde.</w:t>
+      </w:r>
+    </w:p>
+    <w:p>
+      <w:r>
+        <w:t>”Okej”, sa han. ”Då väntar jag.”</w:t>
+      </w:r>
+    </w:p>
+    <w:p>
+      <w:proofErr w:type="spellStart"/>
+      <w:r>
+        <w:t>Elarion</w:t>
+      </w:r>
+      <w:proofErr w:type="spellEnd"/>
+      <w:r>
+        <w:t xml:space="preserve"> nickade och sköt fram en av sidorna över bordet.</w:t>
+      </w:r>
+    </w:p>
+    <w:p>
+      <w:r>
+        <w:t>”Bra. Då fortsätter vi där vi slutade i går.”</w:t>
+      </w:r>
+    </w:p>
     <w:p/>
     <w:sectPr>
       <w:pgSz w:w="11906" w:h="16838"/>

</xml_diff>